<commit_message>
Add RAM address bus and delete RAM address latch
</commit_message>
<xml_diff>
--- a/CPU Design/CpuDesign.docx
+++ b/CPU Design/CpuDesign.docx
@@ -63,7 +63,7 @@
                     <v:path arrowok="t"/>
                   </v:shape>
                 </v:group>
-                <v:rect id="_x0000_s1039" style="position:absolute;left:1800;top:1440;width:8638;height:736;mso-width-percent:1000;mso-position-horizontal:center;mso-position-horizontal-relative:margin;mso-position-vertical:top;mso-position-vertical-relative:margin;mso-width-percent:1000;mso-width-relative:margin;mso-height-relative:margin" filled="f" stroked="f">
+                <v:rect id="_x0000_s1039" style="position:absolute;left:1800;top:1440;width:8638;height:551;mso-width-percent:1000;mso-position-horizontal:center;mso-position-horizontal-relative:margin;mso-position-vertical:top;mso-position-vertical-relative:margin;mso-width-percent:1000;mso-width-relative:margin;mso-height-relative:margin" filled="f" stroked="f">
                   <v:textbox style="mso-next-textbox:#_x0000_s1039;mso-fit-shape-to-text:t">
                     <w:txbxContent>
                       <w:p>
@@ -107,7 +107,7 @@
                             <w:szCs w:val="72"/>
                           </w:rPr>
                           <w:alias w:val="Title"/>
-                          <w:id w:val="808964566"/>
+                          <w:id w:val="1159004474"/>
                           <w:dataBinding w:prefixMappings="xmlns:ns0='http://schemas.openxmlformats.org/package/2006/metadata/core-properties' xmlns:ns1='http://purl.org/dc/elements/1.1/'" w:xpath="/ns0:coreProperties[1]/ns1:title[1]" w:storeItemID="{6C3C8BC8-F283-45AE-878A-BAB7291924A1}"/>
                           <w:text/>
                         </w:sdtPr>
@@ -146,7 +146,7 @@
                             <w:szCs w:val="40"/>
                           </w:rPr>
                           <w:alias w:val="Subtitle"/>
-                          <w:id w:val="808964567"/>
+                          <w:id w:val="1159004475"/>
                           <w:dataBinding w:prefixMappings="xmlns:ns0='http://schemas.openxmlformats.org/package/2006/metadata/core-properties' xmlns:ns1='http://purl.org/dc/elements/1.1/'" w:xpath="/ns0:coreProperties[1]/ns1:subject[1]" w:storeItemID="{6C3C8BC8-F283-45AE-878A-BAB7291924A1}"/>
                           <w:text/>
                         </w:sdtPr>
@@ -184,7 +184,7 @@
                             <w:szCs w:val="32"/>
                           </w:rPr>
                           <w:alias w:val="Author"/>
-                          <w:id w:val="808964568"/>
+                          <w:id w:val="1159004476"/>
                           <w:dataBinding w:prefixMappings="xmlns:ns0='http://schemas.openxmlformats.org/package/2006/metadata/core-properties' xmlns:ns1='http://purl.org/dc/elements/1.1/'" w:xpath="/ns0:coreProperties[1]/ns1:creator[1]" w:storeItemID="{6C3C8BC8-F283-45AE-878A-BAB7291924A1}"/>
                           <w:text/>
                         </w:sdtPr>
@@ -490,7 +490,7 @@
                   <w:rPr>
                     <w:rFonts w:cstheme="minorHAnsi"/>
                   </w:rPr>
-                  <w:t>3.7</w:t>
+                  <w:t>3.8</w:t>
                 </w:r>
                 <w:r>
                   <w:rPr>
@@ -582,7 +582,7 @@
                   <w:rPr>
                     <w:rFonts w:cstheme="minorHAnsi"/>
                   </w:rPr>
-                  <w:t>3.8</w:t>
+                  <w:t>3.9</w:t>
                 </w:r>
                 <w:r>
                   <w:rPr>
@@ -629,7 +629,7 @@
                   <w:rPr>
                     <w:rFonts w:cstheme="minorHAnsi"/>
                   </w:rPr>
-                  <w:t>3.8</w:t>
+                  <w:t>3.9</w:t>
                 </w:r>
                 <w:r>
                   <w:rPr>
@@ -708,7 +708,19 @@
                   <w:rPr>
                     <w:lang w:eastAsia="en-GB"/>
                   </w:rPr>
-                  <w:t>ALU_MODE</w:t>
+                  <w:t>ALU_M</w:t>
+                </w:r>
+                <w:r>
+                  <w:rPr>
+                    <w:lang w:eastAsia="en-GB"/>
+                  </w:rPr>
+                  <w:t>O</w:t>
+                </w:r>
+                <w:r>
+                  <w:rPr>
+                    <w:lang w:eastAsia="en-GB"/>
+                  </w:rPr>
+                  <w:t>DE</w:t>
                 </w:r>
                 <w:r>
                   <w:rPr>
@@ -732,7 +744,7 @@
                   <w:rPr>
                     <w:rFonts w:cstheme="minorHAnsi"/>
                   </w:rPr>
-                  <w:instrText xml:space="preserve"> REF _Ref232081305 \r \h </w:instrText>
+                  <w:instrText xml:space="preserve"> REF _Ref232851000 \r \h </w:instrText>
                 </w:r>
                 <w:r>
                   <w:rPr>
@@ -749,7 +761,7 @@
                   <w:rPr>
                     <w:rFonts w:cstheme="minorHAnsi"/>
                   </w:rPr>
-                  <w:t>0</w:t>
+                  <w:t>3.8</w:t>
                 </w:r>
                 <w:r>
                   <w:rPr>
@@ -1280,6 +1292,218 @@
                     <w:rFonts w:cstheme="minorHAnsi"/>
                   </w:rPr>
                   <w:fldChar w:fldCharType="end"/>
+                </w:r>
+              </w:p>
+            </w:tc>
+          </w:tr>
+          <w:tr>
+            <w:tc>
+              <w:tcPr>
+                <w:tcW w:w="1384" w:type="dxa"/>
+              </w:tcPr>
+              <w:p>
+                <w:pPr>
+                  <w:rPr>
+                    <w:rFonts w:cstheme="minorHAnsi"/>
+                  </w:rPr>
+                </w:pPr>
+                <w:r>
+                  <w:rPr>
+                    <w:rFonts w:cstheme="minorHAnsi"/>
+                  </w:rPr>
+                  <w:t>24 Jun 2026</w:t>
+                </w:r>
+              </w:p>
+            </w:tc>
+            <w:tc>
+              <w:tcPr>
+                <w:tcW w:w="7858" w:type="dxa"/>
+              </w:tcPr>
+              <w:p>
+                <w:pPr>
+                  <w:rPr>
+                    <w:rFonts w:cstheme="minorHAnsi"/>
+                  </w:rPr>
+                </w:pPr>
+                <w:r>
+                  <w:rPr>
+                    <w:rFonts w:cstheme="minorHAnsi"/>
+                  </w:rPr>
+                  <w:t>Added RAM address bus</w:t>
+                </w:r>
+                <w:r>
+                  <w:rPr>
+                    <w:rFonts w:cstheme="minorHAnsi"/>
+                  </w:rPr>
+                  <w:t xml:space="preserve"> (only affects ALU and RAM blocks)</w:t>
+                </w:r>
+                <w:r>
+                  <w:rPr>
+                    <w:rFonts w:cstheme="minorHAnsi"/>
+                  </w:rPr>
+                  <w:t>:</w:t>
+                </w:r>
+              </w:p>
+              <w:p>
+                <w:pPr>
+                  <w:pStyle w:val="ListParagraph"/>
+                  <w:numPr>
+                    <w:ilvl w:val="0"/>
+                    <w:numId w:val="27"/>
+                  </w:numPr>
+                  <w:rPr>
+                    <w:rFonts w:cstheme="minorHAnsi"/>
+                  </w:rPr>
+                </w:pPr>
+                <w:r>
+                  <w:rPr>
+                    <w:rFonts w:cstheme="minorHAnsi"/>
+                  </w:rPr>
+                  <w:fldChar w:fldCharType="begin"/>
+                </w:r>
+                <w:r>
+                  <w:rPr>
+                    <w:rFonts w:cstheme="minorHAnsi"/>
+                  </w:rPr>
+                  <w:instrText xml:space="preserve"> REF _Ref232073454 \h </w:instrText>
+                </w:r>
+                <w:r>
+                  <w:rPr>
+                    <w:rFonts w:cstheme="minorHAnsi"/>
+                  </w:rPr>
+                </w:r>
+                <w:r>
+                  <w:rPr>
+                    <w:rFonts w:cstheme="minorHAnsi"/>
+                  </w:rPr>
+                  <w:fldChar w:fldCharType="separate"/>
+                </w:r>
+                <w:r>
+                  <w:t xml:space="preserve">Figure </w:t>
+                </w:r>
+                <w:r>
+                  <w:rPr>
+                    <w:noProof/>
+                  </w:rPr>
+                  <w:t>1</w:t>
+                </w:r>
+                <w:r>
+                  <w:rPr>
+                    <w:rFonts w:cstheme="minorHAnsi"/>
+                  </w:rPr>
+                  <w:fldChar w:fldCharType="end"/>
+                </w:r>
+                <w:r>
+                  <w:rPr>
+                    <w:rFonts w:cstheme="minorHAnsi"/>
+                  </w:rPr>
+                  <w:t xml:space="preserve"> updated</w:t>
+                </w:r>
+              </w:p>
+              <w:p>
+                <w:pPr>
+                  <w:pStyle w:val="ListParagraph"/>
+                  <w:numPr>
+                    <w:ilvl w:val="0"/>
+                    <w:numId w:val="27"/>
+                  </w:numPr>
+                  <w:rPr>
+                    <w:rFonts w:cstheme="minorHAnsi"/>
+                  </w:rPr>
+                </w:pPr>
+                <w:r>
+                  <w:rPr>
+                    <w:rFonts w:cstheme="minorHAnsi"/>
+                  </w:rPr>
+                  <w:fldChar w:fldCharType="begin"/>
+                </w:r>
+                <w:r>
+                  <w:rPr>
+                    <w:rFonts w:cstheme="minorHAnsi"/>
+                  </w:rPr>
+                  <w:instrText xml:space="preserve"> REF _Ref232090753 \r \h </w:instrText>
+                </w:r>
+                <w:r>
+                  <w:rPr>
+                    <w:rFonts w:cstheme="minorHAnsi"/>
+                  </w:rPr>
+                </w:r>
+                <w:r>
+                  <w:rPr>
+                    <w:rFonts w:cstheme="minorHAnsi"/>
+                  </w:rPr>
+                  <w:fldChar w:fldCharType="separate"/>
+                </w:r>
+                <w:r>
+                  <w:rPr>
+                    <w:rFonts w:cstheme="minorHAnsi"/>
+                  </w:rPr>
+                  <w:t>3.6</w:t>
+                </w:r>
+                <w:r>
+                  <w:rPr>
+                    <w:rFonts w:cstheme="minorHAnsi"/>
+                  </w:rPr>
+                  <w:fldChar w:fldCharType="end"/>
+                </w:r>
+                <w:r>
+                  <w:rPr>
+                    <w:rFonts w:cstheme="minorHAnsi"/>
+                  </w:rPr>
+                  <w:t xml:space="preserve"> Removed text about RAM address latch</w:t>
+                </w:r>
+              </w:p>
+              <w:p>
+                <w:pPr>
+                  <w:pStyle w:val="ListParagraph"/>
+                  <w:numPr>
+                    <w:ilvl w:val="0"/>
+                    <w:numId w:val="27"/>
+                  </w:numPr>
+                  <w:rPr>
+                    <w:rFonts w:cstheme="minorHAnsi"/>
+                  </w:rPr>
+                </w:pPr>
+                <w:r>
+                  <w:rPr>
+                    <w:rFonts w:cstheme="minorHAnsi"/>
+                  </w:rPr>
+                  <w:fldChar w:fldCharType="begin"/>
+                </w:r>
+                <w:r>
+                  <w:rPr>
+                    <w:rFonts w:cstheme="minorHAnsi"/>
+                  </w:rPr>
+                  <w:instrText xml:space="preserve"> REF _Ref233191365 \r \h </w:instrText>
+                </w:r>
+                <w:r>
+                  <w:rPr>
+                    <w:rFonts w:cstheme="minorHAnsi"/>
+                  </w:rPr>
+                </w:r>
+                <w:r>
+                  <w:rPr>
+                    <w:rFonts w:cstheme="minorHAnsi"/>
+                  </w:rPr>
+                  <w:fldChar w:fldCharType="separate"/>
+                </w:r>
+                <w:r>
+                  <w:rPr>
+                    <w:rFonts w:cstheme="minorHAnsi"/>
+                  </w:rPr>
+                  <w:t>3.7</w:t>
+                </w:r>
+                <w:r>
+                  <w:rPr>
+                    <w:rFonts w:cstheme="minorHAnsi"/>
+                  </w:rPr>
+                  <w:fldChar w:fldCharType="end"/>
+                </w:r>
+                <w:r>
+                  <w:rPr>
+                    <w:rFonts w:cstheme="minorHAnsi"/>
+                  </w:rPr>
+                  <w:t xml:space="preserve"> New section defining RAM ADDR Bus</w:t>
                 </w:r>
               </w:p>
             </w:tc>
@@ -1293,6 +1517,8 @@
               <w:color w:val="4F81BD" w:themeColor="accent1"/>
             </w:rPr>
           </w:pPr>
+          <w:bookmarkStart w:id="0" w:name="ChangeHistory"/>
+          <w:bookmarkEnd w:id="0"/>
           <w:r>
             <w:rPr>
               <w:rFonts w:ascii="Cambria" w:hAnsi="Cambria"/>
@@ -1352,7 +1578,7 @@
           <w:r>
             <w:fldChar w:fldCharType="separate"/>
           </w:r>
-          <w:hyperlink w:anchor="_Toc233022160" w:history="1">
+          <w:hyperlink w:anchor="_Toc233191853" w:history="1">
             <w:r>
               <w:rPr>
                 <w:rStyle w:val="Hyperlink"/>
@@ -1398,7 +1624,7 @@
                 <w:noProof/>
                 <w:webHidden/>
               </w:rPr>
-              <w:instrText xml:space="preserve"> PAGEREF _Toc233022160 \h </w:instrText>
+              <w:instrText xml:space="preserve"> PAGEREF _Toc233191853 \h </w:instrText>
             </w:r>
             <w:r>
               <w:rPr>
@@ -1442,7 +1668,7 @@
               <w:lang w:eastAsia="en-GB"/>
             </w:rPr>
           </w:pPr>
-          <w:hyperlink w:anchor="_Toc233022161" w:history="1">
+          <w:hyperlink w:anchor="_Toc233191854" w:history="1">
             <w:r>
               <w:rPr>
                 <w:rStyle w:val="Hyperlink"/>
@@ -1486,7 +1712,7 @@
                 <w:noProof/>
                 <w:webHidden/>
               </w:rPr>
-              <w:instrText xml:space="preserve"> PAGEREF _Toc233022161 \h </w:instrText>
+              <w:instrText xml:space="preserve"> PAGEREF _Toc233191854 \h </w:instrText>
             </w:r>
             <w:r>
               <w:rPr>
@@ -1530,7 +1756,7 @@
               <w:lang w:eastAsia="en-GB"/>
             </w:rPr>
           </w:pPr>
-          <w:hyperlink w:anchor="_Toc233022162" w:history="1">
+          <w:hyperlink w:anchor="_Toc233191855" w:history="1">
             <w:r>
               <w:rPr>
                 <w:rStyle w:val="Hyperlink"/>
@@ -1572,7 +1798,7 @@
                 <w:noProof/>
                 <w:webHidden/>
               </w:rPr>
-              <w:instrText xml:space="preserve"> PAGEREF _Toc233022162 \h </w:instrText>
+              <w:instrText xml:space="preserve"> PAGEREF _Toc233191855 \h </w:instrText>
             </w:r>
             <w:r>
               <w:rPr>
@@ -1616,7 +1842,7 @@
               <w:lang w:eastAsia="en-GB"/>
             </w:rPr>
           </w:pPr>
-          <w:hyperlink w:anchor="_Toc233022163" w:history="1">
+          <w:hyperlink w:anchor="_Toc233191856" w:history="1">
             <w:r>
               <w:rPr>
                 <w:rStyle w:val="Hyperlink"/>
@@ -1658,7 +1884,7 @@
                 <w:noProof/>
                 <w:webHidden/>
               </w:rPr>
-              <w:instrText xml:space="preserve"> PAGEREF _Toc233022163 \h </w:instrText>
+              <w:instrText xml:space="preserve"> PAGEREF _Toc233191856 \h </w:instrText>
             </w:r>
             <w:r>
               <w:rPr>
@@ -1702,7 +1928,7 @@
               <w:lang w:eastAsia="en-GB"/>
             </w:rPr>
           </w:pPr>
-          <w:hyperlink w:anchor="_Toc233022164" w:history="1">
+          <w:hyperlink w:anchor="_Toc233191857" w:history="1">
             <w:r>
               <w:rPr>
                 <w:rStyle w:val="Hyperlink"/>
@@ -1744,7 +1970,7 @@
                 <w:noProof/>
                 <w:webHidden/>
               </w:rPr>
-              <w:instrText xml:space="preserve"> PAGEREF _Toc233022164 \h </w:instrText>
+              <w:instrText xml:space="preserve"> PAGEREF _Toc233191857 \h </w:instrText>
             </w:r>
             <w:r>
               <w:rPr>
@@ -1788,7 +2014,7 @@
               <w:lang w:eastAsia="en-GB"/>
             </w:rPr>
           </w:pPr>
-          <w:hyperlink w:anchor="_Toc233022165" w:history="1">
+          <w:hyperlink w:anchor="_Toc233191858" w:history="1">
             <w:r>
               <w:rPr>
                 <w:rStyle w:val="Hyperlink"/>
@@ -1830,7 +2056,7 @@
                 <w:noProof/>
                 <w:webHidden/>
               </w:rPr>
-              <w:instrText xml:space="preserve"> PAGEREF _Toc233022165 \h </w:instrText>
+              <w:instrText xml:space="preserve"> PAGEREF _Toc233191858 \h </w:instrText>
             </w:r>
             <w:r>
               <w:rPr>
@@ -1874,7 +2100,7 @@
               <w:lang w:eastAsia="en-GB"/>
             </w:rPr>
           </w:pPr>
-          <w:hyperlink w:anchor="_Toc233022166" w:history="1">
+          <w:hyperlink w:anchor="_Toc233191859" w:history="1">
             <w:r>
               <w:rPr>
                 <w:rStyle w:val="Hyperlink"/>
@@ -1916,7 +2142,7 @@
                 <w:noProof/>
                 <w:webHidden/>
               </w:rPr>
-              <w:instrText xml:space="preserve"> PAGEREF _Toc233022166 \h </w:instrText>
+              <w:instrText xml:space="preserve"> PAGEREF _Toc233191859 \h </w:instrText>
             </w:r>
             <w:r>
               <w:rPr>
@@ -1960,7 +2186,7 @@
               <w:lang w:eastAsia="en-GB"/>
             </w:rPr>
           </w:pPr>
-          <w:hyperlink w:anchor="_Toc233022167" w:history="1">
+          <w:hyperlink w:anchor="_Toc233191860" w:history="1">
             <w:r>
               <w:rPr>
                 <w:rStyle w:val="Hyperlink"/>
@@ -2004,7 +2230,7 @@
                 <w:noProof/>
                 <w:webHidden/>
               </w:rPr>
-              <w:instrText xml:space="preserve"> PAGEREF _Toc233022167 \h </w:instrText>
+              <w:instrText xml:space="preserve"> PAGEREF _Toc233191860 \h </w:instrText>
             </w:r>
             <w:r>
               <w:rPr>
@@ -2048,7 +2274,7 @@
               <w:lang w:eastAsia="en-GB"/>
             </w:rPr>
           </w:pPr>
-          <w:hyperlink w:anchor="_Toc233022168" w:history="1">
+          <w:hyperlink w:anchor="_Toc233191861" w:history="1">
             <w:r>
               <w:rPr>
                 <w:rStyle w:val="Hyperlink"/>
@@ -2092,7 +2318,7 @@
                 <w:noProof/>
                 <w:webHidden/>
               </w:rPr>
-              <w:instrText xml:space="preserve"> PAGEREF _Toc233022168 \h </w:instrText>
+              <w:instrText xml:space="preserve"> PAGEREF _Toc233191861 \h </w:instrText>
             </w:r>
             <w:r>
               <w:rPr>
@@ -2136,7 +2362,7 @@
               <w:lang w:eastAsia="en-GB"/>
             </w:rPr>
           </w:pPr>
-          <w:hyperlink w:anchor="_Toc233022169" w:history="1">
+          <w:hyperlink w:anchor="_Toc233191862" w:history="1">
             <w:r>
               <w:rPr>
                 <w:rStyle w:val="Hyperlink"/>
@@ -2180,7 +2406,7 @@
                 <w:noProof/>
                 <w:webHidden/>
               </w:rPr>
-              <w:instrText xml:space="preserve"> PAGEREF _Toc233022169 \h </w:instrText>
+              <w:instrText xml:space="preserve"> PAGEREF _Toc233191862 \h </w:instrText>
             </w:r>
             <w:r>
               <w:rPr>
@@ -2224,7 +2450,7 @@
               <w:lang w:eastAsia="en-GB"/>
             </w:rPr>
           </w:pPr>
-          <w:hyperlink w:anchor="_Toc233022170" w:history="1">
+          <w:hyperlink w:anchor="_Toc233191863" w:history="1">
             <w:r>
               <w:rPr>
                 <w:rStyle w:val="Hyperlink"/>
@@ -2268,7 +2494,7 @@
                 <w:noProof/>
                 <w:webHidden/>
               </w:rPr>
-              <w:instrText xml:space="preserve"> PAGEREF _Toc233022170 \h </w:instrText>
+              <w:instrText xml:space="preserve"> PAGEREF _Toc233191863 \h </w:instrText>
             </w:r>
             <w:r>
               <w:rPr>
@@ -2312,7 +2538,7 @@
               <w:lang w:eastAsia="en-GB"/>
             </w:rPr>
           </w:pPr>
-          <w:hyperlink w:anchor="_Toc233022171" w:history="1">
+          <w:hyperlink w:anchor="_Toc233191864" w:history="1">
             <w:r>
               <w:rPr>
                 <w:rStyle w:val="Hyperlink"/>
@@ -2356,7 +2582,7 @@
                 <w:noProof/>
                 <w:webHidden/>
               </w:rPr>
-              <w:instrText xml:space="preserve"> PAGEREF _Toc233022171 \h </w:instrText>
+              <w:instrText xml:space="preserve"> PAGEREF _Toc233191864 \h </w:instrText>
             </w:r>
             <w:r>
               <w:rPr>
@@ -2400,7 +2626,7 @@
               <w:lang w:eastAsia="en-GB"/>
             </w:rPr>
           </w:pPr>
-          <w:hyperlink w:anchor="_Toc233022172" w:history="1">
+          <w:hyperlink w:anchor="_Toc233191865" w:history="1">
             <w:r>
               <w:rPr>
                 <w:rStyle w:val="Hyperlink"/>
@@ -2444,7 +2670,7 @@
                 <w:noProof/>
                 <w:webHidden/>
               </w:rPr>
-              <w:instrText xml:space="preserve"> PAGEREF _Toc233022172 \h </w:instrText>
+              <w:instrText xml:space="preserve"> PAGEREF _Toc233191865 \h </w:instrText>
             </w:r>
             <w:r>
               <w:rPr>
@@ -2488,7 +2714,7 @@
               <w:lang w:eastAsia="en-GB"/>
             </w:rPr>
           </w:pPr>
-          <w:hyperlink w:anchor="_Toc233022173" w:history="1">
+          <w:hyperlink w:anchor="_Toc233191866" w:history="1">
             <w:r>
               <w:rPr>
                 <w:rStyle w:val="Hyperlink"/>
@@ -2532,7 +2758,7 @@
                 <w:noProof/>
                 <w:webHidden/>
               </w:rPr>
-              <w:instrText xml:space="preserve"> PAGEREF _Toc233022173 \h </w:instrText>
+              <w:instrText xml:space="preserve"> PAGEREF _Toc233191866 \h </w:instrText>
             </w:r>
             <w:r>
               <w:rPr>
@@ -2576,7 +2802,7 @@
               <w:lang w:eastAsia="en-GB"/>
             </w:rPr>
           </w:pPr>
-          <w:hyperlink w:anchor="_Toc233022174" w:history="1">
+          <w:hyperlink w:anchor="_Toc233191867" w:history="1">
             <w:r>
               <w:rPr>
                 <w:rStyle w:val="Hyperlink"/>
@@ -2599,7 +2825,7 @@
                 <w:noProof/>
                 <w:lang w:eastAsia="en-GB"/>
               </w:rPr>
-              <w:t>ALU CTRL bus</w:t>
+              <w:t>RAM ADDR Bus</w:t>
             </w:r>
             <w:r>
               <w:rPr>
@@ -2620,7 +2846,7 @@
                 <w:noProof/>
                 <w:webHidden/>
               </w:rPr>
-              <w:instrText xml:space="preserve"> PAGEREF _Toc233022174 \h </w:instrText>
+              <w:instrText xml:space="preserve"> PAGEREF _Toc233191867 \h </w:instrText>
             </w:r>
             <w:r>
               <w:rPr>
@@ -2640,7 +2866,7 @@
                 <w:noProof/>
                 <w:webHidden/>
               </w:rPr>
-              <w:t>7</w:t>
+              <w:t>6</w:t>
             </w:r>
             <w:r>
               <w:rPr>
@@ -2664,7 +2890,7 @@
               <w:lang w:eastAsia="en-GB"/>
             </w:rPr>
           </w:pPr>
-          <w:hyperlink w:anchor="_Toc233022175" w:history="1">
+          <w:hyperlink w:anchor="_Toc233191868" w:history="1">
             <w:r>
               <w:rPr>
                 <w:rStyle w:val="Hyperlink"/>
@@ -2687,6 +2913,94 @@
                 <w:noProof/>
                 <w:lang w:eastAsia="en-GB"/>
               </w:rPr>
+              <w:t>ALU CTRL bus</w:t>
+            </w:r>
+            <w:r>
+              <w:rPr>
+                <w:noProof/>
+                <w:webHidden/>
+              </w:rPr>
+              <w:tab/>
+            </w:r>
+            <w:r>
+              <w:rPr>
+                <w:noProof/>
+                <w:webHidden/>
+              </w:rPr>
+              <w:fldChar w:fldCharType="begin"/>
+            </w:r>
+            <w:r>
+              <w:rPr>
+                <w:noProof/>
+                <w:webHidden/>
+              </w:rPr>
+              <w:instrText xml:space="preserve"> PAGEREF _Toc233191868 \h </w:instrText>
+            </w:r>
+            <w:r>
+              <w:rPr>
+                <w:noProof/>
+                <w:webHidden/>
+              </w:rPr>
+            </w:r>
+            <w:r>
+              <w:rPr>
+                <w:noProof/>
+                <w:webHidden/>
+              </w:rPr>
+              <w:fldChar w:fldCharType="separate"/>
+            </w:r>
+            <w:r>
+              <w:rPr>
+                <w:noProof/>
+                <w:webHidden/>
+              </w:rPr>
+              <w:t>7</w:t>
+            </w:r>
+            <w:r>
+              <w:rPr>
+                <w:noProof/>
+                <w:webHidden/>
+              </w:rPr>
+              <w:fldChar w:fldCharType="end"/>
+            </w:r>
+          </w:hyperlink>
+        </w:p>
+        <w:p>
+          <w:pPr>
+            <w:pStyle w:val="TOC2"/>
+            <w:tabs>
+              <w:tab w:val="left" w:pos="880"/>
+              <w:tab w:val="right" w:leader="dot" w:pos="9016"/>
+            </w:tabs>
+            <w:rPr>
+              <w:rFonts w:eastAsiaTheme="minorEastAsia"/>
+              <w:noProof/>
+              <w:lang w:eastAsia="en-GB"/>
+            </w:rPr>
+          </w:pPr>
+          <w:hyperlink w:anchor="_Toc233191869" w:history="1">
+            <w:r>
+              <w:rPr>
+                <w:rStyle w:val="Hyperlink"/>
+                <w:noProof/>
+                <w:lang w:eastAsia="en-GB"/>
+              </w:rPr>
+              <w:t>3.9</w:t>
+            </w:r>
+            <w:r>
+              <w:rPr>
+                <w:rFonts w:eastAsiaTheme="minorEastAsia"/>
+                <w:noProof/>
+                <w:lang w:eastAsia="en-GB"/>
+              </w:rPr>
+              <w:tab/>
+            </w:r>
+            <w:r>
+              <w:rPr>
+                <w:rStyle w:val="Hyperlink"/>
+                <w:noProof/>
+                <w:lang w:eastAsia="en-GB"/>
+              </w:rPr>
               <w:t>FLAGS bus</w:t>
             </w:r>
             <w:r>
@@ -2708,7 +3022,7 @@
                 <w:noProof/>
                 <w:webHidden/>
               </w:rPr>
-              <w:instrText xml:space="preserve"> PAGEREF _Toc233022175 \h </w:instrText>
+              <w:instrText xml:space="preserve"> PAGEREF _Toc233191869 \h </w:instrText>
             </w:r>
             <w:r>
               <w:rPr>
@@ -2752,14 +3066,14 @@
               <w:lang w:eastAsia="en-GB"/>
             </w:rPr>
           </w:pPr>
-          <w:hyperlink w:anchor="_Toc233022176" w:history="1">
+          <w:hyperlink w:anchor="_Toc233191870" w:history="1">
             <w:r>
               <w:rPr>
                 <w:rStyle w:val="Hyperlink"/>
                 <w:noProof/>
                 <w:lang w:eastAsia="en-GB"/>
               </w:rPr>
-              <w:t>3.8.1</w:t>
+              <w:t>3.9.1</w:t>
             </w:r>
             <w:r>
               <w:rPr>
@@ -2796,7 +3110,7 @@
                 <w:noProof/>
                 <w:webHidden/>
               </w:rPr>
-              <w:instrText xml:space="preserve"> PAGEREF _Toc233022176 \h </w:instrText>
+              <w:instrText xml:space="preserve"> PAGEREF _Toc233191870 \h </w:instrText>
             </w:r>
             <w:r>
               <w:rPr>
@@ -2840,14 +3154,14 @@
               <w:lang w:eastAsia="en-GB"/>
             </w:rPr>
           </w:pPr>
-          <w:hyperlink w:anchor="_Toc233022177" w:history="1">
+          <w:hyperlink w:anchor="_Toc233191871" w:history="1">
             <w:r>
               <w:rPr>
                 <w:rStyle w:val="Hyperlink"/>
                 <w:noProof/>
                 <w:lang w:eastAsia="en-GB"/>
               </w:rPr>
-              <w:t>3.8.2</w:t>
+              <w:t>3.9.2</w:t>
             </w:r>
             <w:r>
               <w:rPr>
@@ -2884,7 +3198,7 @@
                 <w:noProof/>
                 <w:webHidden/>
               </w:rPr>
-              <w:instrText xml:space="preserve"> PAGEREF _Toc233022177 \h </w:instrText>
+              <w:instrText xml:space="preserve"> PAGEREF _Toc233191871 \h </w:instrText>
             </w:r>
             <w:r>
               <w:rPr>
@@ -2928,7 +3242,7 @@
               <w:lang w:eastAsia="en-GB"/>
             </w:rPr>
           </w:pPr>
-          <w:hyperlink w:anchor="_Toc233022178" w:history="1">
+          <w:hyperlink w:anchor="_Toc233191872" w:history="1">
             <w:r>
               <w:rPr>
                 <w:rStyle w:val="Hyperlink"/>
@@ -2972,7 +3286,7 @@
                 <w:noProof/>
                 <w:webHidden/>
               </w:rPr>
-              <w:instrText xml:space="preserve"> PAGEREF _Toc233022178 \h </w:instrText>
+              <w:instrText xml:space="preserve"> PAGEREF _Toc233191872 \h </w:instrText>
             </w:r>
             <w:r>
               <w:rPr>
@@ -3081,7 +3395,7 @@
         </w:rPr>
         <w:fldChar w:fldCharType="separate"/>
       </w:r>
-      <w:hyperlink w:anchor="_Toc233022179" w:history="1">
+      <w:hyperlink w:anchor="_Toc233191873" w:history="1">
         <w:r>
           <w:rPr>
             <w:rStyle w:val="Hyperlink"/>
@@ -3108,7 +3422,7 @@
             <w:noProof/>
             <w:webHidden/>
           </w:rPr>
-          <w:instrText xml:space="preserve"> PAGEREF _Toc233022179 \h </w:instrText>
+          <w:instrText xml:space="preserve"> PAGEREF _Toc233191873 \h </w:instrText>
         </w:r>
         <w:r>
           <w:rPr>
@@ -3178,7 +3492,7 @@
           <w:docGrid w:linePitch="360"/>
         </w:sectPr>
       </w:pPr>
-      <w:bookmarkStart w:id="0" w:name="_Ref232165825"/>
+      <w:bookmarkStart w:id="1" w:name="_Ref232165825"/>
     </w:p>
     <w:p>
       <w:pPr>
@@ -3188,8 +3502,8 @@
           <w:lang w:eastAsia="en-GB"/>
         </w:rPr>
       </w:pPr>
-      <w:bookmarkStart w:id="1" w:name="_Toc233022160"/>
-      <w:bookmarkEnd w:id="0"/>
+      <w:bookmarkStart w:id="2" w:name="_Toc233191853"/>
+      <w:bookmarkEnd w:id="1"/>
       <w:r>
         <w:rPr>
           <w:rFonts w:eastAsia="Times New Roman"/>
@@ -3198,7 +3512,7 @@
         <w:lastRenderedPageBreak/>
         <w:t>Introduction</w:t>
       </w:r>
-      <w:bookmarkEnd w:id="1"/>
+      <w:bookmarkEnd w:id="2"/>
     </w:p>
     <w:p>
       <w:pPr>
@@ -3239,14 +3553,14 @@
           <w:lang w:eastAsia="en-GB"/>
         </w:rPr>
       </w:pPr>
-      <w:bookmarkStart w:id="2" w:name="_Toc233022161"/>
+      <w:bookmarkStart w:id="3" w:name="_Toc233191854"/>
       <w:r>
         <w:rPr>
           <w:lang w:eastAsia="en-GB"/>
         </w:rPr>
         <w:t>Overview</w:t>
       </w:r>
-      <w:bookmarkEnd w:id="2"/>
+      <w:bookmarkEnd w:id="3"/>
     </w:p>
     <w:p>
       <w:pPr>
@@ -3329,9 +3643,9 @@
         </w:rPr>
         <w:drawing>
           <wp:inline distT="0" distB="0" distL="0" distR="0">
-            <wp:extent cx="5731510" cy="3230391"/>
-            <wp:effectExtent l="19050" t="0" r="2540" b="0"/>
-            <wp:docPr id="1" name="Picture 1"/>
+            <wp:extent cx="5495849" cy="3229200"/>
+            <wp:effectExtent l="19050" t="0" r="0" b="0"/>
+            <wp:docPr id="2" name="Picture 1"/>
             <wp:cNvGraphicFramePr>
               <a:graphicFrameLocks xmlns:a="http://schemas.openxmlformats.org/drawingml/2006/main" noChangeAspect="1"/>
             </wp:cNvGraphicFramePr>
@@ -3354,7 +3668,7 @@
                   <pic:spPr bwMode="auto">
                     <a:xfrm>
                       <a:off x="0" y="0"/>
-                      <a:ext cx="5731510" cy="3230391"/>
+                      <a:ext cx="5495849" cy="3229200"/>
                     </a:xfrm>
                     <a:prstGeom prst="rect">
                       <a:avLst/>
@@ -3379,8 +3693,8 @@
         <w:pStyle w:val="Caption"/>
         <w:jc w:val="center"/>
       </w:pPr>
-      <w:bookmarkStart w:id="3" w:name="_Ref232073454"/>
-      <w:bookmarkStart w:id="4" w:name="_Toc233022179"/>
+      <w:bookmarkStart w:id="4" w:name="_Ref232073454"/>
+      <w:bookmarkStart w:id="5" w:name="_Toc233191873"/>
       <w:r>
         <w:t xml:space="preserve">Figure </w:t>
       </w:r>
@@ -3392,11 +3706,11 @@
           <w:t>1</w:t>
         </w:r>
       </w:fldSimple>
-      <w:bookmarkEnd w:id="3"/>
+      <w:bookmarkEnd w:id="4"/>
       <w:r>
         <w:t>:   Top Level Block Diagram</w:t>
       </w:r>
-      <w:bookmarkEnd w:id="4"/>
+      <w:bookmarkEnd w:id="5"/>
     </w:p>
     <w:p>
       <w:pPr>
@@ -3799,7 +4113,7 @@
       <w:pPr>
         <w:pStyle w:val="Heading2"/>
       </w:pPr>
-      <w:bookmarkStart w:id="5" w:name="_Toc233022162"/>
+      <w:bookmarkStart w:id="6" w:name="_Toc233191855"/>
       <w:r>
         <w:lastRenderedPageBreak/>
         <w:t xml:space="preserve">Overview of </w:t>
@@ -3810,7 +4124,7 @@
       <w:r>
         <w:t>Data Bus</w:t>
       </w:r>
-      <w:bookmarkEnd w:id="5"/>
+      <w:bookmarkEnd w:id="6"/>
     </w:p>
     <w:p>
       <w:r>
@@ -3848,8 +4162,8 @@
       <w:pPr>
         <w:pStyle w:val="Heading3"/>
       </w:pPr>
-      <w:bookmarkStart w:id="6" w:name="_Ref232850548"/>
-      <w:bookmarkStart w:id="7" w:name="_Toc233022163"/>
+      <w:bookmarkStart w:id="7" w:name="_Ref232850548"/>
+      <w:bookmarkStart w:id="8" w:name="_Toc233191856"/>
       <w:r>
         <w:t>Reading f</w:t>
       </w:r>
@@ -3862,8 +4176,8 @@
       <w:r>
         <w:t>Data Bus</w:t>
       </w:r>
-      <w:bookmarkEnd w:id="6"/>
       <w:bookmarkEnd w:id="7"/>
+      <w:bookmarkEnd w:id="8"/>
     </w:p>
     <w:p>
       <w:r>
@@ -3925,15 +4239,7 @@
         <w:rPr>
           <w:lang w:eastAsia="en-GB"/>
         </w:rPr>
-        <w:t>The select signals for those two devices are named:</w:t>
-      </w:r>
-      <w:bookmarkStart w:id="8" w:name="CurrentEditPos"/>
-      <w:bookmarkEnd w:id="8"/>
-      <w:r>
-        <w:rPr>
-          <w:lang w:eastAsia="en-GB"/>
-        </w:rPr>
-        <w:t xml:space="preserve"> </w:t>
+        <w:t xml:space="preserve">The select signals for those two devices are named: </w:t>
       </w:r>
       <w:r>
         <w:rPr>
@@ -4325,7 +4631,7 @@
         <w:pStyle w:val="Heading3"/>
       </w:pPr>
       <w:bookmarkStart w:id="9" w:name="_Ref232850585"/>
-      <w:bookmarkStart w:id="10" w:name="_Toc233022164"/>
+      <w:bookmarkStart w:id="10" w:name="_Toc233191857"/>
       <w:r>
         <w:t>Writing t</w:t>
       </w:r>
@@ -4829,7 +5135,7 @@
         <w:pStyle w:val="Heading2"/>
       </w:pPr>
       <w:bookmarkStart w:id="11" w:name="_Ref232849573"/>
-      <w:bookmarkStart w:id="12" w:name="_Toc233022165"/>
+      <w:bookmarkStart w:id="12" w:name="_Toc233191858"/>
       <w:r>
         <w:t>Overview of GP and SP registers</w:t>
       </w:r>
@@ -4858,7 +5164,7 @@
       </w:pPr>
       <w:bookmarkStart w:id="13" w:name="_Ref232926928"/>
       <w:bookmarkStart w:id="14" w:name="_Ref232926933"/>
-      <w:bookmarkStart w:id="15" w:name="_Toc233022166"/>
+      <w:bookmarkStart w:id="15" w:name="_Toc233191859"/>
       <w:r>
         <w:t>SP Behaviour</w:t>
       </w:r>
@@ -4981,7 +5287,7 @@
         </w:rPr>
       </w:pPr>
       <w:bookmarkStart w:id="16" w:name="_Ref172648415"/>
-      <w:bookmarkStart w:id="17" w:name="_Toc233022167"/>
+      <w:bookmarkStart w:id="17" w:name="_Toc233191860"/>
       <w:r>
         <w:rPr>
           <w:lang w:eastAsia="en-GB"/>
@@ -5599,7 +5905,7 @@
         <w:rPr>
           <w:lang w:eastAsia="en-GB"/>
         </w:rPr>
-        <w:t>3.7</w:t>
+        <w:t>3.8</w:t>
       </w:r>
       <w:r>
         <w:rPr>
@@ -5658,7 +5964,7 @@
         <w:rPr>
           <w:lang w:eastAsia="en-GB"/>
         </w:rPr>
-        <w:t>3.8</w:t>
+        <w:t>3.9</w:t>
       </w:r>
       <w:r>
         <w:rPr>
@@ -5690,7 +5996,7 @@
       <w:bookmarkStart w:id="19" w:name="_Ref232084946"/>
       <w:bookmarkStart w:id="20" w:name="_Ref232086890"/>
       <w:bookmarkStart w:id="21" w:name="_Ref232086990"/>
-      <w:bookmarkStart w:id="22" w:name="_Toc233022168"/>
+      <w:bookmarkStart w:id="22" w:name="_Toc233191861"/>
       <w:r>
         <w:rPr>
           <w:lang w:eastAsia="en-GB"/>
@@ -5838,7 +6144,7 @@
         </w:rPr>
       </w:pPr>
       <w:bookmarkStart w:id="25" w:name="_Ref232081276"/>
-      <w:bookmarkStart w:id="26" w:name="_Toc233022169"/>
+      <w:bookmarkStart w:id="26" w:name="_Toc233191862"/>
       <w:r>
         <w:rPr>
           <w:lang w:eastAsia="en-GB"/>
@@ -5869,7 +6175,7 @@
         </w:rPr>
       </w:pPr>
       <w:bookmarkStart w:id="27" w:name="_Ref232081291"/>
-      <w:bookmarkStart w:id="28" w:name="_Toc233022170"/>
+      <w:bookmarkStart w:id="28" w:name="_Toc233191863"/>
       <w:r>
         <w:rPr>
           <w:lang w:eastAsia="en-GB"/>
@@ -5902,7 +6208,7 @@
         </w:rPr>
       </w:pPr>
       <w:bookmarkStart w:id="30" w:name="_Ref233021496"/>
-      <w:bookmarkStart w:id="31" w:name="_Toc233022171"/>
+      <w:bookmarkStart w:id="31" w:name="_Toc233191864"/>
       <w:r>
         <w:rPr>
           <w:lang w:eastAsia="en-GB"/>
@@ -6430,7 +6736,7 @@
         </w:rPr>
       </w:pPr>
       <w:bookmarkStart w:id="33" w:name="_Ref232090743"/>
-      <w:bookmarkStart w:id="34" w:name="_Toc233022172"/>
+      <w:bookmarkStart w:id="34" w:name="_Toc233191865"/>
       <w:r>
         <w:rPr>
           <w:lang w:eastAsia="en-GB"/>
@@ -6953,7 +7259,7 @@
         </w:rPr>
       </w:pPr>
       <w:bookmarkStart w:id="36" w:name="_Ref232090753"/>
-      <w:bookmarkStart w:id="37" w:name="_Toc233022173"/>
+      <w:bookmarkStart w:id="37" w:name="_Toc233191866"/>
       <w:r>
         <w:rPr>
           <w:lang w:eastAsia="en-GB"/>
@@ -6971,11 +7277,66 @@
           <w:lang w:eastAsia="en-GB"/>
         </w:rPr>
       </w:pPr>
-      <w:r>
-        <w:rPr>
-          <w:lang w:eastAsia="en-GB"/>
-        </w:rPr>
-        <w:t>To read from, or write to RAM, the RAM address must first be stored in the RAM Address Latch.</w:t>
+      <w:bookmarkStart w:id="38" w:name="CurrentEditPos"/>
+      <w:bookmarkEnd w:id="38"/>
+      <w:r>
+        <w:rPr>
+          <w:lang w:eastAsia="en-GB"/>
+        </w:rPr>
+        <w:t>To read from, or write to RAM, the RAM address must</w:t>
+      </w:r>
+      <w:r>
+        <w:rPr>
+          <w:lang w:eastAsia="en-GB"/>
+        </w:rPr>
+        <w:t xml:space="preserve"> first be put on the RAM ADDR bus (see </w:t>
+      </w:r>
+      <w:r>
+        <w:rPr>
+          <w:lang w:eastAsia="en-GB"/>
+        </w:rPr>
+        <w:fldChar w:fldCharType="begin"/>
+      </w:r>
+      <w:r>
+        <w:rPr>
+          <w:lang w:eastAsia="en-GB"/>
+        </w:rPr>
+        <w:instrText xml:space="preserve"> REF _Ref233191365 \r \h </w:instrText>
+      </w:r>
+      <w:r>
+        <w:rPr>
+          <w:lang w:eastAsia="en-GB"/>
+        </w:rPr>
+      </w:r>
+      <w:r>
+        <w:rPr>
+          <w:lang w:eastAsia="en-GB"/>
+        </w:rPr>
+        <w:fldChar w:fldCharType="separate"/>
+      </w:r>
+      <w:r>
+        <w:rPr>
+          <w:lang w:eastAsia="en-GB"/>
+        </w:rPr>
+        <w:t>3.7</w:t>
+      </w:r>
+      <w:r>
+        <w:rPr>
+          <w:lang w:eastAsia="en-GB"/>
+        </w:rPr>
+        <w:fldChar w:fldCharType="end"/>
+      </w:r>
+      <w:r>
+        <w:rPr>
+          <w:lang w:eastAsia="en-GB"/>
+        </w:rPr>
+        <w:t>)</w:t>
+      </w:r>
+      <w:r>
+        <w:rPr>
+          <w:lang w:eastAsia="en-GB"/>
+        </w:rPr>
+        <w:t>.</w:t>
       </w:r>
     </w:p>
     <w:p>
@@ -7065,7 +7426,7 @@
         <w:rPr>
           <w:lang w:eastAsia="en-GB"/>
         </w:rPr>
-        <w:t>SELECT_RAL_DEST</w:t>
+        <w:t>SELECT_RAM_DEST</w:t>
       </w:r>
     </w:p>
     <w:p>
@@ -7083,7 +7444,7 @@
         <w:rPr>
           <w:lang w:eastAsia="en-GB"/>
         </w:rPr>
-        <w:t xml:space="preserve">Selects the RAM Address Latch to be the destination for something else writing to the data bus. </w:t>
+        <w:t>Selects the RAM to be the destination for something else writing to the data bus.</w:t>
       </w:r>
     </w:p>
     <w:p>
@@ -7131,7 +7492,78 @@
         <w:rPr>
           <w:lang w:eastAsia="en-GB"/>
         </w:rPr>
-        <w:t>SELECT_RAM_DEST</w:t>
+        <w:t xml:space="preserve">READ (common defined in </w:t>
+      </w:r>
+      <w:r>
+        <w:rPr>
+          <w:lang w:eastAsia="en-GB"/>
+        </w:rPr>
+        <w:fldChar w:fldCharType="begin"/>
+      </w:r>
+      <w:r>
+        <w:rPr>
+          <w:lang w:eastAsia="en-GB"/>
+        </w:rPr>
+        <w:instrText xml:space="preserve"> REF _Ref232084668 \r \h </w:instrText>
+      </w:r>
+      <w:r>
+        <w:rPr>
+          <w:lang w:eastAsia="en-GB"/>
+        </w:rPr>
+      </w:r>
+      <w:r>
+        <w:rPr>
+          <w:lang w:eastAsia="en-GB"/>
+        </w:rPr>
+        <w:fldChar w:fldCharType="separate"/>
+      </w:r>
+      <w:r>
+        <w:rPr>
+          <w:lang w:eastAsia="en-GB"/>
+        </w:rPr>
+        <w:t>3.1</w:t>
+      </w:r>
+      <w:r>
+        <w:rPr>
+          <w:lang w:eastAsia="en-GB"/>
+        </w:rPr>
+        <w:fldChar w:fldCharType="end"/>
+      </w:r>
+      <w:r>
+        <w:rPr>
+          <w:lang w:eastAsia="en-GB"/>
+        </w:rPr>
+        <w:t>)</w:t>
+      </w:r>
+    </w:p>
+    <w:p>
+      <w:pPr>
+        <w:pStyle w:val="ListParagraph"/>
+        <w:numPr>
+          <w:ilvl w:val="0"/>
+          <w:numId w:val="7"/>
+        </w:numPr>
+        <w:rPr>
+          <w:lang w:eastAsia="en-GB"/>
+        </w:rPr>
+      </w:pPr>
+      <w:r>
+        <w:rPr>
+          <w:lang w:eastAsia="en-GB"/>
+        </w:rPr>
+        <w:t>SELECT_</w:t>
+      </w:r>
+      <w:r>
+        <w:rPr>
+          <w:lang w:eastAsia="en-GB"/>
+        </w:rPr>
+        <w:t>RAM</w:t>
+      </w:r>
+      <w:r>
+        <w:rPr>
+          <w:lang w:eastAsia="en-GB"/>
+        </w:rPr>
+        <w:t>_SRC</w:t>
       </w:r>
     </w:p>
     <w:p>
@@ -7149,7 +7581,19 @@
         <w:rPr>
           <w:lang w:eastAsia="en-GB"/>
         </w:rPr>
-        <w:t>Selects the RAM to be the destination for something else writing to the data bus.</w:t>
+        <w:t xml:space="preserve">Selects the </w:t>
+      </w:r>
+      <w:r>
+        <w:rPr>
+          <w:lang w:eastAsia="en-GB"/>
+        </w:rPr>
+        <w:t>RAM to be the source</w:t>
+      </w:r>
+      <w:r>
+        <w:rPr>
+          <w:lang w:eastAsia="en-GB"/>
+        </w:rPr>
+        <w:t xml:space="preserve"> that is going to write to the data bus.</w:t>
       </w:r>
     </w:p>
     <w:p>
@@ -7167,37 +7611,13 @@
         <w:rPr>
           <w:lang w:eastAsia="en-GB"/>
         </w:rPr>
-        <w:t xml:space="preserve">The RAM address that’s going to be written to must already be contained in the RAM address latch (see above) </w:t>
-      </w:r>
-    </w:p>
-    <w:p>
-      <w:pPr>
-        <w:pStyle w:val="ListParagraph"/>
-        <w:numPr>
-          <w:ilvl w:val="1"/>
-          <w:numId w:val="7"/>
-        </w:numPr>
-        <w:rPr>
-          <w:lang w:eastAsia="en-GB"/>
-        </w:rPr>
-      </w:pPr>
-      <w:r>
-        <w:rPr>
-          <w:lang w:eastAsia="en-GB"/>
-        </w:rPr>
-        <w:t xml:space="preserve">This doesn’t cause it to </w:t>
-      </w:r>
-      <w:r>
-        <w:rPr>
-          <w:lang w:eastAsia="en-GB"/>
-        </w:rPr>
-        <w:t>input from the data bus, it’s a precursor to reading from the data bus</w:t>
-      </w:r>
-      <w:r>
-        <w:rPr>
-          <w:lang w:eastAsia="en-GB"/>
-        </w:rPr>
-        <w:t xml:space="preserve"> – see READ below.</w:t>
+        <w:t>This doesn’t cause it to output on the data bus, it’s a precursor to writing on the data bus</w:t>
+      </w:r>
+      <w:r>
+        <w:rPr>
+          <w:lang w:eastAsia="en-GB"/>
+        </w:rPr>
+        <w:t xml:space="preserve"> – see WRITE below</w:t>
       </w:r>
     </w:p>
     <w:p>
@@ -7215,7 +7635,7 @@
         <w:rPr>
           <w:lang w:eastAsia="en-GB"/>
         </w:rPr>
-        <w:t xml:space="preserve">READ (common defined in </w:t>
+        <w:t xml:space="preserve">WRITE (common defined in </w:t>
       </w:r>
       <w:r>
         <w:rPr>
@@ -7227,7 +7647,7 @@
         <w:rPr>
           <w:lang w:eastAsia="en-GB"/>
         </w:rPr>
-        <w:instrText xml:space="preserve"> REF _Ref232084668 \r \h </w:instrText>
+        <w:instrText xml:space="preserve"> REF _Ref232084946 \r \h </w:instrText>
       </w:r>
       <w:r>
         <w:rPr>
@@ -7261,171 +7681,93 @@
     </w:p>
     <w:p>
       <w:pPr>
-        <w:pStyle w:val="ListParagraph"/>
-        <w:numPr>
-          <w:ilvl w:val="0"/>
-          <w:numId w:val="7"/>
-        </w:numPr>
-        <w:rPr>
-          <w:lang w:eastAsia="en-GB"/>
-        </w:rPr>
-      </w:pPr>
-      <w:r>
-        <w:rPr>
-          <w:lang w:eastAsia="en-GB"/>
-        </w:rPr>
-        <w:t>SELECT_</w:t>
-      </w:r>
-      <w:r>
-        <w:rPr>
-          <w:lang w:eastAsia="en-GB"/>
-        </w:rPr>
-        <w:t>RAM</w:t>
-      </w:r>
-      <w:r>
-        <w:rPr>
-          <w:lang w:eastAsia="en-GB"/>
-        </w:rPr>
-        <w:t>_SRC</w:t>
-      </w:r>
-    </w:p>
-    <w:p>
-      <w:pPr>
-        <w:pStyle w:val="ListParagraph"/>
-        <w:numPr>
-          <w:ilvl w:val="1"/>
-          <w:numId w:val="7"/>
-        </w:numPr>
-        <w:rPr>
-          <w:lang w:eastAsia="en-GB"/>
-        </w:rPr>
-      </w:pPr>
-      <w:r>
-        <w:rPr>
-          <w:lang w:eastAsia="en-GB"/>
-        </w:rPr>
-        <w:t xml:space="preserve">Selects the </w:t>
-      </w:r>
-      <w:r>
-        <w:rPr>
-          <w:lang w:eastAsia="en-GB"/>
-        </w:rPr>
-        <w:t>RAM to be the source</w:t>
-      </w:r>
-      <w:r>
-        <w:rPr>
-          <w:lang w:eastAsia="en-GB"/>
-        </w:rPr>
-        <w:t xml:space="preserve"> that is going to write to the data bus.</w:t>
-      </w:r>
-    </w:p>
-    <w:p>
-      <w:pPr>
-        <w:pStyle w:val="ListParagraph"/>
-        <w:numPr>
-          <w:ilvl w:val="1"/>
-          <w:numId w:val="7"/>
-        </w:numPr>
-        <w:rPr>
-          <w:lang w:eastAsia="en-GB"/>
-        </w:rPr>
-      </w:pPr>
-      <w:r>
-        <w:rPr>
-          <w:lang w:eastAsia="en-GB"/>
-        </w:rPr>
-        <w:t xml:space="preserve">The RAM address that’s going to be read from must already be contained in the RAM address latch (see above) </w:t>
-      </w:r>
-    </w:p>
-    <w:p>
-      <w:pPr>
-        <w:pStyle w:val="ListParagraph"/>
-        <w:numPr>
-          <w:ilvl w:val="1"/>
-          <w:numId w:val="7"/>
-        </w:numPr>
-        <w:rPr>
-          <w:lang w:eastAsia="en-GB"/>
-        </w:rPr>
-      </w:pPr>
-      <w:r>
-        <w:rPr>
-          <w:lang w:eastAsia="en-GB"/>
-        </w:rPr>
-        <w:t>This doesn’t cause it to output on the data bus, it’s a precursor to writing on the data bus</w:t>
-      </w:r>
-      <w:r>
-        <w:rPr>
-          <w:lang w:eastAsia="en-GB"/>
-        </w:rPr>
-        <w:t xml:space="preserve"> – see WRITE below</w:t>
-      </w:r>
-    </w:p>
-    <w:p>
-      <w:pPr>
-        <w:pStyle w:val="ListParagraph"/>
-        <w:numPr>
-          <w:ilvl w:val="0"/>
-          <w:numId w:val="7"/>
-        </w:numPr>
-        <w:rPr>
-          <w:lang w:eastAsia="en-GB"/>
-        </w:rPr>
-      </w:pPr>
-      <w:r>
-        <w:rPr>
-          <w:lang w:eastAsia="en-GB"/>
-        </w:rPr>
-        <w:t xml:space="preserve">WRITE (common defined in </w:t>
-      </w:r>
-      <w:r>
-        <w:rPr>
-          <w:lang w:eastAsia="en-GB"/>
-        </w:rPr>
-        <w:fldChar w:fldCharType="begin"/>
-      </w:r>
-      <w:r>
-        <w:rPr>
-          <w:lang w:eastAsia="en-GB"/>
-        </w:rPr>
-        <w:instrText xml:space="preserve"> REF _Ref232084946 \r \h </w:instrText>
-      </w:r>
-      <w:r>
-        <w:rPr>
-          <w:lang w:eastAsia="en-GB"/>
-        </w:rPr>
-      </w:r>
-      <w:r>
-        <w:rPr>
-          <w:lang w:eastAsia="en-GB"/>
-        </w:rPr>
-        <w:fldChar w:fldCharType="separate"/>
-      </w:r>
-      <w:r>
-        <w:rPr>
-          <w:lang w:eastAsia="en-GB"/>
-        </w:rPr>
-        <w:t>3.1</w:t>
-      </w:r>
-      <w:r>
-        <w:rPr>
-          <w:lang w:eastAsia="en-GB"/>
-        </w:rPr>
-        <w:fldChar w:fldCharType="end"/>
-      </w:r>
-      <w:r>
-        <w:rPr>
-          <w:lang w:eastAsia="en-GB"/>
-        </w:rPr>
-        <w:t>)</w:t>
-      </w:r>
-    </w:p>
-    <w:p>
-      <w:pPr>
-        <w:rPr>
-          <w:lang w:eastAsia="en-GB"/>
-        </w:rPr>
-      </w:pPr>
+        <w:pStyle w:val="Heading2"/>
+        <w:rPr>
+          <w:lang w:eastAsia="en-GB"/>
+        </w:rPr>
+      </w:pPr>
+      <w:bookmarkStart w:id="39" w:name="_Ref233191365"/>
+      <w:bookmarkStart w:id="40" w:name="_Toc233191867"/>
+      <w:r>
+        <w:rPr>
+          <w:lang w:eastAsia="en-GB"/>
+        </w:rPr>
+        <w:t>RAM ADDR Bus</w:t>
+      </w:r>
+      <w:bookmarkEnd w:id="39"/>
+      <w:bookmarkEnd w:id="40"/>
+    </w:p>
+    <w:p>
+      <w:pPr>
+        <w:rPr>
+          <w:lang w:eastAsia="en-GB"/>
+        </w:rPr>
+      </w:pPr>
+      <w:r>
+        <w:rPr>
+          <w:lang w:eastAsia="en-GB"/>
+        </w:rPr>
+        <w:t xml:space="preserve">This will contain up to 16 bits (for a 64K x 16 </w:t>
+      </w:r>
+      <w:proofErr w:type="gramStart"/>
+      <w:r>
+        <w:rPr>
+          <w:lang w:eastAsia="en-GB"/>
+        </w:rPr>
+        <w:t>bit</w:t>
+      </w:r>
+      <w:proofErr w:type="gramEnd"/>
+      <w:r>
+        <w:rPr>
+          <w:lang w:eastAsia="en-GB"/>
+        </w:rPr>
+        <w:t xml:space="preserve"> RAM). If the size is &lt; 64K </w:t>
+      </w:r>
+      <w:proofErr w:type="gramStart"/>
+      <w:r>
+        <w:rPr>
+          <w:lang w:eastAsia="en-GB"/>
+        </w:rPr>
+        <w:t>less</w:t>
+      </w:r>
+      <w:proofErr w:type="gramEnd"/>
+      <w:r>
+        <w:rPr>
+          <w:lang w:eastAsia="en-GB"/>
+        </w:rPr>
+        <w:t xml:space="preserve"> bits will be required on the address bus. &lt;</w:t>
+      </w:r>
+      <w:proofErr w:type="spellStart"/>
+      <w:proofErr w:type="gramStart"/>
+      <w:r>
+        <w:rPr>
+          <w:lang w:eastAsia="en-GB"/>
+        </w:rPr>
+        <w:t>tbd</w:t>
+      </w:r>
+      <w:proofErr w:type="spellEnd"/>
+      <w:proofErr w:type="gramEnd"/>
+      <w:r>
+        <w:rPr>
+          <w:lang w:eastAsia="en-GB"/>
+        </w:rPr>
+        <w:t xml:space="preserve"> Earth to decide RAM size, but this isn’t urgent or blocking any work ATM&gt;</w:t>
+      </w:r>
+    </w:p>
+    <w:p>
+      <w:pPr>
+        <w:rPr>
+          <w:lang w:eastAsia="en-GB"/>
+        </w:rPr>
+      </w:pPr>
+      <w:proofErr w:type="gramStart"/>
+      <w:r>
+        <w:rPr>
+          <w:lang w:eastAsia="en-GB"/>
+        </w:rPr>
+        <w:t>The IS will write the correct value to this bus before doing any data transfers to / from RAM.</w:t>
+      </w:r>
+      <w:proofErr w:type="gramEnd"/>
     </w:p>
     <w:p>
       <w:pPr>
@@ -7439,7 +7781,7 @@
           <w:lang w:eastAsia="en-GB"/>
         </w:rPr>
       </w:pPr>
-      <w:bookmarkStart w:id="38" w:name="_Ref232081305"/>
+      <w:bookmarkStart w:id="41" w:name="_Ref232081305"/>
       <w:r>
         <w:rPr>
           <w:lang w:eastAsia="en-GB"/>
@@ -7454,8 +7796,8 @@
           <w:lang w:eastAsia="en-GB"/>
         </w:rPr>
       </w:pPr>
-      <w:bookmarkStart w:id="39" w:name="_Ref232851000"/>
-      <w:bookmarkStart w:id="40" w:name="_Toc233022174"/>
+      <w:bookmarkStart w:id="42" w:name="_Ref232851000"/>
+      <w:bookmarkStart w:id="43" w:name="_Toc233191868"/>
       <w:r>
         <w:rPr>
           <w:lang w:eastAsia="en-GB"/>
@@ -7463,9 +7805,9 @@
         <w:lastRenderedPageBreak/>
         <w:t>ALU CTRL bus</w:t>
       </w:r>
-      <w:bookmarkEnd w:id="38"/>
-      <w:bookmarkEnd w:id="39"/>
-      <w:bookmarkEnd w:id="40"/>
+      <w:bookmarkEnd w:id="41"/>
+      <w:bookmarkEnd w:id="42"/>
+      <w:bookmarkEnd w:id="43"/>
     </w:p>
     <w:p>
       <w:pPr>
@@ -7550,14 +7892,14 @@
           <w:lang w:eastAsia="en-GB"/>
         </w:rPr>
       </w:pPr>
-      <w:bookmarkStart w:id="41" w:name="ALU_MODE"/>
+      <w:bookmarkStart w:id="44" w:name="ALU_MODE"/>
       <w:r>
         <w:rPr>
           <w:lang w:eastAsia="en-GB"/>
         </w:rPr>
         <w:t>ALU_MODE</w:t>
       </w:r>
-      <w:bookmarkEnd w:id="41"/>
+      <w:bookmarkEnd w:id="44"/>
     </w:p>
     <w:p>
       <w:pPr>
@@ -7669,7 +8011,7 @@
         <w:keepNext/>
         <w:jc w:val="center"/>
       </w:pPr>
-      <w:bookmarkStart w:id="42" w:name="_Ref232689048"/>
+      <w:bookmarkStart w:id="45" w:name="_Ref232689048"/>
       <w:r>
         <w:t xml:space="preserve">Table </w:t>
       </w:r>
@@ -7681,7 +8023,7 @@
           <w:t>2</w:t>
         </w:r>
       </w:fldSimple>
-      <w:bookmarkEnd w:id="42"/>
+      <w:bookmarkEnd w:id="45"/>
       <w:r>
         <w:t>:   ALU_MODE bits and their meaning</w:t>
       </w:r>
@@ -8859,14 +9201,14 @@
           <w:lang w:eastAsia="en-GB"/>
         </w:rPr>
       </w:pPr>
-      <w:bookmarkStart w:id="43" w:name="SELECT_ALU_DESTA"/>
+      <w:bookmarkStart w:id="46" w:name="SELECT_ALU_DESTA"/>
       <w:r>
         <w:rPr>
           <w:lang w:eastAsia="en-GB"/>
         </w:rPr>
         <w:t>SELECT_ALU_DESTA</w:t>
       </w:r>
-      <w:bookmarkEnd w:id="43"/>
+      <w:bookmarkEnd w:id="46"/>
     </w:p>
     <w:p>
       <w:pPr>
@@ -8915,14 +9257,14 @@
           <w:lang w:eastAsia="en-GB"/>
         </w:rPr>
       </w:pPr>
-      <w:bookmarkStart w:id="44" w:name="SELECT_ALU_DESTB"/>
+      <w:bookmarkStart w:id="47" w:name="SELECT_ALU_DESTB"/>
       <w:r>
         <w:rPr>
           <w:lang w:eastAsia="en-GB"/>
         </w:rPr>
         <w:t>SELECT_ALU_DESTB</w:t>
       </w:r>
-      <w:bookmarkEnd w:id="44"/>
+      <w:bookmarkEnd w:id="47"/>
     </w:p>
     <w:p>
       <w:pPr>
@@ -9036,14 +9378,14 @@
           <w:lang w:eastAsia="en-GB"/>
         </w:rPr>
       </w:pPr>
-      <w:bookmarkStart w:id="45" w:name="SELECT_ALUO_SRC"/>
+      <w:bookmarkStart w:id="48" w:name="SELECT_ALUO_SRC"/>
       <w:r>
         <w:rPr>
           <w:lang w:eastAsia="en-GB"/>
         </w:rPr>
         <w:t>SELECT_ALUO_SRC</w:t>
       </w:r>
-      <w:bookmarkEnd w:id="45"/>
+      <w:bookmarkEnd w:id="48"/>
     </w:p>
     <w:p>
       <w:pPr>
@@ -9170,7 +9512,7 @@
           <w:lang w:eastAsia="en-GB"/>
         </w:rPr>
       </w:pPr>
-      <w:bookmarkStart w:id="46" w:name="_Ref232081310"/>
+      <w:bookmarkStart w:id="49" w:name="_Ref232081310"/>
       <w:r>
         <w:rPr>
           <w:lang w:eastAsia="en-GB"/>
@@ -9185,8 +9527,8 @@
           <w:lang w:eastAsia="en-GB"/>
         </w:rPr>
       </w:pPr>
-      <w:bookmarkStart w:id="47" w:name="_Ref232090831"/>
-      <w:bookmarkStart w:id="48" w:name="_Toc233022175"/>
+      <w:bookmarkStart w:id="50" w:name="_Ref232090831"/>
+      <w:bookmarkStart w:id="51" w:name="_Toc233191869"/>
       <w:r>
         <w:rPr>
           <w:lang w:eastAsia="en-GB"/>
@@ -9194,9 +9536,9 @@
         <w:lastRenderedPageBreak/>
         <w:t>FLAGS bus</w:t>
       </w:r>
-      <w:bookmarkEnd w:id="46"/>
-      <w:bookmarkEnd w:id="47"/>
-      <w:bookmarkEnd w:id="48"/>
+      <w:bookmarkEnd w:id="49"/>
+      <w:bookmarkEnd w:id="50"/>
+      <w:bookmarkEnd w:id="51"/>
     </w:p>
     <w:p>
       <w:pPr>
@@ -9544,7 +9886,7 @@
           <w:lang w:eastAsia="en-GB"/>
         </w:rPr>
       </w:pPr>
-      <w:bookmarkStart w:id="49" w:name="_Toc233022176"/>
+      <w:bookmarkStart w:id="52" w:name="_Toc233191870"/>
       <w:r>
         <w:rPr>
           <w:lang w:eastAsia="en-GB"/>
@@ -9580,7 +9922,7 @@
         </w:rPr>
         <w:t>ALU_MODE</w:t>
       </w:r>
-      <w:bookmarkEnd w:id="49"/>
+      <w:bookmarkEnd w:id="52"/>
       <w:r>
         <w:rPr>
           <w:lang w:eastAsia="en-GB"/>
@@ -9715,7 +10057,7 @@
           <w:lang w:eastAsia="en-GB"/>
         </w:rPr>
       </w:pPr>
-      <w:bookmarkStart w:id="50" w:name="_Toc233022177"/>
+      <w:bookmarkStart w:id="53" w:name="_Toc233191871"/>
       <w:r>
         <w:rPr>
           <w:lang w:eastAsia="en-GB"/>
@@ -9751,7 +10093,7 @@
         </w:rPr>
         <w:t>ALU_MODE</w:t>
       </w:r>
-      <w:bookmarkEnd w:id="50"/>
+      <w:bookmarkEnd w:id="53"/>
       <w:r>
         <w:rPr>
           <w:lang w:eastAsia="en-GB"/>
@@ -9906,7 +10248,7 @@
         <w:keepNext/>
         <w:jc w:val="center"/>
       </w:pPr>
-      <w:bookmarkStart w:id="51" w:name="_Ref232694733"/>
+      <w:bookmarkStart w:id="54" w:name="_Ref232694733"/>
       <w:r>
         <w:t xml:space="preserve">Table </w:t>
       </w:r>
@@ -9918,7 +10260,7 @@
           <w:t>3</w:t>
         </w:r>
       </w:fldSimple>
-      <w:bookmarkEnd w:id="51"/>
+      <w:bookmarkEnd w:id="54"/>
       <w:r>
         <w:t xml:space="preserve">:   Rules for FLAG_V and FLAG_C </w:t>
       </w:r>
@@ -10362,7 +10704,7 @@
                 <w:sz w:val="20"/>
                 <w:lang w:eastAsia="en-GB"/>
               </w:rPr>
-              <w:t>3.8.2.1</w:t>
+              <w:t>3.9.2.1</w:t>
             </w:r>
             <w:r>
               <w:rPr>
@@ -10429,7 +10771,7 @@
                 <w:sz w:val="20"/>
                 <w:lang w:eastAsia="en-GB"/>
               </w:rPr>
-              <w:t>3.8.2.2</w:t>
+              <w:t>3.9.2.2</w:t>
             </w:r>
             <w:r>
               <w:rPr>
@@ -10527,7 +10869,7 @@
                 <w:sz w:val="20"/>
                 <w:lang w:eastAsia="en-GB"/>
               </w:rPr>
-              <w:t>3.8.2.3</w:t>
+              <w:t>3.9.2.3</w:t>
             </w:r>
             <w:r>
               <w:rPr>
@@ -10594,7 +10936,7 @@
                 <w:sz w:val="20"/>
                 <w:lang w:eastAsia="en-GB"/>
               </w:rPr>
-              <w:t>3.8.2.4</w:t>
+              <w:t>3.9.2.4</w:t>
             </w:r>
             <w:r>
               <w:rPr>
@@ -10854,7 +11196,7 @@
           <w:lang w:eastAsia="en-GB"/>
         </w:rPr>
       </w:pPr>
-      <w:bookmarkStart w:id="52" w:name="_Ref232694870"/>
+      <w:bookmarkStart w:id="55" w:name="_Ref232694870"/>
       <w:r>
         <w:rPr>
           <w:lang w:eastAsia="en-GB"/>
@@ -10902,7 +11244,7 @@
         </w:rPr>
         <w:t xml:space="preserve"> = ADD</w:t>
       </w:r>
-      <w:bookmarkEnd w:id="52"/>
+      <w:bookmarkEnd w:id="55"/>
     </w:p>
     <w:p>
       <w:pPr>
@@ -10950,7 +11292,7 @@
           <w:lang w:eastAsia="en-GB"/>
         </w:rPr>
       </w:pPr>
-      <w:bookmarkStart w:id="53" w:name="_Ref232694986"/>
+      <w:bookmarkStart w:id="56" w:name="_Ref232694986"/>
       <w:r>
         <w:rPr>
           <w:lang w:eastAsia="en-GB"/>
@@ -10998,7 +11340,7 @@
         </w:rPr>
         <w:t xml:space="preserve"> = ADD</w:t>
       </w:r>
-      <w:bookmarkEnd w:id="53"/>
+      <w:bookmarkEnd w:id="56"/>
     </w:p>
     <w:p>
       <w:pPr>
@@ -11040,7 +11382,7 @@
           <w:lang w:eastAsia="en-GB"/>
         </w:rPr>
       </w:pPr>
-      <w:bookmarkStart w:id="54" w:name="_Ref232695562"/>
+      <w:bookmarkStart w:id="57" w:name="_Ref232695562"/>
       <w:r>
         <w:rPr>
           <w:lang w:eastAsia="en-GB"/>
@@ -11088,7 +11430,7 @@
         </w:rPr>
         <w:t xml:space="preserve"> = SUB</w:t>
       </w:r>
-      <w:bookmarkEnd w:id="54"/>
+      <w:bookmarkEnd w:id="57"/>
     </w:p>
     <w:p>
       <w:pPr>
@@ -11130,7 +11472,7 @@
           <w:lang w:eastAsia="en-GB"/>
         </w:rPr>
       </w:pPr>
-      <w:bookmarkStart w:id="55" w:name="_Ref232695568"/>
+      <w:bookmarkStart w:id="58" w:name="_Ref232695568"/>
       <w:r>
         <w:rPr>
           <w:lang w:eastAsia="en-GB"/>
@@ -11178,7 +11520,7 @@
         </w:rPr>
         <w:t xml:space="preserve"> = SUB</w:t>
       </w:r>
-      <w:bookmarkEnd w:id="55"/>
+      <w:bookmarkEnd w:id="58"/>
     </w:p>
     <w:p>
       <w:pPr>
@@ -11246,7 +11588,7 @@
           <w:lang w:eastAsia="en-GB"/>
         </w:rPr>
       </w:pPr>
-      <w:bookmarkStart w:id="56" w:name="_Toc233022178"/>
+      <w:bookmarkStart w:id="59" w:name="_Toc233191872"/>
       <w:r>
         <w:rPr>
           <w:lang w:eastAsia="en-GB"/>
@@ -11255,9 +11597,9 @@
         <w:t>References</w:t>
       </w:r>
       <w:bookmarkEnd w:id="16"/>
-      <w:bookmarkEnd w:id="56"/>
-    </w:p>
-    <w:bookmarkStart w:id="57" w:name="AVR_Instruction_Doc"/>
+      <w:bookmarkEnd w:id="59"/>
+    </w:p>
+    <w:bookmarkStart w:id="60" w:name="AVR_Instruction_Doc"/>
     <w:p>
       <w:pPr>
         <w:pStyle w:val="ListParagraph"/>
@@ -11299,7 +11641,7 @@
         </w:rPr>
         <w:t>AVR Instruction Set Manual</w:t>
       </w:r>
-      <w:bookmarkEnd w:id="57"/>
+      <w:bookmarkEnd w:id="60"/>
       <w:r>
         <w:rPr>
           <w:lang w:eastAsia="en-GB"/>
@@ -11384,7 +11726,7 @@
         <w:color w:val="7F7F7F" w:themeColor="background1" w:themeShade="7F"/>
         <w:spacing w:val="60"/>
       </w:rPr>
-      <w:id w:val="808964570"/>
+      <w:id w:val="1159004478"/>
       <w:docPartObj>
         <w:docPartGallery w:val="Page Numbers (Top of Page)"/>
         <w:docPartUnique/>
@@ -11424,7 +11766,7 @@
               <w:b/>
               <w:noProof/>
             </w:rPr>
-            <w:t>2</w:t>
+            <w:t>7</w:t>
           </w:r>
         </w:fldSimple>
       </w:p>
@@ -13702,6 +14044,92 @@
     </w:lvl>
   </w:abstractNum>
   <w:abstractNum w:abstractNumId="21">
+    <w:nsid w:val="72161278"/>
+    <w:multiLevelType w:val="hybridMultilevel"/>
+    <w:tmpl w:val="8E18B67A"/>
+    <w:lvl w:ilvl="0" w:tplc="0809000F">
+      <w:start w:val="1"/>
+      <w:numFmt w:val="decimal"/>
+      <w:lvlText w:val="%1."/>
+      <w:lvlJc w:val="left"/>
+      <w:pPr>
+        <w:ind w:left="720" w:hanging="360"/>
+      </w:pPr>
+    </w:lvl>
+    <w:lvl w:ilvl="1" w:tplc="08090019" w:tentative="1">
+      <w:start w:val="1"/>
+      <w:numFmt w:val="lowerLetter"/>
+      <w:lvlText w:val="%2."/>
+      <w:lvlJc w:val="left"/>
+      <w:pPr>
+        <w:ind w:left="1440" w:hanging="360"/>
+      </w:pPr>
+    </w:lvl>
+    <w:lvl w:ilvl="2" w:tplc="0809001B" w:tentative="1">
+      <w:start w:val="1"/>
+      <w:numFmt w:val="lowerRoman"/>
+      <w:lvlText w:val="%3."/>
+      <w:lvlJc w:val="right"/>
+      <w:pPr>
+        <w:ind w:left="2160" w:hanging="180"/>
+      </w:pPr>
+    </w:lvl>
+    <w:lvl w:ilvl="3" w:tplc="0809000F" w:tentative="1">
+      <w:start w:val="1"/>
+      <w:numFmt w:val="decimal"/>
+      <w:lvlText w:val="%4."/>
+      <w:lvlJc w:val="left"/>
+      <w:pPr>
+        <w:ind w:left="2880" w:hanging="360"/>
+      </w:pPr>
+    </w:lvl>
+    <w:lvl w:ilvl="4" w:tplc="08090019" w:tentative="1">
+      <w:start w:val="1"/>
+      <w:numFmt w:val="lowerLetter"/>
+      <w:lvlText w:val="%5."/>
+      <w:lvlJc w:val="left"/>
+      <w:pPr>
+        <w:ind w:left="3600" w:hanging="360"/>
+      </w:pPr>
+    </w:lvl>
+    <w:lvl w:ilvl="5" w:tplc="0809001B" w:tentative="1">
+      <w:start w:val="1"/>
+      <w:numFmt w:val="lowerRoman"/>
+      <w:lvlText w:val="%6."/>
+      <w:lvlJc w:val="right"/>
+      <w:pPr>
+        <w:ind w:left="4320" w:hanging="180"/>
+      </w:pPr>
+    </w:lvl>
+    <w:lvl w:ilvl="6" w:tplc="0809000F" w:tentative="1">
+      <w:start w:val="1"/>
+      <w:numFmt w:val="decimal"/>
+      <w:lvlText w:val="%7."/>
+      <w:lvlJc w:val="left"/>
+      <w:pPr>
+        <w:ind w:left="5040" w:hanging="360"/>
+      </w:pPr>
+    </w:lvl>
+    <w:lvl w:ilvl="7" w:tplc="08090019" w:tentative="1">
+      <w:start w:val="1"/>
+      <w:numFmt w:val="lowerLetter"/>
+      <w:lvlText w:val="%8."/>
+      <w:lvlJc w:val="left"/>
+      <w:pPr>
+        <w:ind w:left="5760" w:hanging="360"/>
+      </w:pPr>
+    </w:lvl>
+    <w:lvl w:ilvl="8" w:tplc="0809001B" w:tentative="1">
+      <w:start w:val="1"/>
+      <w:numFmt w:val="lowerRoman"/>
+      <w:lvlText w:val="%9."/>
+      <w:lvlJc w:val="right"/>
+      <w:pPr>
+        <w:ind w:left="6480" w:hanging="180"/>
+      </w:pPr>
+    </w:lvl>
+  </w:abstractNum>
+  <w:abstractNum w:abstractNumId="22">
     <w:nsid w:val="72C52DE3"/>
     <w:multiLevelType w:val="hybridMultilevel"/>
     <w:tmpl w:val="29109174"/>
@@ -13814,7 +14242,120 @@
       </w:rPr>
     </w:lvl>
   </w:abstractNum>
-  <w:abstractNum w:abstractNumId="22">
+  <w:abstractNum w:abstractNumId="23">
+    <w:nsid w:val="76277BBE"/>
+    <w:multiLevelType w:val="hybridMultilevel"/>
+    <w:tmpl w:val="F2EC0C36"/>
+    <w:lvl w:ilvl="0" w:tplc="08090001">
+      <w:start w:val="1"/>
+      <w:numFmt w:val="bullet"/>
+      <w:lvlText w:val=""/>
+      <w:lvlJc w:val="left"/>
+      <w:pPr>
+        <w:ind w:left="720" w:hanging="360"/>
+      </w:pPr>
+      <w:rPr>
+        <w:rFonts w:ascii="Symbol" w:hAnsi="Symbol" w:hint="default"/>
+      </w:rPr>
+    </w:lvl>
+    <w:lvl w:ilvl="1" w:tplc="08090003" w:tentative="1">
+      <w:start w:val="1"/>
+      <w:numFmt w:val="bullet"/>
+      <w:lvlText w:val="o"/>
+      <w:lvlJc w:val="left"/>
+      <w:pPr>
+        <w:ind w:left="1440" w:hanging="360"/>
+      </w:pPr>
+      <w:rPr>
+        <w:rFonts w:ascii="Courier New" w:hAnsi="Courier New" w:cs="Courier New" w:hint="default"/>
+      </w:rPr>
+    </w:lvl>
+    <w:lvl w:ilvl="2" w:tplc="08090005" w:tentative="1">
+      <w:start w:val="1"/>
+      <w:numFmt w:val="bullet"/>
+      <w:lvlText w:val=""/>
+      <w:lvlJc w:val="left"/>
+      <w:pPr>
+        <w:ind w:left="2160" w:hanging="360"/>
+      </w:pPr>
+      <w:rPr>
+        <w:rFonts w:ascii="Wingdings" w:hAnsi="Wingdings" w:hint="default"/>
+      </w:rPr>
+    </w:lvl>
+    <w:lvl w:ilvl="3" w:tplc="08090001" w:tentative="1">
+      <w:start w:val="1"/>
+      <w:numFmt w:val="bullet"/>
+      <w:lvlText w:val=""/>
+      <w:lvlJc w:val="left"/>
+      <w:pPr>
+        <w:ind w:left="2880" w:hanging="360"/>
+      </w:pPr>
+      <w:rPr>
+        <w:rFonts w:ascii="Symbol" w:hAnsi="Symbol" w:hint="default"/>
+      </w:rPr>
+    </w:lvl>
+    <w:lvl w:ilvl="4" w:tplc="08090003" w:tentative="1">
+      <w:start w:val="1"/>
+      <w:numFmt w:val="bullet"/>
+      <w:lvlText w:val="o"/>
+      <w:lvlJc w:val="left"/>
+      <w:pPr>
+        <w:ind w:left="3600" w:hanging="360"/>
+      </w:pPr>
+      <w:rPr>
+        <w:rFonts w:ascii="Courier New" w:hAnsi="Courier New" w:cs="Courier New" w:hint="default"/>
+      </w:rPr>
+    </w:lvl>
+    <w:lvl w:ilvl="5" w:tplc="08090005" w:tentative="1">
+      <w:start w:val="1"/>
+      <w:numFmt w:val="bullet"/>
+      <w:lvlText w:val=""/>
+      <w:lvlJc w:val="left"/>
+      <w:pPr>
+        <w:ind w:left="4320" w:hanging="360"/>
+      </w:pPr>
+      <w:rPr>
+        <w:rFonts w:ascii="Wingdings" w:hAnsi="Wingdings" w:hint="default"/>
+      </w:rPr>
+    </w:lvl>
+    <w:lvl w:ilvl="6" w:tplc="08090001" w:tentative="1">
+      <w:start w:val="1"/>
+      <w:numFmt w:val="bullet"/>
+      <w:lvlText w:val=""/>
+      <w:lvlJc w:val="left"/>
+      <w:pPr>
+        <w:ind w:left="5040" w:hanging="360"/>
+      </w:pPr>
+      <w:rPr>
+        <w:rFonts w:ascii="Symbol" w:hAnsi="Symbol" w:hint="default"/>
+      </w:rPr>
+    </w:lvl>
+    <w:lvl w:ilvl="7" w:tplc="08090003" w:tentative="1">
+      <w:start w:val="1"/>
+      <w:numFmt w:val="bullet"/>
+      <w:lvlText w:val="o"/>
+      <w:lvlJc w:val="left"/>
+      <w:pPr>
+        <w:ind w:left="5760" w:hanging="360"/>
+      </w:pPr>
+      <w:rPr>
+        <w:rFonts w:ascii="Courier New" w:hAnsi="Courier New" w:cs="Courier New" w:hint="default"/>
+      </w:rPr>
+    </w:lvl>
+    <w:lvl w:ilvl="8" w:tplc="08090005" w:tentative="1">
+      <w:start w:val="1"/>
+      <w:numFmt w:val="bullet"/>
+      <w:lvlText w:val=""/>
+      <w:lvlJc w:val="left"/>
+      <w:pPr>
+        <w:ind w:left="6480" w:hanging="360"/>
+      </w:pPr>
+      <w:rPr>
+        <w:rFonts w:ascii="Wingdings" w:hAnsi="Wingdings" w:hint="default"/>
+      </w:rPr>
+    </w:lvl>
+  </w:abstractNum>
+  <w:abstractNum w:abstractNumId="24">
     <w:nsid w:val="77B47D33"/>
     <w:multiLevelType w:val="hybridMultilevel"/>
     <w:tmpl w:val="AA146E8C"/>
@@ -13927,7 +14468,7 @@
       </w:rPr>
     </w:lvl>
   </w:abstractNum>
-  <w:abstractNum w:abstractNumId="23">
+  <w:abstractNum w:abstractNumId="25">
     <w:nsid w:val="7DAB54F1"/>
     <w:multiLevelType w:val="hybridMultilevel"/>
     <w:tmpl w:val="B7A2471E"/>
@@ -14040,7 +14581,7 @@
       </w:rPr>
     </w:lvl>
   </w:abstractNum>
-  <w:abstractNum w:abstractNumId="24">
+  <w:abstractNum w:abstractNumId="26">
     <w:nsid w:val="7F6475FB"/>
     <w:multiLevelType w:val="hybridMultilevel"/>
     <w:tmpl w:val="CD608B4E"/>
@@ -14166,7 +14707,7 @@
     <w:abstractNumId w:val="19"/>
   </w:num>
   <w:num w:numId="5">
-    <w:abstractNumId w:val="21"/>
+    <w:abstractNumId w:val="22"/>
   </w:num>
   <w:num w:numId="6">
     <w:abstractNumId w:val="14"/>
@@ -14178,13 +14719,13 @@
     <w:abstractNumId w:val="6"/>
   </w:num>
   <w:num w:numId="9">
+    <w:abstractNumId w:val="26"/>
+  </w:num>
+  <w:num w:numId="10">
     <w:abstractNumId w:val="24"/>
   </w:num>
-  <w:num w:numId="10">
-    <w:abstractNumId w:val="22"/>
-  </w:num>
   <w:num w:numId="11">
-    <w:abstractNumId w:val="23"/>
+    <w:abstractNumId w:val="25"/>
   </w:num>
   <w:num w:numId="12">
     <w:abstractNumId w:val="20"/>
@@ -14227,6 +14768,12 @@
   </w:num>
   <w:num w:numId="25">
     <w:abstractNumId w:val="17"/>
+  </w:num>
+  <w:num w:numId="26">
+    <w:abstractNumId w:val="21"/>
+  </w:num>
+  <w:num w:numId="27">
+    <w:abstractNumId w:val="23"/>
   </w:num>
   <w:numIdMacAtCleanup w:val="18"/>
 </w:numbering>
@@ -15364,7 +15911,7 @@
 </file>
 
 <file path=customXml/itemProps2.xml><?xml version="1.0" encoding="utf-8"?>
-<ds:datastoreItem xmlns:ds="http://schemas.openxmlformats.org/officeDocument/2006/customXml" ds:itemID="{716AAEF7-493A-425D-971B-08D174FF7C39}">
+<ds:datastoreItem xmlns:ds="http://schemas.openxmlformats.org/officeDocument/2006/customXml" ds:itemID="{7E11700C-1754-4627-9430-D2F7B5B2B9EA}">
   <ds:schemaRefs>
     <ds:schemaRef ds:uri="http://schemas.openxmlformats.org/officeDocument/2006/bibliography"/>
   </ds:schemaRefs>

</xml_diff>

<commit_message>
Added timing diagram for data bus transfers
The drawing was made in L1IsDrawings.pptx then a screen shot of it was pasted into CpuDesign.docx
</commit_message>
<xml_diff>
--- a/CPU Design/CpuDesign.docx
+++ b/CPU Design/CpuDesign.docx
@@ -63,7 +63,7 @@
                     <v:path arrowok="t"/>
                   </v:shape>
                 </v:group>
-                <v:rect id="_x0000_s1039" style="position:absolute;left:1800;top:1440;width:8638;height:551;mso-width-percent:1000;mso-position-horizontal:center;mso-position-horizontal-relative:margin;mso-position-vertical:top;mso-position-vertical-relative:margin;mso-width-percent:1000;mso-width-relative:margin;mso-height-relative:margin" filled="f" stroked="f">
+                <v:rect id="_x0000_s1039" style="position:absolute;left:1800;top:1440;width:8638;height:736;mso-width-percent:1000;mso-position-horizontal:center;mso-position-horizontal-relative:margin;mso-position-vertical:top;mso-position-vertical-relative:margin;mso-width-percent:1000;mso-width-relative:margin;mso-height-relative:margin" filled="f" stroked="f">
                   <v:textbox style="mso-next-textbox:#_x0000_s1039;mso-fit-shape-to-text:t">
                     <w:txbxContent>
                       <w:p>
@@ -708,19 +708,7 @@
                   <w:rPr>
                     <w:lang w:eastAsia="en-GB"/>
                   </w:rPr>
-                  <w:t>ALU_M</w:t>
-                </w:r>
-                <w:r>
-                  <w:rPr>
-                    <w:lang w:eastAsia="en-GB"/>
-                  </w:rPr>
-                  <w:t>O</w:t>
-                </w:r>
-                <w:r>
-                  <w:rPr>
-                    <w:lang w:eastAsia="en-GB"/>
-                  </w:rPr>
-                  <w:t>DE</w:t>
+                  <w:t>ALU_MODE</w:t>
                 </w:r>
                 <w:r>
                   <w:rPr>
@@ -967,13 +955,19 @@
                   <w:rPr>
                     <w:rFonts w:cstheme="minorHAnsi"/>
                   </w:rPr>
+                  <w:t xml:space="preserve">in </w:t>
+                </w:r>
+                <w:r>
+                  <w:rPr>
+                    <w:rFonts w:cstheme="minorHAnsi"/>
+                  </w:rPr>
                   <w:fldChar w:fldCharType="begin"/>
                 </w:r>
                 <w:r>
                   <w:rPr>
                     <w:rFonts w:cstheme="minorHAnsi"/>
                   </w:rPr>
-                  <w:instrText xml:space="preserve"> REF _Ref232850585 \r \h </w:instrText>
+                  <w:instrText xml:space="preserve"> REF _Ref233631401 \h </w:instrText>
                 </w:r>
                 <w:r>
                   <w:rPr>
@@ -987,10 +981,7 @@
                   <w:fldChar w:fldCharType="separate"/>
                 </w:r>
                 <w:r>
-                  <w:rPr>
-                    <w:rFonts w:cstheme="minorHAnsi"/>
-                  </w:rPr>
-                  <w:t>2.1.2</w:t>
+                  <w:t>Overview of the Data Bus</w:t>
                 </w:r>
                 <w:r>
                   <w:rPr>
@@ -1504,6 +1495,240 @@
                     <w:rFonts w:cstheme="minorHAnsi"/>
                   </w:rPr>
                   <w:t xml:space="preserve"> New section defining RAM ADDR Bus</w:t>
+                </w:r>
+              </w:p>
+            </w:tc>
+          </w:tr>
+          <w:tr>
+            <w:tc>
+              <w:tcPr>
+                <w:tcW w:w="1384" w:type="dxa"/>
+              </w:tcPr>
+              <w:p>
+                <w:pPr>
+                  <w:rPr>
+                    <w:rFonts w:cstheme="minorHAnsi"/>
+                  </w:rPr>
+                </w:pPr>
+                <w:r>
+                  <w:rPr>
+                    <w:rFonts w:cstheme="minorHAnsi"/>
+                  </w:rPr>
+                  <w:t>29 Jun 2026</w:t>
+                </w:r>
+              </w:p>
+            </w:tc>
+            <w:tc>
+              <w:tcPr>
+                <w:tcW w:w="7858" w:type="dxa"/>
+              </w:tcPr>
+              <w:p>
+                <w:pPr>
+                  <w:rPr>
+                    <w:rFonts w:cstheme="minorHAnsi"/>
+                  </w:rPr>
+                </w:pPr>
+                <w:r>
+                  <w:rPr>
+                    <w:rFonts w:cstheme="minorHAnsi"/>
+                  </w:rPr>
+                  <w:t>Added timing diagram for data bus transfers</w:t>
+                </w:r>
+                <w:r>
+                  <w:rPr>
+                    <w:rFonts w:cstheme="minorHAnsi"/>
+                  </w:rPr>
+                  <w:t xml:space="preserve"> </w:t>
+                </w:r>
+                <w:r>
+                  <w:rPr>
+                    <w:rFonts w:cstheme="minorHAnsi"/>
+                  </w:rPr>
+                  <w:fldChar w:fldCharType="begin"/>
+                </w:r>
+                <w:r>
+                  <w:rPr>
+                    <w:rFonts w:cstheme="minorHAnsi"/>
+                  </w:rPr>
+                  <w:instrText xml:space="preserve"> REF _Ref233626426 \h </w:instrText>
+                </w:r>
+                <w:r>
+                  <w:rPr>
+                    <w:rFonts w:cstheme="minorHAnsi"/>
+                  </w:rPr>
+                </w:r>
+                <w:r>
+                  <w:rPr>
+                    <w:rFonts w:cstheme="minorHAnsi"/>
+                  </w:rPr>
+                  <w:fldChar w:fldCharType="separate"/>
+                </w:r>
+                <w:r>
+                  <w:t xml:space="preserve">Figure </w:t>
+                </w:r>
+                <w:r>
+                  <w:rPr>
+                    <w:noProof/>
+                  </w:rPr>
+                  <w:t>2</w:t>
+                </w:r>
+                <w:r>
+                  <w:rPr>
+                    <w:rFonts w:cstheme="minorHAnsi"/>
+                  </w:rPr>
+                  <w:fldChar w:fldCharType="end"/>
+                </w:r>
+                <w:r>
+                  <w:rPr>
+                    <w:rFonts w:cstheme="minorHAnsi"/>
+                  </w:rPr>
+                  <w:t xml:space="preserve"> in </w:t>
+                </w:r>
+                <w:r>
+                  <w:rPr>
+                    <w:rFonts w:cstheme="minorHAnsi"/>
+                  </w:rPr>
+                  <w:fldChar w:fldCharType="begin"/>
+                </w:r>
+                <w:r>
+                  <w:rPr>
+                    <w:rFonts w:cstheme="minorHAnsi"/>
+                  </w:rPr>
+                  <w:instrText xml:space="preserve"> REF _Ref233631401 \r \h </w:instrText>
+                </w:r>
+                <w:r>
+                  <w:rPr>
+                    <w:rFonts w:cstheme="minorHAnsi"/>
+                  </w:rPr>
+                </w:r>
+                <w:r>
+                  <w:rPr>
+                    <w:rFonts w:cstheme="minorHAnsi"/>
+                  </w:rPr>
+                  <w:fldChar w:fldCharType="separate"/>
+                </w:r>
+                <w:r>
+                  <w:rPr>
+                    <w:rFonts w:cstheme="minorHAnsi"/>
+                  </w:rPr>
+                  <w:t>2.1</w:t>
+                </w:r>
+                <w:r>
+                  <w:rPr>
+                    <w:rFonts w:cstheme="minorHAnsi"/>
+                  </w:rPr>
+                  <w:fldChar w:fldCharType="end"/>
+                </w:r>
+              </w:p>
+              <w:p>
+                <w:pPr>
+                  <w:rPr>
+                    <w:rFonts w:cstheme="minorHAnsi"/>
+                  </w:rPr>
+                </w:pPr>
+                <w:r>
+                  <w:rPr>
+                    <w:rFonts w:cstheme="minorHAnsi"/>
+                  </w:rPr>
+                  <w:t xml:space="preserve">Added text below </w:t>
+                </w:r>
+                <w:r>
+                  <w:rPr>
+                    <w:rFonts w:cstheme="minorHAnsi"/>
+                  </w:rPr>
+                  <w:fldChar w:fldCharType="begin"/>
+                </w:r>
+                <w:r>
+                  <w:rPr>
+                    <w:rFonts w:cstheme="minorHAnsi"/>
+                  </w:rPr>
+                  <w:instrText xml:space="preserve"> REF _Ref233626426 \h </w:instrText>
+                </w:r>
+                <w:r>
+                  <w:rPr>
+                    <w:rFonts w:cstheme="minorHAnsi"/>
+                  </w:rPr>
+                </w:r>
+                <w:r>
+                  <w:rPr>
+                    <w:rFonts w:cstheme="minorHAnsi"/>
+                  </w:rPr>
+                  <w:fldChar w:fldCharType="separate"/>
+                </w:r>
+                <w:r>
+                  <w:t xml:space="preserve">Figure </w:t>
+                </w:r>
+                <w:r>
+                  <w:rPr>
+                    <w:noProof/>
+                  </w:rPr>
+                  <w:t>2</w:t>
+                </w:r>
+                <w:r>
+                  <w:rPr>
+                    <w:rFonts w:cstheme="minorHAnsi"/>
+                  </w:rPr>
+                  <w:fldChar w:fldCharType="end"/>
+                </w:r>
+                <w:r>
+                  <w:rPr>
+                    <w:rFonts w:cstheme="minorHAnsi"/>
+                  </w:rPr>
+                  <w:t xml:space="preserve"> to explain how transfers work</w:t>
+                </w:r>
+              </w:p>
+              <w:p>
+                <w:pPr>
+                  <w:rPr>
+                    <w:rFonts w:cstheme="minorHAnsi"/>
+                  </w:rPr>
+                </w:pPr>
+                <w:r>
+                  <w:rPr>
+                    <w:rFonts w:cstheme="minorHAnsi"/>
+                  </w:rPr>
+                  <w:t xml:space="preserve">Changed </w:t>
+                </w:r>
+                <w:r>
+                  <w:rPr>
+                    <w:rFonts w:cstheme="minorHAnsi"/>
+                  </w:rPr>
+                  <w:fldChar w:fldCharType="begin"/>
+                </w:r>
+                <w:r>
+                  <w:rPr>
+                    <w:rFonts w:cstheme="minorHAnsi"/>
+                  </w:rPr>
+                  <w:instrText xml:space="preserve"> REF _Ref232850548 \r \h </w:instrText>
+                </w:r>
+                <w:r>
+                  <w:rPr>
+                    <w:rFonts w:cstheme="minorHAnsi"/>
+                  </w:rPr>
+                </w:r>
+                <w:r>
+                  <w:rPr>
+                    <w:rFonts w:cstheme="minorHAnsi"/>
+                  </w:rPr>
+                  <w:fldChar w:fldCharType="separate"/>
+                </w:r>
+                <w:r>
+                  <w:rPr>
+                    <w:rFonts w:cstheme="minorHAnsi"/>
+                  </w:rPr>
+                  <w:t>2.1.1</w:t>
+                </w:r>
+                <w:r>
+                  <w:rPr>
+                    <w:rFonts w:cstheme="minorHAnsi"/>
+                  </w:rPr>
+                  <w:fldChar w:fldCharType="end"/>
+                </w:r>
+                <w:r>
+                  <w:rPr>
+                    <w:rFonts w:cstheme="minorHAnsi"/>
+                  </w:rPr>
+                  <w:t xml:space="preserve"> to define how to use a level enabled latch as well as the (already defined) method for using an edge triggered latch</w:t>
                 </w:r>
               </w:p>
             </w:tc>
@@ -1578,7 +1803,7 @@
           <w:r>
             <w:fldChar w:fldCharType="separate"/>
           </w:r>
-          <w:hyperlink w:anchor="_Toc233191853" w:history="1">
+          <w:hyperlink w:anchor="_Toc233631539" w:history="1">
             <w:r>
               <w:rPr>
                 <w:rStyle w:val="Hyperlink"/>
@@ -1624,7 +1849,7 @@
                 <w:noProof/>
                 <w:webHidden/>
               </w:rPr>
-              <w:instrText xml:space="preserve"> PAGEREF _Toc233191853 \h </w:instrText>
+              <w:instrText xml:space="preserve"> PAGEREF _Toc233631539 \h </w:instrText>
             </w:r>
             <w:r>
               <w:rPr>
@@ -1668,7 +1893,7 @@
               <w:lang w:eastAsia="en-GB"/>
             </w:rPr>
           </w:pPr>
-          <w:hyperlink w:anchor="_Toc233191854" w:history="1">
+          <w:hyperlink w:anchor="_Toc233631540" w:history="1">
             <w:r>
               <w:rPr>
                 <w:rStyle w:val="Hyperlink"/>
@@ -1712,7 +1937,7 @@
                 <w:noProof/>
                 <w:webHidden/>
               </w:rPr>
-              <w:instrText xml:space="preserve"> PAGEREF _Toc233191854 \h </w:instrText>
+              <w:instrText xml:space="preserve"> PAGEREF _Toc233631540 \h </w:instrText>
             </w:r>
             <w:r>
               <w:rPr>
@@ -1756,7 +1981,7 @@
               <w:lang w:eastAsia="en-GB"/>
             </w:rPr>
           </w:pPr>
-          <w:hyperlink w:anchor="_Toc233191855" w:history="1">
+          <w:hyperlink w:anchor="_Toc233631541" w:history="1">
             <w:r>
               <w:rPr>
                 <w:rStyle w:val="Hyperlink"/>
@@ -1798,7 +2023,7 @@
                 <w:noProof/>
                 <w:webHidden/>
               </w:rPr>
-              <w:instrText xml:space="preserve"> PAGEREF _Toc233191855 \h </w:instrText>
+              <w:instrText xml:space="preserve"> PAGEREF _Toc233631541 \h </w:instrText>
             </w:r>
             <w:r>
               <w:rPr>
@@ -1842,7 +2067,7 @@
               <w:lang w:eastAsia="en-GB"/>
             </w:rPr>
           </w:pPr>
-          <w:hyperlink w:anchor="_Toc233191856" w:history="1">
+          <w:hyperlink w:anchor="_Toc233631542" w:history="1">
             <w:r>
               <w:rPr>
                 <w:rStyle w:val="Hyperlink"/>
@@ -1884,7 +2109,7 @@
                 <w:noProof/>
                 <w:webHidden/>
               </w:rPr>
-              <w:instrText xml:space="preserve"> PAGEREF _Toc233191856 \h </w:instrText>
+              <w:instrText xml:space="preserve"> PAGEREF _Toc233631542 \h </w:instrText>
             </w:r>
             <w:r>
               <w:rPr>
@@ -1904,7 +2129,7 @@
                 <w:noProof/>
                 <w:webHidden/>
               </w:rPr>
-              <w:t>2</w:t>
+              <w:t>3</w:t>
             </w:r>
             <w:r>
               <w:rPr>
@@ -1928,7 +2153,7 @@
               <w:lang w:eastAsia="en-GB"/>
             </w:rPr>
           </w:pPr>
-          <w:hyperlink w:anchor="_Toc233191857" w:history="1">
+          <w:hyperlink w:anchor="_Toc233631543" w:history="1">
             <w:r>
               <w:rPr>
                 <w:rStyle w:val="Hyperlink"/>
@@ -1970,7 +2195,7 @@
                 <w:noProof/>
                 <w:webHidden/>
               </w:rPr>
-              <w:instrText xml:space="preserve"> PAGEREF _Toc233191857 \h </w:instrText>
+              <w:instrText xml:space="preserve"> PAGEREF _Toc233631543 \h </w:instrText>
             </w:r>
             <w:r>
               <w:rPr>
@@ -1990,7 +2215,7 @@
                 <w:noProof/>
                 <w:webHidden/>
               </w:rPr>
-              <w:t>2</w:t>
+              <w:t>4</w:t>
             </w:r>
             <w:r>
               <w:rPr>
@@ -2014,7 +2239,7 @@
               <w:lang w:eastAsia="en-GB"/>
             </w:rPr>
           </w:pPr>
-          <w:hyperlink w:anchor="_Toc233191858" w:history="1">
+          <w:hyperlink w:anchor="_Toc233631544" w:history="1">
             <w:r>
               <w:rPr>
                 <w:rStyle w:val="Hyperlink"/>
@@ -2056,7 +2281,7 @@
                 <w:noProof/>
                 <w:webHidden/>
               </w:rPr>
-              <w:instrText xml:space="preserve"> PAGEREF _Toc233191858 \h </w:instrText>
+              <w:instrText xml:space="preserve"> PAGEREF _Toc233631544 \h </w:instrText>
             </w:r>
             <w:r>
               <w:rPr>
@@ -2076,7 +2301,7 @@
                 <w:noProof/>
                 <w:webHidden/>
               </w:rPr>
-              <w:t>3</w:t>
+              <w:t>5</w:t>
             </w:r>
             <w:r>
               <w:rPr>
@@ -2100,7 +2325,7 @@
               <w:lang w:eastAsia="en-GB"/>
             </w:rPr>
           </w:pPr>
-          <w:hyperlink w:anchor="_Toc233191859" w:history="1">
+          <w:hyperlink w:anchor="_Toc233631545" w:history="1">
             <w:r>
               <w:rPr>
                 <w:rStyle w:val="Hyperlink"/>
@@ -2142,7 +2367,7 @@
                 <w:noProof/>
                 <w:webHidden/>
               </w:rPr>
-              <w:instrText xml:space="preserve"> PAGEREF _Toc233191859 \h </w:instrText>
+              <w:instrText xml:space="preserve"> PAGEREF _Toc233631545 \h </w:instrText>
             </w:r>
             <w:r>
               <w:rPr>
@@ -2162,7 +2387,7 @@
                 <w:noProof/>
                 <w:webHidden/>
               </w:rPr>
-              <w:t>3</w:t>
+              <w:t>5</w:t>
             </w:r>
             <w:r>
               <w:rPr>
@@ -2186,7 +2411,7 @@
               <w:lang w:eastAsia="en-GB"/>
             </w:rPr>
           </w:pPr>
-          <w:hyperlink w:anchor="_Toc233191860" w:history="1">
+          <w:hyperlink w:anchor="_Toc233631546" w:history="1">
             <w:r>
               <w:rPr>
                 <w:rStyle w:val="Hyperlink"/>
@@ -2230,7 +2455,7 @@
                 <w:noProof/>
                 <w:webHidden/>
               </w:rPr>
-              <w:instrText xml:space="preserve"> PAGEREF _Toc233191860 \h </w:instrText>
+              <w:instrText xml:space="preserve"> PAGEREF _Toc233631546 \h </w:instrText>
             </w:r>
             <w:r>
               <w:rPr>
@@ -2250,7 +2475,7 @@
                 <w:noProof/>
                 <w:webHidden/>
               </w:rPr>
-              <w:t>3</w:t>
+              <w:t>5</w:t>
             </w:r>
             <w:r>
               <w:rPr>
@@ -2274,7 +2499,7 @@
               <w:lang w:eastAsia="en-GB"/>
             </w:rPr>
           </w:pPr>
-          <w:hyperlink w:anchor="_Toc233191861" w:history="1">
+          <w:hyperlink w:anchor="_Toc233631547" w:history="1">
             <w:r>
               <w:rPr>
                 <w:rStyle w:val="Hyperlink"/>
@@ -2318,7 +2543,7 @@
                 <w:noProof/>
                 <w:webHidden/>
               </w:rPr>
-              <w:instrText xml:space="preserve"> PAGEREF _Toc233191861 \h </w:instrText>
+              <w:instrText xml:space="preserve"> PAGEREF _Toc233631547 \h </w:instrText>
             </w:r>
             <w:r>
               <w:rPr>
@@ -2338,7 +2563,7 @@
                 <w:noProof/>
                 <w:webHidden/>
               </w:rPr>
-              <w:t>3</w:t>
+              <w:t>5</w:t>
             </w:r>
             <w:r>
               <w:rPr>
@@ -2362,7 +2587,7 @@
               <w:lang w:eastAsia="en-GB"/>
             </w:rPr>
           </w:pPr>
-          <w:hyperlink w:anchor="_Toc233191862" w:history="1">
+          <w:hyperlink w:anchor="_Toc233631548" w:history="1">
             <w:r>
               <w:rPr>
                 <w:rStyle w:val="Hyperlink"/>
@@ -2406,7 +2631,7 @@
                 <w:noProof/>
                 <w:webHidden/>
               </w:rPr>
-              <w:instrText xml:space="preserve"> PAGEREF _Toc233191862 \h </w:instrText>
+              <w:instrText xml:space="preserve"> PAGEREF _Toc233631548 \h </w:instrText>
             </w:r>
             <w:r>
               <w:rPr>
@@ -2426,7 +2651,7 @@
                 <w:noProof/>
                 <w:webHidden/>
               </w:rPr>
-              <w:t>3</w:t>
+              <w:t>5</w:t>
             </w:r>
             <w:r>
               <w:rPr>
@@ -2450,7 +2675,7 @@
               <w:lang w:eastAsia="en-GB"/>
             </w:rPr>
           </w:pPr>
-          <w:hyperlink w:anchor="_Toc233191863" w:history="1">
+          <w:hyperlink w:anchor="_Toc233631549" w:history="1">
             <w:r>
               <w:rPr>
                 <w:rStyle w:val="Hyperlink"/>
@@ -2494,7 +2719,7 @@
                 <w:noProof/>
                 <w:webHidden/>
               </w:rPr>
-              <w:instrText xml:space="preserve"> PAGEREF _Toc233191863 \h </w:instrText>
+              <w:instrText xml:space="preserve"> PAGEREF _Toc233631549 \h </w:instrText>
             </w:r>
             <w:r>
               <w:rPr>
@@ -2514,7 +2739,7 @@
                 <w:noProof/>
                 <w:webHidden/>
               </w:rPr>
-              <w:t>4</w:t>
+              <w:t>6</w:t>
             </w:r>
             <w:r>
               <w:rPr>
@@ -2538,7 +2763,7 @@
               <w:lang w:eastAsia="en-GB"/>
             </w:rPr>
           </w:pPr>
-          <w:hyperlink w:anchor="_Toc233191864" w:history="1">
+          <w:hyperlink w:anchor="_Toc233631550" w:history="1">
             <w:r>
               <w:rPr>
                 <w:rStyle w:val="Hyperlink"/>
@@ -2582,7 +2807,7 @@
                 <w:noProof/>
                 <w:webHidden/>
               </w:rPr>
-              <w:instrText xml:space="preserve"> PAGEREF _Toc233191864 \h </w:instrText>
+              <w:instrText xml:space="preserve"> PAGEREF _Toc233631550 \h </w:instrText>
             </w:r>
             <w:r>
               <w:rPr>
@@ -2602,7 +2827,7 @@
                 <w:noProof/>
                 <w:webHidden/>
               </w:rPr>
-              <w:t>4</w:t>
+              <w:t>6</w:t>
             </w:r>
             <w:r>
               <w:rPr>
@@ -2626,7 +2851,7 @@
               <w:lang w:eastAsia="en-GB"/>
             </w:rPr>
           </w:pPr>
-          <w:hyperlink w:anchor="_Toc233191865" w:history="1">
+          <w:hyperlink w:anchor="_Toc233631551" w:history="1">
             <w:r>
               <w:rPr>
                 <w:rStyle w:val="Hyperlink"/>
@@ -2670,7 +2895,7 @@
                 <w:noProof/>
                 <w:webHidden/>
               </w:rPr>
-              <w:instrText xml:space="preserve"> PAGEREF _Toc233191865 \h </w:instrText>
+              <w:instrText xml:space="preserve"> PAGEREF _Toc233631551 \h </w:instrText>
             </w:r>
             <w:r>
               <w:rPr>
@@ -2690,7 +2915,7 @@
                 <w:noProof/>
                 <w:webHidden/>
               </w:rPr>
-              <w:t>5</w:t>
+              <w:t>7</w:t>
             </w:r>
             <w:r>
               <w:rPr>
@@ -2714,7 +2939,7 @@
               <w:lang w:eastAsia="en-GB"/>
             </w:rPr>
           </w:pPr>
-          <w:hyperlink w:anchor="_Toc233191866" w:history="1">
+          <w:hyperlink w:anchor="_Toc233631552" w:history="1">
             <w:r>
               <w:rPr>
                 <w:rStyle w:val="Hyperlink"/>
@@ -2758,7 +2983,7 @@
                 <w:noProof/>
                 <w:webHidden/>
               </w:rPr>
-              <w:instrText xml:space="preserve"> PAGEREF _Toc233191866 \h </w:instrText>
+              <w:instrText xml:space="preserve"> PAGEREF _Toc233631552 \h </w:instrText>
             </w:r>
             <w:r>
               <w:rPr>
@@ -2778,7 +3003,7 @@
                 <w:noProof/>
                 <w:webHidden/>
               </w:rPr>
-              <w:t>6</w:t>
+              <w:t>8</w:t>
             </w:r>
             <w:r>
               <w:rPr>
@@ -2802,7 +3027,7 @@
               <w:lang w:eastAsia="en-GB"/>
             </w:rPr>
           </w:pPr>
-          <w:hyperlink w:anchor="_Toc233191867" w:history="1">
+          <w:hyperlink w:anchor="_Toc233631553" w:history="1">
             <w:r>
               <w:rPr>
                 <w:rStyle w:val="Hyperlink"/>
@@ -2846,7 +3071,7 @@
                 <w:noProof/>
                 <w:webHidden/>
               </w:rPr>
-              <w:instrText xml:space="preserve"> PAGEREF _Toc233191867 \h </w:instrText>
+              <w:instrText xml:space="preserve"> PAGEREF _Toc233631553 \h </w:instrText>
             </w:r>
             <w:r>
               <w:rPr>
@@ -2866,7 +3091,7 @@
                 <w:noProof/>
                 <w:webHidden/>
               </w:rPr>
-              <w:t>6</w:t>
+              <w:t>8</w:t>
             </w:r>
             <w:r>
               <w:rPr>
@@ -2890,7 +3115,7 @@
               <w:lang w:eastAsia="en-GB"/>
             </w:rPr>
           </w:pPr>
-          <w:hyperlink w:anchor="_Toc233191868" w:history="1">
+          <w:hyperlink w:anchor="_Toc233631554" w:history="1">
             <w:r>
               <w:rPr>
                 <w:rStyle w:val="Hyperlink"/>
@@ -2934,7 +3159,7 @@
                 <w:noProof/>
                 <w:webHidden/>
               </w:rPr>
-              <w:instrText xml:space="preserve"> PAGEREF _Toc233191868 \h </w:instrText>
+              <w:instrText xml:space="preserve"> PAGEREF _Toc233631554 \h </w:instrText>
             </w:r>
             <w:r>
               <w:rPr>
@@ -2954,7 +3179,7 @@
                 <w:noProof/>
                 <w:webHidden/>
               </w:rPr>
-              <w:t>7</w:t>
+              <w:t>9</w:t>
             </w:r>
             <w:r>
               <w:rPr>
@@ -2978,7 +3203,7 @@
               <w:lang w:eastAsia="en-GB"/>
             </w:rPr>
           </w:pPr>
-          <w:hyperlink w:anchor="_Toc233191869" w:history="1">
+          <w:hyperlink w:anchor="_Toc233631555" w:history="1">
             <w:r>
               <w:rPr>
                 <w:rStyle w:val="Hyperlink"/>
@@ -3022,7 +3247,7 @@
                 <w:noProof/>
                 <w:webHidden/>
               </w:rPr>
-              <w:instrText xml:space="preserve"> PAGEREF _Toc233191869 \h </w:instrText>
+              <w:instrText xml:space="preserve"> PAGEREF _Toc233631555 \h </w:instrText>
             </w:r>
             <w:r>
               <w:rPr>
@@ -3042,7 +3267,7 @@
                 <w:noProof/>
                 <w:webHidden/>
               </w:rPr>
-              <w:t>8</w:t>
+              <w:t>10</w:t>
             </w:r>
             <w:r>
               <w:rPr>
@@ -3066,7 +3291,7 @@
               <w:lang w:eastAsia="en-GB"/>
             </w:rPr>
           </w:pPr>
-          <w:hyperlink w:anchor="_Toc233191870" w:history="1">
+          <w:hyperlink w:anchor="_Toc233631556" w:history="1">
             <w:r>
               <w:rPr>
                 <w:rStyle w:val="Hyperlink"/>
@@ -3110,7 +3335,7 @@
                 <w:noProof/>
                 <w:webHidden/>
               </w:rPr>
-              <w:instrText xml:space="preserve"> PAGEREF _Toc233191870 \h </w:instrText>
+              <w:instrText xml:space="preserve"> PAGEREF _Toc233631556 \h </w:instrText>
             </w:r>
             <w:r>
               <w:rPr>
@@ -3130,7 +3355,7 @@
                 <w:noProof/>
                 <w:webHidden/>
               </w:rPr>
-              <w:t>8</w:t>
+              <w:t>10</w:t>
             </w:r>
             <w:r>
               <w:rPr>
@@ -3154,7 +3379,7 @@
               <w:lang w:eastAsia="en-GB"/>
             </w:rPr>
           </w:pPr>
-          <w:hyperlink w:anchor="_Toc233191871" w:history="1">
+          <w:hyperlink w:anchor="_Toc233631557" w:history="1">
             <w:r>
               <w:rPr>
                 <w:rStyle w:val="Hyperlink"/>
@@ -3198,7 +3423,7 @@
                 <w:noProof/>
                 <w:webHidden/>
               </w:rPr>
-              <w:instrText xml:space="preserve"> PAGEREF _Toc233191871 \h </w:instrText>
+              <w:instrText xml:space="preserve"> PAGEREF _Toc233631557 \h </w:instrText>
             </w:r>
             <w:r>
               <w:rPr>
@@ -3218,7 +3443,7 @@
                 <w:noProof/>
                 <w:webHidden/>
               </w:rPr>
-              <w:t>8</w:t>
+              <w:t>10</w:t>
             </w:r>
             <w:r>
               <w:rPr>
@@ -3242,7 +3467,7 @@
               <w:lang w:eastAsia="en-GB"/>
             </w:rPr>
           </w:pPr>
-          <w:hyperlink w:anchor="_Toc233191872" w:history="1">
+          <w:hyperlink w:anchor="_Toc233631558" w:history="1">
             <w:r>
               <w:rPr>
                 <w:rStyle w:val="Hyperlink"/>
@@ -3286,7 +3511,7 @@
                 <w:noProof/>
                 <w:webHidden/>
               </w:rPr>
-              <w:instrText xml:space="preserve"> PAGEREF _Toc233191872 \h </w:instrText>
+              <w:instrText xml:space="preserve"> PAGEREF _Toc233631558 \h </w:instrText>
             </w:r>
             <w:r>
               <w:rPr>
@@ -3306,7 +3531,7 @@
                 <w:noProof/>
                 <w:webHidden/>
               </w:rPr>
-              <w:t>10</w:t>
+              <w:t>12</w:t>
             </w:r>
             <w:r>
               <w:rPr>
@@ -3395,7 +3620,7 @@
         </w:rPr>
         <w:fldChar w:fldCharType="separate"/>
       </w:r>
-      <w:hyperlink w:anchor="_Toc233191873" w:history="1">
+      <w:hyperlink w:anchor="_Toc233631559" w:history="1">
         <w:r>
           <w:rPr>
             <w:rStyle w:val="Hyperlink"/>
@@ -3422,7 +3647,7 @@
             <w:noProof/>
             <w:webHidden/>
           </w:rPr>
-          <w:instrText xml:space="preserve"> PAGEREF _Toc233191873 \h </w:instrText>
+          <w:instrText xml:space="preserve"> PAGEREF _Toc233631559 \h </w:instrText>
         </w:r>
         <w:r>
           <w:rPr>
@@ -3455,6 +3680,76 @@
     </w:p>
     <w:p>
       <w:pPr>
+        <w:pStyle w:val="TableofFigures"/>
+        <w:tabs>
+          <w:tab w:val="right" w:leader="dot" w:pos="9016"/>
+        </w:tabs>
+        <w:rPr>
+          <w:rFonts w:eastAsiaTheme="minorEastAsia"/>
+          <w:noProof/>
+          <w:lang w:eastAsia="en-GB"/>
+        </w:rPr>
+      </w:pPr>
+      <w:hyperlink w:anchor="_Toc233631560" w:history="1">
+        <w:r>
+          <w:rPr>
+            <w:rStyle w:val="Hyperlink"/>
+            <w:noProof/>
+          </w:rPr>
+          <w:t>Figure 2:   Data Bus Transfer Timing Diagram</w:t>
+        </w:r>
+        <w:r>
+          <w:rPr>
+            <w:noProof/>
+            <w:webHidden/>
+          </w:rPr>
+          <w:tab/>
+        </w:r>
+        <w:r>
+          <w:rPr>
+            <w:noProof/>
+            <w:webHidden/>
+          </w:rPr>
+          <w:fldChar w:fldCharType="begin"/>
+        </w:r>
+        <w:r>
+          <w:rPr>
+            <w:noProof/>
+            <w:webHidden/>
+          </w:rPr>
+          <w:instrText xml:space="preserve"> PAGEREF _Toc233631560 \h </w:instrText>
+        </w:r>
+        <w:r>
+          <w:rPr>
+            <w:noProof/>
+            <w:webHidden/>
+          </w:rPr>
+        </w:r>
+        <w:r>
+          <w:rPr>
+            <w:noProof/>
+            <w:webHidden/>
+          </w:rPr>
+          <w:fldChar w:fldCharType="separate"/>
+        </w:r>
+        <w:r>
+          <w:rPr>
+            <w:noProof/>
+            <w:webHidden/>
+          </w:rPr>
+          <w:t>2</w:t>
+        </w:r>
+        <w:r>
+          <w:rPr>
+            <w:noProof/>
+            <w:webHidden/>
+          </w:rPr>
+          <w:fldChar w:fldCharType="end"/>
+        </w:r>
+      </w:hyperlink>
+    </w:p>
+    <w:p>
+      <w:pPr>
         <w:rPr>
           <w:rFonts w:eastAsia="Times New Roman"/>
           <w:lang w:eastAsia="en-GB"/>
@@ -3502,7 +3797,7 @@
           <w:lang w:eastAsia="en-GB"/>
         </w:rPr>
       </w:pPr>
-      <w:bookmarkStart w:id="2" w:name="_Toc233191853"/>
+      <w:bookmarkStart w:id="2" w:name="_Toc233631539"/>
       <w:bookmarkEnd w:id="1"/>
       <w:r>
         <w:rPr>
@@ -3553,7 +3848,7 @@
           <w:lang w:eastAsia="en-GB"/>
         </w:rPr>
       </w:pPr>
-      <w:bookmarkStart w:id="3" w:name="_Toc233191854"/>
+      <w:bookmarkStart w:id="3" w:name="_Toc233631540"/>
       <w:r>
         <w:rPr>
           <w:lang w:eastAsia="en-GB"/>
@@ -3694,7 +3989,7 @@
         <w:jc w:val="center"/>
       </w:pPr>
       <w:bookmarkStart w:id="4" w:name="_Ref232073454"/>
-      <w:bookmarkStart w:id="5" w:name="_Toc233191873"/>
+      <w:bookmarkStart w:id="5" w:name="_Toc233631559"/>
       <w:r>
         <w:t xml:space="preserve">Figure </w:t>
       </w:r>
@@ -4113,7 +4408,8 @@
       <w:pPr>
         <w:pStyle w:val="Heading2"/>
       </w:pPr>
-      <w:bookmarkStart w:id="6" w:name="_Toc233191855"/>
+      <w:bookmarkStart w:id="6" w:name="_Ref233631401"/>
+      <w:bookmarkStart w:id="7" w:name="_Toc233631541"/>
       <w:r>
         <w:lastRenderedPageBreak/>
         <w:t xml:space="preserve">Overview of </w:t>
@@ -4125,6 +4421,7 @@
         <w:t>Data Bus</w:t>
       </w:r>
       <w:bookmarkEnd w:id="6"/>
+      <w:bookmarkEnd w:id="7"/>
     </w:p>
     <w:p>
       <w:r>
@@ -4159,11 +4456,428 @@
       </w:r>
     </w:p>
     <w:p>
+      <w:r>
+        <w:t xml:space="preserve">The timing diagram for data bus transfers is shown in </w:t>
+      </w:r>
+      <w:r>
+        <w:fldChar w:fldCharType="begin"/>
+      </w:r>
+      <w:r>
+        <w:instrText xml:space="preserve"> REF _Ref233626426 \h </w:instrText>
+      </w:r>
+      <w:r>
+        <w:fldChar w:fldCharType="separate"/>
+      </w:r>
+      <w:r>
+        <w:t xml:space="preserve">Figure </w:t>
+      </w:r>
+      <w:r>
+        <w:rPr>
+          <w:noProof/>
+        </w:rPr>
+        <w:t>2</w:t>
+      </w:r>
+      <w:r>
+        <w:fldChar w:fldCharType="end"/>
+      </w:r>
+      <w:r>
+        <w:t>.</w:t>
+      </w:r>
+    </w:p>
+    <w:p>
+      <w:pPr>
+        <w:keepNext/>
+        <w:jc w:val="center"/>
+      </w:pPr>
+      <w:r>
+        <w:rPr>
+          <w:noProof/>
+          <w:lang w:eastAsia="en-GB"/>
+        </w:rPr>
+        <w:drawing>
+          <wp:inline distT="0" distB="0" distL="0" distR="0">
+            <wp:extent cx="4362450" cy="2716530"/>
+            <wp:effectExtent l="19050" t="0" r="0" b="0"/>
+            <wp:docPr id="4" name="Picture 4"/>
+            <wp:cNvGraphicFramePr>
+              <a:graphicFrameLocks xmlns:a="http://schemas.openxmlformats.org/drawingml/2006/main" noChangeAspect="1"/>
+            </wp:cNvGraphicFramePr>
+            <a:graphic xmlns:a="http://schemas.openxmlformats.org/drawingml/2006/main">
+              <a:graphicData uri="http://schemas.openxmlformats.org/drawingml/2006/picture">
+                <pic:pic xmlns:pic="http://schemas.openxmlformats.org/drawingml/2006/picture">
+                  <pic:nvPicPr>
+                    <pic:cNvPr id="0" name="Picture 4"/>
+                    <pic:cNvPicPr>
+                      <a:picLocks noChangeAspect="1" noChangeArrowheads="1"/>
+                    </pic:cNvPicPr>
+                  </pic:nvPicPr>
+                  <pic:blipFill>
+                    <a:blip r:embed="rId16" cstate="print"/>
+                    <a:srcRect/>
+                    <a:stretch>
+                      <a:fillRect/>
+                    </a:stretch>
+                  </pic:blipFill>
+                  <pic:spPr bwMode="auto">
+                    <a:xfrm>
+                      <a:off x="0" y="0"/>
+                      <a:ext cx="4362450" cy="2716530"/>
+                    </a:xfrm>
+                    <a:prstGeom prst="rect">
+                      <a:avLst/>
+                    </a:prstGeom>
+                    <a:noFill/>
+                    <a:ln w="9525">
+                      <a:noFill/>
+                      <a:miter lim="800000"/>
+                      <a:headEnd/>
+                      <a:tailEnd/>
+                    </a:ln>
+                  </pic:spPr>
+                </pic:pic>
+              </a:graphicData>
+            </a:graphic>
+          </wp:inline>
+        </w:drawing>
+      </w:r>
+    </w:p>
+    <w:p>
+      <w:pPr>
+        <w:pStyle w:val="Caption"/>
+        <w:jc w:val="center"/>
+      </w:pPr>
+      <w:bookmarkStart w:id="8" w:name="_Ref233626426"/>
+      <w:bookmarkStart w:id="9" w:name="_Toc233631560"/>
+      <w:r>
+        <w:t xml:space="preserve">Figure </w:t>
+      </w:r>
+      <w:fldSimple w:instr=" SEQ Figure \* ARABIC ">
+        <w:r>
+          <w:rPr>
+            <w:noProof/>
+          </w:rPr>
+          <w:t>2</w:t>
+        </w:r>
+      </w:fldSimple>
+      <w:bookmarkEnd w:id="8"/>
+      <w:r>
+        <w:t>:   Data Bus Transfer Timing Diagram</w:t>
+      </w:r>
+      <w:bookmarkEnd w:id="9"/>
+    </w:p>
+    <w:p>
+      <w:r>
+        <w:t xml:space="preserve">In the following text: “signals” are all the named signals in </w:t>
+      </w:r>
+      <w:r>
+        <w:fldChar w:fldCharType="begin"/>
+      </w:r>
+      <w:r>
+        <w:instrText xml:space="preserve"> REF _Ref233626426 \h </w:instrText>
+      </w:r>
+      <w:r>
+        <w:fldChar w:fldCharType="separate"/>
+      </w:r>
+      <w:r>
+        <w:t xml:space="preserve">Figure </w:t>
+      </w:r>
+      <w:r>
+        <w:rPr>
+          <w:noProof/>
+        </w:rPr>
+        <w:t>2</w:t>
+      </w:r>
+      <w:r>
+        <w:fldChar w:fldCharType="end"/>
+      </w:r>
+      <w:r>
+        <w:t xml:space="preserve"> excluding CLOCK.</w:t>
+      </w:r>
+    </w:p>
+    <w:p>
+      <w:r>
+        <w:t xml:space="preserve">The signals shown in </w:t>
+      </w:r>
+      <w:r>
+        <w:fldChar w:fldCharType="begin"/>
+      </w:r>
+      <w:r>
+        <w:instrText xml:space="preserve"> REF _Ref233626426 \h </w:instrText>
+      </w:r>
+      <w:r>
+        <w:fldChar w:fldCharType="separate"/>
+      </w:r>
+      <w:r>
+        <w:t xml:space="preserve">Figure </w:t>
+      </w:r>
+      <w:r>
+        <w:rPr>
+          <w:noProof/>
+        </w:rPr>
+        <w:t>2</w:t>
+      </w:r>
+      <w:r>
+        <w:fldChar w:fldCharType="end"/>
+      </w:r>
+      <w:r>
+        <w:t xml:space="preserve"> are all set to the required state a short time after the rising edge </w:t>
+      </w:r>
+      <w:r>
+        <w:t>of CLOCK</w:t>
+      </w:r>
+      <w:r>
+        <w:t xml:space="preserve">. “Rising edge” means when </w:t>
+      </w:r>
+      <w:r>
+        <w:t>CLOCK</w:t>
+      </w:r>
+      <w:r>
+        <w:t xml:space="preserve"> changes from low to high.</w:t>
+      </w:r>
+    </w:p>
+    <w:p>
+      <w:r>
+        <w:rPr>
+          <w:b/>
+        </w:rPr>
+        <w:t>T0</w:t>
+      </w:r>
+      <w:r>
+        <w:t xml:space="preserve"> is the initial state. </w:t>
+      </w:r>
+    </w:p>
+    <w:p>
+      <w:pPr>
+        <w:pStyle w:val="ListParagraph"/>
+        <w:numPr>
+          <w:ilvl w:val="0"/>
+          <w:numId w:val="28"/>
+        </w:numPr>
+      </w:pPr>
+      <w:r>
+        <w:t xml:space="preserve">WRITE, READ and </w:t>
+      </w:r>
+      <w:r>
+        <w:t>all</w:t>
+      </w:r>
+      <w:r>
+        <w:t xml:space="preserve"> SELECTs are all low. The data bus is floating.</w:t>
+      </w:r>
+    </w:p>
+    <w:p>
+      <w:r>
+        <w:rPr>
+          <w:b/>
+        </w:rPr>
+        <w:t>T1</w:t>
+      </w:r>
+      <w:r>
+        <w:t xml:space="preserve"> is the start of the data bus transfer</w:t>
+      </w:r>
+    </w:p>
+    <w:p>
+      <w:pPr>
+        <w:pStyle w:val="ListParagraph"/>
+        <w:numPr>
+          <w:ilvl w:val="0"/>
+          <w:numId w:val="28"/>
+        </w:numPr>
+      </w:pPr>
+      <w:r>
+        <w:t>WRITE and SELECT &lt;SOURCE&gt; go high a short time after the rising edge of T1 CLOCK.</w:t>
+      </w:r>
+    </w:p>
+    <w:p>
+      <w:pPr>
+        <w:pStyle w:val="ListParagraph"/>
+        <w:numPr>
+          <w:ilvl w:val="0"/>
+          <w:numId w:val="28"/>
+        </w:numPr>
+      </w:pPr>
+      <w:r>
+        <w:t xml:space="preserve">DBUS becomes valid a short time after WRITE and SELECT &lt;SOURCE&gt; go high. </w:t>
+      </w:r>
+    </w:p>
+    <w:p>
+      <w:r>
+        <w:rPr>
+          <w:b/>
+        </w:rPr>
+        <w:t>T2</w:t>
+      </w:r>
+      <w:r>
+        <w:t xml:space="preserve"> is the end of the data bus transfer</w:t>
+      </w:r>
+    </w:p>
+    <w:p>
+      <w:pPr>
+        <w:pStyle w:val="ListParagraph"/>
+        <w:numPr>
+          <w:ilvl w:val="0"/>
+          <w:numId w:val="29"/>
+        </w:numPr>
+      </w:pPr>
+      <w:r>
+        <w:t>DBUS is valid at the start of T2</w:t>
+      </w:r>
+    </w:p>
+    <w:p>
+      <w:pPr>
+        <w:pStyle w:val="ListParagraph"/>
+        <w:numPr>
+          <w:ilvl w:val="0"/>
+          <w:numId w:val="29"/>
+        </w:numPr>
+      </w:pPr>
+      <w:r>
+        <w:t xml:space="preserve">READ and SELECT &lt;DESTINATION&gt; </w:t>
+      </w:r>
+      <w:r>
+        <w:t>go high a short time after the rising edge of T2 CLOCK.</w:t>
+      </w:r>
+    </w:p>
+    <w:p>
+      <w:pPr>
+        <w:pStyle w:val="ListParagraph"/>
+        <w:numPr>
+          <w:ilvl w:val="0"/>
+          <w:numId w:val="29"/>
+        </w:numPr>
+      </w:pPr>
+      <w:r>
+        <w:t>The selected destination should read the value from DBUS on the rising edge of (READ AND SELECT &lt;DESTINATION&gt;)</w:t>
+      </w:r>
+    </w:p>
+    <w:p>
+      <w:r>
+        <w:rPr>
+          <w:b/>
+        </w:rPr>
+        <w:t>T3</w:t>
+      </w:r>
+      <w:r>
+        <w:t xml:space="preserve"> returns to the initial state</w:t>
+      </w:r>
+    </w:p>
+    <w:p>
+      <w:pPr>
+        <w:pStyle w:val="ListParagraph"/>
+        <w:numPr>
+          <w:ilvl w:val="0"/>
+          <w:numId w:val="30"/>
+        </w:numPr>
+      </w:pPr>
+      <w:r>
+        <w:t>WRITE, READ and all SELECTs go low a short time after the rising edge of T3 CLOCK</w:t>
+      </w:r>
+    </w:p>
+    <w:p>
+      <w:pPr>
+        <w:pStyle w:val="ListParagraph"/>
+        <w:numPr>
+          <w:ilvl w:val="0"/>
+          <w:numId w:val="30"/>
+        </w:numPr>
+      </w:pPr>
+      <w:r>
+        <w:t>The data bus returns to floating a short time after WRITE and SELECT &lt;SOURCE&gt; go low.</w:t>
+      </w:r>
+    </w:p>
+    <w:p>
+      <w:r>
+        <w:lastRenderedPageBreak/>
+        <w:t>The short times referred to in the above text are due to propagation delays</w:t>
+      </w:r>
+      <w:r>
+        <w:t>. All chips take a finite time to change their outputs after a change on their inputs. These times are small and are usually &lt;&lt; 1</w:t>
+      </w:r>
+      <w:r>
+        <w:rPr>
+          <w:rFonts w:cstheme="minorHAnsi"/>
+        </w:rPr>
+        <w:t>µ</w:t>
+      </w:r>
+      <w:r>
+        <w:t>s per chip.</w:t>
+      </w:r>
+    </w:p>
+    <w:p>
+      <w:pPr>
+        <w:rPr>
+          <w:b/>
+        </w:rPr>
+      </w:pPr>
+      <w:r>
+        <w:rPr>
+          <w:b/>
+        </w:rPr>
+        <w:t xml:space="preserve">Although </w:t>
+      </w:r>
+      <w:r>
+        <w:rPr>
+          <w:b/>
+        </w:rPr>
+        <w:fldChar w:fldCharType="begin"/>
+      </w:r>
+      <w:r>
+        <w:rPr>
+          <w:b/>
+        </w:rPr>
+        <w:instrText xml:space="preserve"> REF _Ref233626426 \h </w:instrText>
+      </w:r>
+      <w:r>
+        <w:rPr>
+          <w:b/>
+        </w:rPr>
+      </w:r>
+      <w:r>
+        <w:rPr>
+          <w:b/>
+        </w:rPr>
+        <w:fldChar w:fldCharType="separate"/>
+      </w:r>
+      <w:r>
+        <w:t xml:space="preserve">Figure </w:t>
+      </w:r>
+      <w:r>
+        <w:rPr>
+          <w:noProof/>
+        </w:rPr>
+        <w:t>2</w:t>
+      </w:r>
+      <w:r>
+        <w:rPr>
+          <w:b/>
+        </w:rPr>
+        <w:fldChar w:fldCharType="end"/>
+      </w:r>
+      <w:r>
+        <w:rPr>
+          <w:b/>
+        </w:rPr>
+        <w:t xml:space="preserve"> shows consistent and matching delays (e.g. for READ and SELECT &lt;DESTINATION&gt;) it must not be assumed that this will be the case in real life. The safest assumption to make for a reliable design is that signals which change after the clock may change immediately after the CLOCK rising edge, or may not change until 1</w:t>
+      </w:r>
+      <w:r>
+        <w:rPr>
+          <w:rFonts w:cstheme="minorHAnsi"/>
+          <w:b/>
+        </w:rPr>
+        <w:t>µ</w:t>
+      </w:r>
+      <w:r>
+        <w:rPr>
+          <w:b/>
+        </w:rPr>
+        <w:t xml:space="preserve">s later.  </w:t>
+      </w:r>
+    </w:p>
+    <w:p>
       <w:pPr>
         <w:pStyle w:val="Heading3"/>
       </w:pPr>
-      <w:bookmarkStart w:id="7" w:name="_Ref232850548"/>
-      <w:bookmarkStart w:id="8" w:name="_Toc233191856"/>
+      <w:bookmarkStart w:id="10" w:name="_Ref232850548"/>
+      <w:bookmarkStart w:id="11" w:name="_Toc233631542"/>
       <w:r>
         <w:t>Reading f</w:t>
       </w:r>
@@ -4176,8 +4890,8 @@
       <w:r>
         <w:t>Data Bus</w:t>
       </w:r>
-      <w:bookmarkEnd w:id="7"/>
-      <w:bookmarkEnd w:id="8"/>
+      <w:bookmarkEnd w:id="10"/>
+      <w:bookmarkEnd w:id="11"/>
     </w:p>
     <w:p>
       <w:r>
@@ -4597,7 +5311,25 @@
         <w:rPr>
           <w:lang w:eastAsia="en-GB"/>
         </w:rPr>
-        <w:t xml:space="preserve">If </w:t>
+        <w:t>Reading using an edge triggered latch</w:t>
+      </w:r>
+    </w:p>
+    <w:p>
+      <w:pPr>
+        <w:pStyle w:val="ListParagraph"/>
+        <w:numPr>
+          <w:ilvl w:val="1"/>
+          <w:numId w:val="24"/>
+        </w:numPr>
+        <w:rPr>
+          <w:lang w:eastAsia="en-GB"/>
+        </w:rPr>
+      </w:pPr>
+      <w:r>
+        <w:rPr>
+          <w:lang w:eastAsia="en-GB"/>
+        </w:rPr>
+        <w:t>Read on rising edge of  (</w:t>
       </w:r>
       <w:proofErr w:type="spellStart"/>
       <w:r>
@@ -4611,28 +5343,99 @@
         <w:rPr>
           <w:lang w:eastAsia="en-GB"/>
         </w:rPr>
-        <w:t xml:space="preserve"> is HIGH, </w:t>
-      </w:r>
-      <w:r>
-        <w:rPr>
-          <w:lang w:eastAsia="en-GB"/>
-        </w:rPr>
-        <w:t xml:space="preserve">then </w:t>
-      </w:r>
-      <w:r>
-        <w:rPr>
-          <w:lang w:eastAsia="en-GB"/>
-        </w:rPr>
-        <w:t>the data should be read into the device when READ changes from LOW to HIGH.</w:t>
+        <w:t xml:space="preserve"> </w:t>
+      </w:r>
+      <w:r>
+        <w:rPr>
+          <w:lang w:eastAsia="en-GB"/>
+        </w:rPr>
+        <w:t xml:space="preserve"> AND READ AND </w:t>
+      </w:r>
+      <w:r>
+        <w:rPr>
+          <w:b/>
+          <w:lang w:eastAsia="en-GB"/>
+        </w:rPr>
+        <w:t>!</w:t>
+      </w:r>
+      <w:r>
+        <w:rPr>
+          <w:lang w:eastAsia="en-GB"/>
+        </w:rPr>
+        <w:t>CLOCK)</w:t>
+      </w:r>
+    </w:p>
+    <w:p>
+      <w:pPr>
+        <w:pStyle w:val="ListParagraph"/>
+        <w:numPr>
+          <w:ilvl w:val="0"/>
+          <w:numId w:val="24"/>
+        </w:numPr>
+        <w:rPr>
+          <w:lang w:eastAsia="en-GB"/>
+        </w:rPr>
+      </w:pPr>
+      <w:r>
+        <w:rPr>
+          <w:lang w:eastAsia="en-GB"/>
+        </w:rPr>
+        <w:t>Reading using a latch with a read enable signal that depends on a level, not on an edge</w:t>
+      </w:r>
+    </w:p>
+    <w:p>
+      <w:pPr>
+        <w:pStyle w:val="ListParagraph"/>
+        <w:numPr>
+          <w:ilvl w:val="1"/>
+          <w:numId w:val="24"/>
+        </w:numPr>
+        <w:rPr>
+          <w:lang w:eastAsia="en-GB"/>
+        </w:rPr>
+      </w:pPr>
+      <w:r>
+        <w:rPr>
+          <w:lang w:eastAsia="en-GB"/>
+        </w:rPr>
+        <w:t>Read when (</w:t>
+      </w:r>
+      <w:proofErr w:type="spellStart"/>
+      <w:r>
+        <w:rPr>
+          <w:lang w:eastAsia="en-GB"/>
+        </w:rPr>
+        <w:t>SELECT_x_DESTx</w:t>
+      </w:r>
+      <w:proofErr w:type="spellEnd"/>
+      <w:r>
+        <w:rPr>
+          <w:lang w:eastAsia="en-GB"/>
+        </w:rPr>
+        <w:t xml:space="preserve">  AND READ) is high</w:t>
+      </w:r>
+    </w:p>
+    <w:p>
+      <w:pPr>
+        <w:rPr>
+          <w:rFonts w:asciiTheme="majorHAnsi" w:eastAsiaTheme="majorEastAsia" w:hAnsiTheme="majorHAnsi" w:cstheme="majorBidi"/>
+          <w:b/>
+          <w:bCs/>
+          <w:color w:val="4F81BD" w:themeColor="accent1"/>
+        </w:rPr>
+      </w:pPr>
+      <w:bookmarkStart w:id="12" w:name="_Ref232850585"/>
+      <w:r>
+        <w:br w:type="page"/>
       </w:r>
     </w:p>
     <w:p>
       <w:pPr>
         <w:pStyle w:val="Heading3"/>
       </w:pPr>
-      <w:bookmarkStart w:id="9" w:name="_Ref232850585"/>
-      <w:bookmarkStart w:id="10" w:name="_Toc233191857"/>
-      <w:r>
+      <w:bookmarkStart w:id="13" w:name="_Toc233631543"/>
+      <w:r>
+        <w:lastRenderedPageBreak/>
         <w:t>Writing t</w:t>
       </w:r>
       <w:r>
@@ -4644,8 +5447,8 @@
       <w:r>
         <w:t>Data Bus</w:t>
       </w:r>
-      <w:bookmarkEnd w:id="9"/>
-      <w:bookmarkEnd w:id="10"/>
+      <w:bookmarkEnd w:id="12"/>
+      <w:bookmarkEnd w:id="13"/>
     </w:p>
     <w:p>
       <w:r>
@@ -5134,43 +5937,43 @@
       <w:pPr>
         <w:pStyle w:val="Heading2"/>
       </w:pPr>
-      <w:bookmarkStart w:id="11" w:name="_Ref232849573"/>
-      <w:bookmarkStart w:id="12" w:name="_Toc233191858"/>
+      <w:bookmarkStart w:id="14" w:name="_Ref232849573"/>
+      <w:bookmarkStart w:id="15" w:name="_Toc233631544"/>
       <w:r>
         <w:t>Overview of GP and SP registers</w:t>
       </w:r>
-      <w:bookmarkEnd w:id="11"/>
-      <w:bookmarkEnd w:id="12"/>
-    </w:p>
-    <w:p>
-      <w:r>
-        <w:t>There will be 16 registers numbered R0 to R15. R15 will be the SP. All these registers will be 16 bit.</w:t>
-      </w:r>
-    </w:p>
-    <w:p>
-      <w:r>
-        <w:t>These registers will be implemented in the first 16 word</w:t>
-      </w:r>
-      <w:r>
-        <w:t>s</w:t>
-      </w:r>
-      <w:r>
-        <w:t xml:space="preserve"> of the 16 bit RAM. R0 at address 0 and R15 at address 15 (decimal)</w:t>
-      </w:r>
-    </w:p>
-    <w:p>
-      <w:pPr>
-        <w:pStyle w:val="Heading3"/>
-      </w:pPr>
-      <w:bookmarkStart w:id="13" w:name="_Ref232926928"/>
-      <w:bookmarkStart w:id="14" w:name="_Ref232926933"/>
-      <w:bookmarkStart w:id="15" w:name="_Toc233191859"/>
-      <w:r>
-        <w:t>SP Behaviour</w:t>
-      </w:r>
-      <w:bookmarkEnd w:id="13"/>
       <w:bookmarkEnd w:id="14"/>
       <w:bookmarkEnd w:id="15"/>
+    </w:p>
+    <w:p>
+      <w:r>
+        <w:t>There will be 16 registers numbered R0 to R15. R15 will be the SP. All these registers will be 16 bit.</w:t>
+      </w:r>
+    </w:p>
+    <w:p>
+      <w:r>
+        <w:t>These registers will be implemented in the first 16 word</w:t>
+      </w:r>
+      <w:r>
+        <w:t>s</w:t>
+      </w:r>
+      <w:r>
+        <w:t xml:space="preserve"> of the 16 bit RAM. R0 at address 0 and R15 at address 15 (decimal)</w:t>
+      </w:r>
+    </w:p>
+    <w:p>
+      <w:pPr>
+        <w:pStyle w:val="Heading3"/>
+      </w:pPr>
+      <w:bookmarkStart w:id="16" w:name="_Ref232926928"/>
+      <w:bookmarkStart w:id="17" w:name="_Ref232926933"/>
+      <w:bookmarkStart w:id="18" w:name="_Toc233631545"/>
+      <w:r>
+        <w:t>SP Behaviour</w:t>
+      </w:r>
+      <w:bookmarkEnd w:id="16"/>
+      <w:bookmarkEnd w:id="17"/>
+      <w:bookmarkEnd w:id="18"/>
     </w:p>
     <w:p>
       <w:r>
@@ -5286,15 +6089,15 @@
           <w:lang w:eastAsia="en-GB"/>
         </w:rPr>
       </w:pPr>
-      <w:bookmarkStart w:id="16" w:name="_Ref172648415"/>
-      <w:bookmarkStart w:id="17" w:name="_Toc233191860"/>
+      <w:bookmarkStart w:id="19" w:name="_Ref172648415"/>
+      <w:bookmarkStart w:id="20" w:name="_Toc233631546"/>
       <w:r>
         <w:rPr>
           <w:lang w:eastAsia="en-GB"/>
         </w:rPr>
         <w:t>Other Busses</w:t>
       </w:r>
-      <w:bookmarkEnd w:id="17"/>
+      <w:bookmarkEnd w:id="20"/>
     </w:p>
     <w:p>
       <w:pPr>
@@ -5992,22 +6795,22 @@
           <w:lang w:eastAsia="en-GB"/>
         </w:rPr>
       </w:pPr>
-      <w:bookmarkStart w:id="18" w:name="_Ref232084668"/>
-      <w:bookmarkStart w:id="19" w:name="_Ref232084946"/>
-      <w:bookmarkStart w:id="20" w:name="_Ref232086890"/>
-      <w:bookmarkStart w:id="21" w:name="_Ref232086990"/>
-      <w:bookmarkStart w:id="22" w:name="_Toc233191861"/>
+      <w:bookmarkStart w:id="21" w:name="_Ref232084668"/>
+      <w:bookmarkStart w:id="22" w:name="_Ref232084946"/>
+      <w:bookmarkStart w:id="23" w:name="_Ref232086890"/>
+      <w:bookmarkStart w:id="24" w:name="_Ref232086990"/>
+      <w:bookmarkStart w:id="25" w:name="_Toc233631547"/>
       <w:r>
         <w:rPr>
           <w:lang w:eastAsia="en-GB"/>
         </w:rPr>
         <w:t>Common bus signals</w:t>
       </w:r>
-      <w:bookmarkEnd w:id="18"/>
-      <w:bookmarkEnd w:id="19"/>
-      <w:bookmarkEnd w:id="20"/>
       <w:bookmarkEnd w:id="21"/>
       <w:bookmarkEnd w:id="22"/>
+      <w:bookmarkEnd w:id="23"/>
+      <w:bookmarkEnd w:id="24"/>
+      <w:bookmarkEnd w:id="25"/>
     </w:p>
     <w:p>
       <w:pPr>
@@ -6095,14 +6898,14 @@
           <w:lang w:eastAsia="en-GB"/>
         </w:rPr>
       </w:pPr>
-      <w:bookmarkStart w:id="23" w:name="READ"/>
+      <w:bookmarkStart w:id="26" w:name="READ"/>
       <w:r>
         <w:rPr>
           <w:lang w:eastAsia="en-GB"/>
         </w:rPr>
         <w:t>READ</w:t>
       </w:r>
-      <w:bookmarkEnd w:id="23"/>
+      <w:bookmarkEnd w:id="26"/>
       <w:r>
         <w:rPr>
           <w:lang w:eastAsia="en-GB"/>
@@ -6121,14 +6924,14 @@
           <w:lang w:eastAsia="en-GB"/>
         </w:rPr>
       </w:pPr>
-      <w:bookmarkStart w:id="24" w:name="WRITE"/>
+      <w:bookmarkStart w:id="27" w:name="WRITE"/>
       <w:r>
         <w:rPr>
           <w:lang w:eastAsia="en-GB"/>
         </w:rPr>
         <w:t>WRITE</w:t>
       </w:r>
-      <w:bookmarkEnd w:id="24"/>
+      <w:bookmarkEnd w:id="27"/>
       <w:r>
         <w:rPr>
           <w:lang w:eastAsia="en-GB"/>
@@ -6143,16 +6946,16 @@
           <w:lang w:eastAsia="en-GB"/>
         </w:rPr>
       </w:pPr>
-      <w:bookmarkStart w:id="25" w:name="_Ref232081276"/>
-      <w:bookmarkStart w:id="26" w:name="_Toc233191862"/>
+      <w:bookmarkStart w:id="28" w:name="_Ref232081276"/>
+      <w:bookmarkStart w:id="29" w:name="_Toc233631548"/>
       <w:r>
         <w:rPr>
           <w:lang w:eastAsia="en-GB"/>
         </w:rPr>
         <w:t>ADDRESS bus</w:t>
       </w:r>
-      <w:bookmarkEnd w:id="25"/>
-      <w:bookmarkEnd w:id="26"/>
+      <w:bookmarkEnd w:id="28"/>
+      <w:bookmarkEnd w:id="29"/>
     </w:p>
     <w:p>
       <w:pPr>
@@ -6174,8 +6977,8 @@
           <w:lang w:eastAsia="en-GB"/>
         </w:rPr>
       </w:pPr>
-      <w:bookmarkStart w:id="27" w:name="_Ref232081291"/>
-      <w:bookmarkStart w:id="28" w:name="_Toc233191863"/>
+      <w:bookmarkStart w:id="30" w:name="_Ref232081291"/>
+      <w:bookmarkStart w:id="31" w:name="_Toc233631549"/>
       <w:r>
         <w:rPr>
           <w:lang w:eastAsia="en-GB"/>
@@ -6183,41 +6986,41 @@
         <w:lastRenderedPageBreak/>
         <w:t>OP CODE bus</w:t>
       </w:r>
-      <w:bookmarkEnd w:id="27"/>
-      <w:bookmarkEnd w:id="28"/>
-    </w:p>
-    <w:p>
-      <w:pPr>
-        <w:rPr>
-          <w:lang w:eastAsia="en-GB"/>
-        </w:rPr>
-      </w:pPr>
-      <w:r>
-        <w:rPr>
-          <w:lang w:eastAsia="en-GB"/>
-        </w:rPr>
-        <w:t>This is simply the 16 bit output of the ROM. It’s always enabled and there are no other control signals associated with it.</w:t>
-      </w:r>
-      <w:bookmarkStart w:id="29" w:name="_Ref232081293"/>
-    </w:p>
-    <w:p>
-      <w:pPr>
-        <w:pStyle w:val="Heading2"/>
-        <w:rPr>
-          <w:lang w:eastAsia="en-GB"/>
-        </w:rPr>
-      </w:pPr>
-      <w:bookmarkStart w:id="30" w:name="_Ref233021496"/>
-      <w:bookmarkStart w:id="31" w:name="_Toc233191864"/>
-      <w:r>
-        <w:rPr>
-          <w:lang w:eastAsia="en-GB"/>
-        </w:rPr>
-        <w:t>PC CTRL bus</w:t>
-      </w:r>
-      <w:bookmarkEnd w:id="29"/>
       <w:bookmarkEnd w:id="30"/>
       <w:bookmarkEnd w:id="31"/>
+    </w:p>
+    <w:p>
+      <w:pPr>
+        <w:rPr>
+          <w:lang w:eastAsia="en-GB"/>
+        </w:rPr>
+      </w:pPr>
+      <w:r>
+        <w:rPr>
+          <w:lang w:eastAsia="en-GB"/>
+        </w:rPr>
+        <w:t>This is simply the 16 bit output of the ROM. It’s always enabled and there are no other control signals associated with it.</w:t>
+      </w:r>
+      <w:bookmarkStart w:id="32" w:name="_Ref232081293"/>
+    </w:p>
+    <w:p>
+      <w:pPr>
+        <w:pStyle w:val="Heading2"/>
+        <w:rPr>
+          <w:lang w:eastAsia="en-GB"/>
+        </w:rPr>
+      </w:pPr>
+      <w:bookmarkStart w:id="33" w:name="_Ref233021496"/>
+      <w:bookmarkStart w:id="34" w:name="_Toc233631550"/>
+      <w:r>
+        <w:rPr>
+          <w:lang w:eastAsia="en-GB"/>
+        </w:rPr>
+        <w:t>PC CTRL bus</w:t>
+      </w:r>
+      <w:bookmarkEnd w:id="32"/>
+      <w:bookmarkEnd w:id="33"/>
+      <w:bookmarkEnd w:id="34"/>
     </w:p>
     <w:p>
       <w:pPr>
@@ -6720,7 +7523,7 @@
           <w:lang w:eastAsia="en-GB"/>
         </w:rPr>
       </w:pPr>
-      <w:bookmarkStart w:id="32" w:name="_Ref232081296"/>
+      <w:bookmarkStart w:id="35" w:name="_Ref232081296"/>
       <w:r>
         <w:rPr>
           <w:lang w:eastAsia="en-GB"/>
@@ -6735,8 +7538,8 @@
           <w:lang w:eastAsia="en-GB"/>
         </w:rPr>
       </w:pPr>
-      <w:bookmarkStart w:id="33" w:name="_Ref232090743"/>
-      <w:bookmarkStart w:id="34" w:name="_Toc233191865"/>
+      <w:bookmarkStart w:id="36" w:name="_Ref232090743"/>
+      <w:bookmarkStart w:id="37" w:name="_Toc233631551"/>
       <w:r>
         <w:rPr>
           <w:lang w:eastAsia="en-GB"/>
@@ -6744,9 +7547,9 @@
         <w:lastRenderedPageBreak/>
         <w:t>IO CTRL bus</w:t>
       </w:r>
-      <w:bookmarkEnd w:id="32"/>
-      <w:bookmarkEnd w:id="33"/>
-      <w:bookmarkEnd w:id="34"/>
+      <w:bookmarkEnd w:id="35"/>
+      <w:bookmarkEnd w:id="36"/>
+      <w:bookmarkEnd w:id="37"/>
     </w:p>
     <w:p>
       <w:pPr>
@@ -7243,7 +8046,7 @@
           <w:lang w:eastAsia="en-GB"/>
         </w:rPr>
       </w:pPr>
-      <w:bookmarkStart w:id="35" w:name="_Ref232081299"/>
+      <w:bookmarkStart w:id="38" w:name="_Ref232081299"/>
       <w:r>
         <w:rPr>
           <w:lang w:eastAsia="en-GB"/>
@@ -7258,8 +8061,8 @@
           <w:lang w:eastAsia="en-GB"/>
         </w:rPr>
       </w:pPr>
-      <w:bookmarkStart w:id="36" w:name="_Ref232090753"/>
-      <w:bookmarkStart w:id="37" w:name="_Toc233191866"/>
+      <w:bookmarkStart w:id="39" w:name="_Ref232090753"/>
+      <w:bookmarkStart w:id="40" w:name="_Toc233631552"/>
       <w:r>
         <w:rPr>
           <w:lang w:eastAsia="en-GB"/>
@@ -7267,18 +8070,18 @@
         <w:lastRenderedPageBreak/>
         <w:t>RAM CTRL bus</w:t>
       </w:r>
-      <w:bookmarkEnd w:id="35"/>
-      <w:bookmarkEnd w:id="36"/>
-      <w:bookmarkEnd w:id="37"/>
-    </w:p>
-    <w:p>
-      <w:pPr>
-        <w:rPr>
-          <w:lang w:eastAsia="en-GB"/>
-        </w:rPr>
-      </w:pPr>
-      <w:bookmarkStart w:id="38" w:name="CurrentEditPos"/>
       <w:bookmarkEnd w:id="38"/>
+      <w:bookmarkEnd w:id="39"/>
+      <w:bookmarkEnd w:id="40"/>
+    </w:p>
+    <w:p>
+      <w:pPr>
+        <w:rPr>
+          <w:lang w:eastAsia="en-GB"/>
+        </w:rPr>
+      </w:pPr>
+      <w:bookmarkStart w:id="41" w:name="CurrentEditPos"/>
+      <w:bookmarkEnd w:id="41"/>
       <w:r>
         <w:rPr>
           <w:lang w:eastAsia="en-GB"/>
@@ -7686,16 +8489,16 @@
           <w:lang w:eastAsia="en-GB"/>
         </w:rPr>
       </w:pPr>
-      <w:bookmarkStart w:id="39" w:name="_Ref233191365"/>
-      <w:bookmarkStart w:id="40" w:name="_Toc233191867"/>
+      <w:bookmarkStart w:id="42" w:name="_Ref233191365"/>
+      <w:bookmarkStart w:id="43" w:name="_Toc233631553"/>
       <w:r>
         <w:rPr>
           <w:lang w:eastAsia="en-GB"/>
         </w:rPr>
         <w:t>RAM ADDR Bus</w:t>
       </w:r>
-      <w:bookmarkEnd w:id="39"/>
-      <w:bookmarkEnd w:id="40"/>
+      <w:bookmarkEnd w:id="42"/>
+      <w:bookmarkEnd w:id="43"/>
     </w:p>
     <w:p>
       <w:pPr>
@@ -7781,7 +8584,7 @@
           <w:lang w:eastAsia="en-GB"/>
         </w:rPr>
       </w:pPr>
-      <w:bookmarkStart w:id="41" w:name="_Ref232081305"/>
+      <w:bookmarkStart w:id="44" w:name="_Ref232081305"/>
       <w:r>
         <w:rPr>
           <w:lang w:eastAsia="en-GB"/>
@@ -7796,8 +8599,8 @@
           <w:lang w:eastAsia="en-GB"/>
         </w:rPr>
       </w:pPr>
-      <w:bookmarkStart w:id="42" w:name="_Ref232851000"/>
-      <w:bookmarkStart w:id="43" w:name="_Toc233191868"/>
+      <w:bookmarkStart w:id="45" w:name="_Ref232851000"/>
+      <w:bookmarkStart w:id="46" w:name="_Toc233631554"/>
       <w:r>
         <w:rPr>
           <w:lang w:eastAsia="en-GB"/>
@@ -7805,9 +8608,9 @@
         <w:lastRenderedPageBreak/>
         <w:t>ALU CTRL bus</w:t>
       </w:r>
-      <w:bookmarkEnd w:id="41"/>
-      <w:bookmarkEnd w:id="42"/>
-      <w:bookmarkEnd w:id="43"/>
+      <w:bookmarkEnd w:id="44"/>
+      <w:bookmarkEnd w:id="45"/>
+      <w:bookmarkEnd w:id="46"/>
     </w:p>
     <w:p>
       <w:pPr>
@@ -7892,14 +8695,14 @@
           <w:lang w:eastAsia="en-GB"/>
         </w:rPr>
       </w:pPr>
-      <w:bookmarkStart w:id="44" w:name="ALU_MODE"/>
+      <w:bookmarkStart w:id="47" w:name="ALU_MODE"/>
       <w:r>
         <w:rPr>
           <w:lang w:eastAsia="en-GB"/>
         </w:rPr>
         <w:t>ALU_MODE</w:t>
       </w:r>
-      <w:bookmarkEnd w:id="44"/>
+      <w:bookmarkEnd w:id="47"/>
     </w:p>
     <w:p>
       <w:pPr>
@@ -8011,7 +8814,7 @@
         <w:keepNext/>
         <w:jc w:val="center"/>
       </w:pPr>
-      <w:bookmarkStart w:id="45" w:name="_Ref232689048"/>
+      <w:bookmarkStart w:id="48" w:name="_Ref232689048"/>
       <w:r>
         <w:t xml:space="preserve">Table </w:t>
       </w:r>
@@ -8023,7 +8826,7 @@
           <w:t>2</w:t>
         </w:r>
       </w:fldSimple>
-      <w:bookmarkEnd w:id="45"/>
+      <w:bookmarkEnd w:id="48"/>
       <w:r>
         <w:t>:   ALU_MODE bits and their meaning</w:t>
       </w:r>
@@ -9201,14 +10004,14 @@
           <w:lang w:eastAsia="en-GB"/>
         </w:rPr>
       </w:pPr>
-      <w:bookmarkStart w:id="46" w:name="SELECT_ALU_DESTA"/>
+      <w:bookmarkStart w:id="49" w:name="SELECT_ALU_DESTA"/>
       <w:r>
         <w:rPr>
           <w:lang w:eastAsia="en-GB"/>
         </w:rPr>
         <w:t>SELECT_ALU_DESTA</w:t>
       </w:r>
-      <w:bookmarkEnd w:id="46"/>
+      <w:bookmarkEnd w:id="49"/>
     </w:p>
     <w:p>
       <w:pPr>
@@ -9257,14 +10060,14 @@
           <w:lang w:eastAsia="en-GB"/>
         </w:rPr>
       </w:pPr>
-      <w:bookmarkStart w:id="47" w:name="SELECT_ALU_DESTB"/>
+      <w:bookmarkStart w:id="50" w:name="SELECT_ALU_DESTB"/>
       <w:r>
         <w:rPr>
           <w:lang w:eastAsia="en-GB"/>
         </w:rPr>
         <w:t>SELECT_ALU_DESTB</w:t>
       </w:r>
-      <w:bookmarkEnd w:id="47"/>
+      <w:bookmarkEnd w:id="50"/>
     </w:p>
     <w:p>
       <w:pPr>
@@ -9378,14 +10181,14 @@
           <w:lang w:eastAsia="en-GB"/>
         </w:rPr>
       </w:pPr>
-      <w:bookmarkStart w:id="48" w:name="SELECT_ALUO_SRC"/>
+      <w:bookmarkStart w:id="51" w:name="SELECT_ALUO_SRC"/>
       <w:r>
         <w:rPr>
           <w:lang w:eastAsia="en-GB"/>
         </w:rPr>
         <w:t>SELECT_ALUO_SRC</w:t>
       </w:r>
-      <w:bookmarkEnd w:id="48"/>
+      <w:bookmarkEnd w:id="51"/>
     </w:p>
     <w:p>
       <w:pPr>
@@ -9512,7 +10315,7 @@
           <w:lang w:eastAsia="en-GB"/>
         </w:rPr>
       </w:pPr>
-      <w:bookmarkStart w:id="49" w:name="_Ref232081310"/>
+      <w:bookmarkStart w:id="52" w:name="_Ref232081310"/>
       <w:r>
         <w:rPr>
           <w:lang w:eastAsia="en-GB"/>
@@ -9527,8 +10330,8 @@
           <w:lang w:eastAsia="en-GB"/>
         </w:rPr>
       </w:pPr>
-      <w:bookmarkStart w:id="50" w:name="_Ref232090831"/>
-      <w:bookmarkStart w:id="51" w:name="_Toc233191869"/>
+      <w:bookmarkStart w:id="53" w:name="_Ref232090831"/>
+      <w:bookmarkStart w:id="54" w:name="_Toc233631555"/>
       <w:r>
         <w:rPr>
           <w:lang w:eastAsia="en-GB"/>
@@ -9536,9 +10339,9 @@
         <w:lastRenderedPageBreak/>
         <w:t>FLAGS bus</w:t>
       </w:r>
-      <w:bookmarkEnd w:id="49"/>
-      <w:bookmarkEnd w:id="50"/>
-      <w:bookmarkEnd w:id="51"/>
+      <w:bookmarkEnd w:id="52"/>
+      <w:bookmarkEnd w:id="53"/>
+      <w:bookmarkEnd w:id="54"/>
     </w:p>
     <w:p>
       <w:pPr>
@@ -9886,7 +10689,7 @@
           <w:lang w:eastAsia="en-GB"/>
         </w:rPr>
       </w:pPr>
-      <w:bookmarkStart w:id="52" w:name="_Toc233191870"/>
+      <w:bookmarkStart w:id="55" w:name="_Toc233631556"/>
       <w:r>
         <w:rPr>
           <w:lang w:eastAsia="en-GB"/>
@@ -9922,7 +10725,7 @@
         </w:rPr>
         <w:t>ALU_MODE</w:t>
       </w:r>
-      <w:bookmarkEnd w:id="52"/>
+      <w:bookmarkEnd w:id="55"/>
       <w:r>
         <w:rPr>
           <w:lang w:eastAsia="en-GB"/>
@@ -10057,7 +10860,7 @@
           <w:lang w:eastAsia="en-GB"/>
         </w:rPr>
       </w:pPr>
-      <w:bookmarkStart w:id="53" w:name="_Toc233191871"/>
+      <w:bookmarkStart w:id="56" w:name="_Toc233631557"/>
       <w:r>
         <w:rPr>
           <w:lang w:eastAsia="en-GB"/>
@@ -10093,7 +10896,7 @@
         </w:rPr>
         <w:t>ALU_MODE</w:t>
       </w:r>
-      <w:bookmarkEnd w:id="53"/>
+      <w:bookmarkEnd w:id="56"/>
       <w:r>
         <w:rPr>
           <w:lang w:eastAsia="en-GB"/>
@@ -10248,7 +11051,7 @@
         <w:keepNext/>
         <w:jc w:val="center"/>
       </w:pPr>
-      <w:bookmarkStart w:id="54" w:name="_Ref232694733"/>
+      <w:bookmarkStart w:id="57" w:name="_Ref232694733"/>
       <w:r>
         <w:t xml:space="preserve">Table </w:t>
       </w:r>
@@ -10260,7 +11063,7 @@
           <w:t>3</w:t>
         </w:r>
       </w:fldSimple>
-      <w:bookmarkEnd w:id="54"/>
+      <w:bookmarkEnd w:id="57"/>
       <w:r>
         <w:t xml:space="preserve">:   Rules for FLAG_V and FLAG_C </w:t>
       </w:r>
@@ -11196,7 +11999,7 @@
           <w:lang w:eastAsia="en-GB"/>
         </w:rPr>
       </w:pPr>
-      <w:bookmarkStart w:id="55" w:name="_Ref232694870"/>
+      <w:bookmarkStart w:id="58" w:name="_Ref232694870"/>
       <w:r>
         <w:rPr>
           <w:lang w:eastAsia="en-GB"/>
@@ -11244,7 +12047,7 @@
         </w:rPr>
         <w:t xml:space="preserve"> = ADD</w:t>
       </w:r>
-      <w:bookmarkEnd w:id="55"/>
+      <w:bookmarkEnd w:id="58"/>
     </w:p>
     <w:p>
       <w:pPr>
@@ -11292,7 +12095,7 @@
           <w:lang w:eastAsia="en-GB"/>
         </w:rPr>
       </w:pPr>
-      <w:bookmarkStart w:id="56" w:name="_Ref232694986"/>
+      <w:bookmarkStart w:id="59" w:name="_Ref232694986"/>
       <w:r>
         <w:rPr>
           <w:lang w:eastAsia="en-GB"/>
@@ -11340,7 +12143,7 @@
         </w:rPr>
         <w:t xml:space="preserve"> = ADD</w:t>
       </w:r>
-      <w:bookmarkEnd w:id="56"/>
+      <w:bookmarkEnd w:id="59"/>
     </w:p>
     <w:p>
       <w:pPr>
@@ -11382,7 +12185,7 @@
           <w:lang w:eastAsia="en-GB"/>
         </w:rPr>
       </w:pPr>
-      <w:bookmarkStart w:id="57" w:name="_Ref232695562"/>
+      <w:bookmarkStart w:id="60" w:name="_Ref232695562"/>
       <w:r>
         <w:rPr>
           <w:lang w:eastAsia="en-GB"/>
@@ -11430,7 +12233,7 @@
         </w:rPr>
         <w:t xml:space="preserve"> = SUB</w:t>
       </w:r>
-      <w:bookmarkEnd w:id="57"/>
+      <w:bookmarkEnd w:id="60"/>
     </w:p>
     <w:p>
       <w:pPr>
@@ -11472,7 +12275,7 @@
           <w:lang w:eastAsia="en-GB"/>
         </w:rPr>
       </w:pPr>
-      <w:bookmarkStart w:id="58" w:name="_Ref232695568"/>
+      <w:bookmarkStart w:id="61" w:name="_Ref232695568"/>
       <w:r>
         <w:rPr>
           <w:lang w:eastAsia="en-GB"/>
@@ -11520,7 +12323,7 @@
         </w:rPr>
         <w:t xml:space="preserve"> = SUB</w:t>
       </w:r>
-      <w:bookmarkEnd w:id="58"/>
+      <w:bookmarkEnd w:id="61"/>
     </w:p>
     <w:p>
       <w:pPr>
@@ -11588,7 +12391,7 @@
           <w:lang w:eastAsia="en-GB"/>
         </w:rPr>
       </w:pPr>
-      <w:bookmarkStart w:id="59" w:name="_Toc233191872"/>
+      <w:bookmarkStart w:id="62" w:name="_Toc233631558"/>
       <w:r>
         <w:rPr>
           <w:lang w:eastAsia="en-GB"/>
@@ -11596,10 +12399,10 @@
         <w:lastRenderedPageBreak/>
         <w:t>References</w:t>
       </w:r>
-      <w:bookmarkEnd w:id="16"/>
-      <w:bookmarkEnd w:id="59"/>
-    </w:p>
-    <w:bookmarkStart w:id="60" w:name="AVR_Instruction_Doc"/>
+      <w:bookmarkEnd w:id="19"/>
+      <w:bookmarkEnd w:id="62"/>
+    </w:p>
+    <w:bookmarkStart w:id="63" w:name="AVR_Instruction_Doc"/>
     <w:p>
       <w:pPr>
         <w:pStyle w:val="ListParagraph"/>
@@ -11641,7 +12444,7 @@
         </w:rPr>
         <w:t>AVR Instruction Set Manual</w:t>
       </w:r>
-      <w:bookmarkEnd w:id="60"/>
+      <w:bookmarkEnd w:id="63"/>
       <w:r>
         <w:rPr>
           <w:lang w:eastAsia="en-GB"/>
@@ -11766,7 +12569,7 @@
               <w:b/>
               <w:noProof/>
             </w:rPr>
-            <w:t>7</w:t>
+            <w:t>2</w:t>
           </w:r>
         </w:fldSimple>
       </w:p>
@@ -11845,6 +12648,119 @@
 <file path=word/numbering.xml><?xml version="1.0" encoding="utf-8"?>
 <w:numbering xmlns:ve="http://schemas.openxmlformats.org/markup-compatibility/2006" xmlns:o="urn:schemas-microsoft-com:office:office" xmlns:r="http://schemas.openxmlformats.org/officeDocument/2006/relationships" xmlns:m="http://schemas.openxmlformats.org/officeDocument/2006/math" xmlns:v="urn:schemas-microsoft-com:vml" xmlns:wp="http://schemas.openxmlformats.org/drawingml/2006/wordprocessingDrawing" xmlns:w10="urn:schemas-microsoft-com:office:word" xmlns:w="http://schemas.openxmlformats.org/wordprocessingml/2006/main" xmlns:wne="http://schemas.microsoft.com/office/word/2006/wordml">
   <w:abstractNum w:abstractNumId="0">
+    <w:nsid w:val="06133252"/>
+    <w:multiLevelType w:val="hybridMultilevel"/>
+    <w:tmpl w:val="B71C341C"/>
+    <w:lvl w:ilvl="0" w:tplc="08090001">
+      <w:start w:val="1"/>
+      <w:numFmt w:val="bullet"/>
+      <w:lvlText w:val=""/>
+      <w:lvlJc w:val="left"/>
+      <w:pPr>
+        <w:ind w:left="720" w:hanging="360"/>
+      </w:pPr>
+      <w:rPr>
+        <w:rFonts w:ascii="Symbol" w:hAnsi="Symbol" w:hint="default"/>
+      </w:rPr>
+    </w:lvl>
+    <w:lvl w:ilvl="1" w:tplc="08090003" w:tentative="1">
+      <w:start w:val="1"/>
+      <w:numFmt w:val="bullet"/>
+      <w:lvlText w:val="o"/>
+      <w:lvlJc w:val="left"/>
+      <w:pPr>
+        <w:ind w:left="1440" w:hanging="360"/>
+      </w:pPr>
+      <w:rPr>
+        <w:rFonts w:ascii="Courier New" w:hAnsi="Courier New" w:cs="Courier New" w:hint="default"/>
+      </w:rPr>
+    </w:lvl>
+    <w:lvl w:ilvl="2" w:tplc="08090005" w:tentative="1">
+      <w:start w:val="1"/>
+      <w:numFmt w:val="bullet"/>
+      <w:lvlText w:val=""/>
+      <w:lvlJc w:val="left"/>
+      <w:pPr>
+        <w:ind w:left="2160" w:hanging="360"/>
+      </w:pPr>
+      <w:rPr>
+        <w:rFonts w:ascii="Wingdings" w:hAnsi="Wingdings" w:hint="default"/>
+      </w:rPr>
+    </w:lvl>
+    <w:lvl w:ilvl="3" w:tplc="08090001" w:tentative="1">
+      <w:start w:val="1"/>
+      <w:numFmt w:val="bullet"/>
+      <w:lvlText w:val=""/>
+      <w:lvlJc w:val="left"/>
+      <w:pPr>
+        <w:ind w:left="2880" w:hanging="360"/>
+      </w:pPr>
+      <w:rPr>
+        <w:rFonts w:ascii="Symbol" w:hAnsi="Symbol" w:hint="default"/>
+      </w:rPr>
+    </w:lvl>
+    <w:lvl w:ilvl="4" w:tplc="08090003" w:tentative="1">
+      <w:start w:val="1"/>
+      <w:numFmt w:val="bullet"/>
+      <w:lvlText w:val="o"/>
+      <w:lvlJc w:val="left"/>
+      <w:pPr>
+        <w:ind w:left="3600" w:hanging="360"/>
+      </w:pPr>
+      <w:rPr>
+        <w:rFonts w:ascii="Courier New" w:hAnsi="Courier New" w:cs="Courier New" w:hint="default"/>
+      </w:rPr>
+    </w:lvl>
+    <w:lvl w:ilvl="5" w:tplc="08090005" w:tentative="1">
+      <w:start w:val="1"/>
+      <w:numFmt w:val="bullet"/>
+      <w:lvlText w:val=""/>
+      <w:lvlJc w:val="left"/>
+      <w:pPr>
+        <w:ind w:left="4320" w:hanging="360"/>
+      </w:pPr>
+      <w:rPr>
+        <w:rFonts w:ascii="Wingdings" w:hAnsi="Wingdings" w:hint="default"/>
+      </w:rPr>
+    </w:lvl>
+    <w:lvl w:ilvl="6" w:tplc="08090001" w:tentative="1">
+      <w:start w:val="1"/>
+      <w:numFmt w:val="bullet"/>
+      <w:lvlText w:val=""/>
+      <w:lvlJc w:val="left"/>
+      <w:pPr>
+        <w:ind w:left="5040" w:hanging="360"/>
+      </w:pPr>
+      <w:rPr>
+        <w:rFonts w:ascii="Symbol" w:hAnsi="Symbol" w:hint="default"/>
+      </w:rPr>
+    </w:lvl>
+    <w:lvl w:ilvl="7" w:tplc="08090003" w:tentative="1">
+      <w:start w:val="1"/>
+      <w:numFmt w:val="bullet"/>
+      <w:lvlText w:val="o"/>
+      <w:lvlJc w:val="left"/>
+      <w:pPr>
+        <w:ind w:left="5760" w:hanging="360"/>
+      </w:pPr>
+      <w:rPr>
+        <w:rFonts w:ascii="Courier New" w:hAnsi="Courier New" w:cs="Courier New" w:hint="default"/>
+      </w:rPr>
+    </w:lvl>
+    <w:lvl w:ilvl="8" w:tplc="08090005" w:tentative="1">
+      <w:start w:val="1"/>
+      <w:numFmt w:val="bullet"/>
+      <w:lvlText w:val=""/>
+      <w:lvlJc w:val="left"/>
+      <w:pPr>
+        <w:ind w:left="6480" w:hanging="360"/>
+      </w:pPr>
+      <w:rPr>
+        <w:rFonts w:ascii="Wingdings" w:hAnsi="Wingdings" w:hint="default"/>
+      </w:rPr>
+    </w:lvl>
+  </w:abstractNum>
+  <w:abstractNum w:abstractNumId="1">
     <w:nsid w:val="0B2C594D"/>
     <w:multiLevelType w:val="hybridMultilevel"/>
     <w:tmpl w:val="709C7ED6"/>
@@ -11957,7 +12873,7 @@
       </w:rPr>
     </w:lvl>
   </w:abstractNum>
-  <w:abstractNum w:abstractNumId="1">
+  <w:abstractNum w:abstractNumId="2">
     <w:nsid w:val="0F961AA0"/>
     <w:multiLevelType w:val="hybridMultilevel"/>
     <w:tmpl w:val="6708FDB8"/>
@@ -12046,10 +12962,123 @@
       </w:pPr>
     </w:lvl>
   </w:abstractNum>
-  <w:abstractNum w:abstractNumId="2">
+  <w:abstractNum w:abstractNumId="3">
+    <w:nsid w:val="0FE041E8"/>
+    <w:multiLevelType w:val="hybridMultilevel"/>
+    <w:tmpl w:val="2458C848"/>
+    <w:lvl w:ilvl="0" w:tplc="08090001">
+      <w:start w:val="1"/>
+      <w:numFmt w:val="bullet"/>
+      <w:lvlText w:val=""/>
+      <w:lvlJc w:val="left"/>
+      <w:pPr>
+        <w:ind w:left="720" w:hanging="360"/>
+      </w:pPr>
+      <w:rPr>
+        <w:rFonts w:ascii="Symbol" w:hAnsi="Symbol" w:hint="default"/>
+      </w:rPr>
+    </w:lvl>
+    <w:lvl w:ilvl="1" w:tplc="08090003" w:tentative="1">
+      <w:start w:val="1"/>
+      <w:numFmt w:val="bullet"/>
+      <w:lvlText w:val="o"/>
+      <w:lvlJc w:val="left"/>
+      <w:pPr>
+        <w:ind w:left="1440" w:hanging="360"/>
+      </w:pPr>
+      <w:rPr>
+        <w:rFonts w:ascii="Courier New" w:hAnsi="Courier New" w:cs="Courier New" w:hint="default"/>
+      </w:rPr>
+    </w:lvl>
+    <w:lvl w:ilvl="2" w:tplc="08090005" w:tentative="1">
+      <w:start w:val="1"/>
+      <w:numFmt w:val="bullet"/>
+      <w:lvlText w:val=""/>
+      <w:lvlJc w:val="left"/>
+      <w:pPr>
+        <w:ind w:left="2160" w:hanging="360"/>
+      </w:pPr>
+      <w:rPr>
+        <w:rFonts w:ascii="Wingdings" w:hAnsi="Wingdings" w:hint="default"/>
+      </w:rPr>
+    </w:lvl>
+    <w:lvl w:ilvl="3" w:tplc="08090001" w:tentative="1">
+      <w:start w:val="1"/>
+      <w:numFmt w:val="bullet"/>
+      <w:lvlText w:val=""/>
+      <w:lvlJc w:val="left"/>
+      <w:pPr>
+        <w:ind w:left="2880" w:hanging="360"/>
+      </w:pPr>
+      <w:rPr>
+        <w:rFonts w:ascii="Symbol" w:hAnsi="Symbol" w:hint="default"/>
+      </w:rPr>
+    </w:lvl>
+    <w:lvl w:ilvl="4" w:tplc="08090003" w:tentative="1">
+      <w:start w:val="1"/>
+      <w:numFmt w:val="bullet"/>
+      <w:lvlText w:val="o"/>
+      <w:lvlJc w:val="left"/>
+      <w:pPr>
+        <w:ind w:left="3600" w:hanging="360"/>
+      </w:pPr>
+      <w:rPr>
+        <w:rFonts w:ascii="Courier New" w:hAnsi="Courier New" w:cs="Courier New" w:hint="default"/>
+      </w:rPr>
+    </w:lvl>
+    <w:lvl w:ilvl="5" w:tplc="08090005" w:tentative="1">
+      <w:start w:val="1"/>
+      <w:numFmt w:val="bullet"/>
+      <w:lvlText w:val=""/>
+      <w:lvlJc w:val="left"/>
+      <w:pPr>
+        <w:ind w:left="4320" w:hanging="360"/>
+      </w:pPr>
+      <w:rPr>
+        <w:rFonts w:ascii="Wingdings" w:hAnsi="Wingdings" w:hint="default"/>
+      </w:rPr>
+    </w:lvl>
+    <w:lvl w:ilvl="6" w:tplc="08090001" w:tentative="1">
+      <w:start w:val="1"/>
+      <w:numFmt w:val="bullet"/>
+      <w:lvlText w:val=""/>
+      <w:lvlJc w:val="left"/>
+      <w:pPr>
+        <w:ind w:left="5040" w:hanging="360"/>
+      </w:pPr>
+      <w:rPr>
+        <w:rFonts w:ascii="Symbol" w:hAnsi="Symbol" w:hint="default"/>
+      </w:rPr>
+    </w:lvl>
+    <w:lvl w:ilvl="7" w:tplc="08090003" w:tentative="1">
+      <w:start w:val="1"/>
+      <w:numFmt w:val="bullet"/>
+      <w:lvlText w:val="o"/>
+      <w:lvlJc w:val="left"/>
+      <w:pPr>
+        <w:ind w:left="5760" w:hanging="360"/>
+      </w:pPr>
+      <w:rPr>
+        <w:rFonts w:ascii="Courier New" w:hAnsi="Courier New" w:cs="Courier New" w:hint="default"/>
+      </w:rPr>
+    </w:lvl>
+    <w:lvl w:ilvl="8" w:tplc="08090005" w:tentative="1">
+      <w:start w:val="1"/>
+      <w:numFmt w:val="bullet"/>
+      <w:lvlText w:val=""/>
+      <w:lvlJc w:val="left"/>
+      <w:pPr>
+        <w:ind w:left="6480" w:hanging="360"/>
+      </w:pPr>
+      <w:rPr>
+        <w:rFonts w:ascii="Wingdings" w:hAnsi="Wingdings" w:hint="default"/>
+      </w:rPr>
+    </w:lvl>
+  </w:abstractNum>
+  <w:abstractNum w:abstractNumId="4">
     <w:nsid w:val="1AF44731"/>
     <w:multiLevelType w:val="hybridMultilevel"/>
-    <w:tmpl w:val="CF72FB88"/>
+    <w:tmpl w:val="220ECB8C"/>
     <w:lvl w:ilvl="0" w:tplc="08090001">
       <w:start w:val="1"/>
       <w:numFmt w:val="bullet"/>
@@ -12159,7 +13188,7 @@
       </w:rPr>
     </w:lvl>
   </w:abstractNum>
-  <w:abstractNum w:abstractNumId="3">
+  <w:abstractNum w:abstractNumId="5">
     <w:nsid w:val="1DBB41D4"/>
     <w:multiLevelType w:val="hybridMultilevel"/>
     <w:tmpl w:val="6E2ABC92"/>
@@ -12245,7 +13274,7 @@
       </w:pPr>
     </w:lvl>
   </w:abstractNum>
-  <w:abstractNum w:abstractNumId="4">
+  <w:abstractNum w:abstractNumId="6">
     <w:nsid w:val="20C4464B"/>
     <w:multiLevelType w:val="hybridMultilevel"/>
     <w:tmpl w:val="FF9EE358"/>
@@ -12358,7 +13387,7 @@
       </w:rPr>
     </w:lvl>
   </w:abstractNum>
-  <w:abstractNum w:abstractNumId="5">
+  <w:abstractNum w:abstractNumId="7">
     <w:nsid w:val="28A46859"/>
     <w:multiLevelType w:val="hybridMultilevel"/>
     <w:tmpl w:val="EC4EF1DC"/>
@@ -12471,7 +13500,7 @@
       </w:rPr>
     </w:lvl>
   </w:abstractNum>
-  <w:abstractNum w:abstractNumId="6">
+  <w:abstractNum w:abstractNumId="8">
     <w:nsid w:val="2B174FDA"/>
     <w:multiLevelType w:val="hybridMultilevel"/>
     <w:tmpl w:val="37CAC300"/>
@@ -12584,7 +13613,7 @@
       </w:rPr>
     </w:lvl>
   </w:abstractNum>
-  <w:abstractNum w:abstractNumId="7">
+  <w:abstractNum w:abstractNumId="9">
     <w:nsid w:val="2B482A56"/>
     <w:multiLevelType w:val="hybridMultilevel"/>
     <w:tmpl w:val="C3BCB8E4"/>
@@ -12697,7 +13726,7 @@
       </w:rPr>
     </w:lvl>
   </w:abstractNum>
-  <w:abstractNum w:abstractNumId="8">
+  <w:abstractNum w:abstractNumId="10">
     <w:nsid w:val="30D92F56"/>
     <w:multiLevelType w:val="hybridMultilevel"/>
     <w:tmpl w:val="F1445E58"/>
@@ -12783,7 +13812,7 @@
       </w:pPr>
     </w:lvl>
   </w:abstractNum>
-  <w:abstractNum w:abstractNumId="9">
+  <w:abstractNum w:abstractNumId="11">
     <w:nsid w:val="38A37EA3"/>
     <w:multiLevelType w:val="hybridMultilevel"/>
     <w:tmpl w:val="0B88BD08"/>
@@ -12869,7 +13898,7 @@
       </w:pPr>
     </w:lvl>
   </w:abstractNum>
-  <w:abstractNum w:abstractNumId="10">
+  <w:abstractNum w:abstractNumId="12">
     <w:nsid w:val="3DA11B31"/>
     <w:multiLevelType w:val="hybridMultilevel"/>
     <w:tmpl w:val="C81448AA"/>
@@ -12982,7 +14011,7 @@
       </w:rPr>
     </w:lvl>
   </w:abstractNum>
-  <w:abstractNum w:abstractNumId="11">
+  <w:abstractNum w:abstractNumId="13">
     <w:nsid w:val="3E3715A2"/>
     <w:multiLevelType w:val="hybridMultilevel"/>
     <w:tmpl w:val="24DC64AC"/>
@@ -13095,7 +14124,7 @@
       </w:rPr>
     </w:lvl>
   </w:abstractNum>
-  <w:abstractNum w:abstractNumId="12">
+  <w:abstractNum w:abstractNumId="14">
     <w:nsid w:val="3F1E2626"/>
     <w:multiLevelType w:val="multilevel"/>
     <w:tmpl w:val="08090025"/>
@@ -13190,7 +14219,7 @@
       </w:pPr>
     </w:lvl>
   </w:abstractNum>
-  <w:abstractNum w:abstractNumId="13">
+  <w:abstractNum w:abstractNumId="15">
     <w:nsid w:val="3F270B44"/>
     <w:multiLevelType w:val="hybridMultilevel"/>
     <w:tmpl w:val="B8C25E36"/>
@@ -13303,7 +14332,7 @@
       </w:rPr>
     </w:lvl>
   </w:abstractNum>
-  <w:abstractNum w:abstractNumId="14">
+  <w:abstractNum w:abstractNumId="16">
     <w:nsid w:val="49B43EC9"/>
     <w:multiLevelType w:val="hybridMultilevel"/>
     <w:tmpl w:val="C04CC570"/>
@@ -13416,7 +14445,7 @@
       </w:rPr>
     </w:lvl>
   </w:abstractNum>
-  <w:abstractNum w:abstractNumId="15">
+  <w:abstractNum w:abstractNumId="17">
     <w:nsid w:val="52292902"/>
     <w:multiLevelType w:val="hybridMultilevel"/>
     <w:tmpl w:val="C7660ABC"/>
@@ -13529,7 +14558,7 @@
       </w:rPr>
     </w:lvl>
   </w:abstractNum>
-  <w:abstractNum w:abstractNumId="16">
+  <w:abstractNum w:abstractNumId="18">
     <w:nsid w:val="54CA172C"/>
     <w:multiLevelType w:val="hybridMultilevel"/>
     <w:tmpl w:val="0B88BD08"/>
@@ -13615,7 +14644,7 @@
       </w:pPr>
     </w:lvl>
   </w:abstractNum>
-  <w:abstractNum w:abstractNumId="17">
+  <w:abstractNum w:abstractNumId="19">
     <w:nsid w:val="55667FDE"/>
     <w:multiLevelType w:val="hybridMultilevel"/>
     <w:tmpl w:val="5492BC74"/>
@@ -13728,7 +14757,7 @@
       </w:rPr>
     </w:lvl>
   </w:abstractNum>
-  <w:abstractNum w:abstractNumId="18">
+  <w:abstractNum w:abstractNumId="20">
     <w:nsid w:val="5CAB6725"/>
     <w:multiLevelType w:val="hybridMultilevel"/>
     <w:tmpl w:val="7F22D460"/>
@@ -13841,7 +14870,7 @@
       </w:rPr>
     </w:lvl>
   </w:abstractNum>
-  <w:abstractNum w:abstractNumId="19">
+  <w:abstractNum w:abstractNumId="21">
     <w:nsid w:val="5F103C21"/>
     <w:multiLevelType w:val="hybridMultilevel"/>
     <w:tmpl w:val="DBC01600"/>
@@ -13930,7 +14959,7 @@
       </w:pPr>
     </w:lvl>
   </w:abstractNum>
-  <w:abstractNum w:abstractNumId="20">
+  <w:abstractNum w:abstractNumId="22">
     <w:nsid w:val="67C95051"/>
     <w:multiLevelType w:val="hybridMultilevel"/>
     <w:tmpl w:val="1804C8C8"/>
@@ -14043,7 +15072,120 @@
       </w:rPr>
     </w:lvl>
   </w:abstractNum>
-  <w:abstractNum w:abstractNumId="21">
+  <w:abstractNum w:abstractNumId="23">
+    <w:nsid w:val="6CE01FCC"/>
+    <w:multiLevelType w:val="hybridMultilevel"/>
+    <w:tmpl w:val="27904430"/>
+    <w:lvl w:ilvl="0" w:tplc="08090001">
+      <w:start w:val="1"/>
+      <w:numFmt w:val="bullet"/>
+      <w:lvlText w:val=""/>
+      <w:lvlJc w:val="left"/>
+      <w:pPr>
+        <w:ind w:left="720" w:hanging="360"/>
+      </w:pPr>
+      <w:rPr>
+        <w:rFonts w:ascii="Symbol" w:hAnsi="Symbol" w:hint="default"/>
+      </w:rPr>
+    </w:lvl>
+    <w:lvl w:ilvl="1" w:tplc="08090003" w:tentative="1">
+      <w:start w:val="1"/>
+      <w:numFmt w:val="bullet"/>
+      <w:lvlText w:val="o"/>
+      <w:lvlJc w:val="left"/>
+      <w:pPr>
+        <w:ind w:left="1440" w:hanging="360"/>
+      </w:pPr>
+      <w:rPr>
+        <w:rFonts w:ascii="Courier New" w:hAnsi="Courier New" w:cs="Courier New" w:hint="default"/>
+      </w:rPr>
+    </w:lvl>
+    <w:lvl w:ilvl="2" w:tplc="08090005" w:tentative="1">
+      <w:start w:val="1"/>
+      <w:numFmt w:val="bullet"/>
+      <w:lvlText w:val=""/>
+      <w:lvlJc w:val="left"/>
+      <w:pPr>
+        <w:ind w:left="2160" w:hanging="360"/>
+      </w:pPr>
+      <w:rPr>
+        <w:rFonts w:ascii="Wingdings" w:hAnsi="Wingdings" w:hint="default"/>
+      </w:rPr>
+    </w:lvl>
+    <w:lvl w:ilvl="3" w:tplc="08090001" w:tentative="1">
+      <w:start w:val="1"/>
+      <w:numFmt w:val="bullet"/>
+      <w:lvlText w:val=""/>
+      <w:lvlJc w:val="left"/>
+      <w:pPr>
+        <w:ind w:left="2880" w:hanging="360"/>
+      </w:pPr>
+      <w:rPr>
+        <w:rFonts w:ascii="Symbol" w:hAnsi="Symbol" w:hint="default"/>
+      </w:rPr>
+    </w:lvl>
+    <w:lvl w:ilvl="4" w:tplc="08090003" w:tentative="1">
+      <w:start w:val="1"/>
+      <w:numFmt w:val="bullet"/>
+      <w:lvlText w:val="o"/>
+      <w:lvlJc w:val="left"/>
+      <w:pPr>
+        <w:ind w:left="3600" w:hanging="360"/>
+      </w:pPr>
+      <w:rPr>
+        <w:rFonts w:ascii="Courier New" w:hAnsi="Courier New" w:cs="Courier New" w:hint="default"/>
+      </w:rPr>
+    </w:lvl>
+    <w:lvl w:ilvl="5" w:tplc="08090005" w:tentative="1">
+      <w:start w:val="1"/>
+      <w:numFmt w:val="bullet"/>
+      <w:lvlText w:val=""/>
+      <w:lvlJc w:val="left"/>
+      <w:pPr>
+        <w:ind w:left="4320" w:hanging="360"/>
+      </w:pPr>
+      <w:rPr>
+        <w:rFonts w:ascii="Wingdings" w:hAnsi="Wingdings" w:hint="default"/>
+      </w:rPr>
+    </w:lvl>
+    <w:lvl w:ilvl="6" w:tplc="08090001" w:tentative="1">
+      <w:start w:val="1"/>
+      <w:numFmt w:val="bullet"/>
+      <w:lvlText w:val=""/>
+      <w:lvlJc w:val="left"/>
+      <w:pPr>
+        <w:ind w:left="5040" w:hanging="360"/>
+      </w:pPr>
+      <w:rPr>
+        <w:rFonts w:ascii="Symbol" w:hAnsi="Symbol" w:hint="default"/>
+      </w:rPr>
+    </w:lvl>
+    <w:lvl w:ilvl="7" w:tplc="08090003" w:tentative="1">
+      <w:start w:val="1"/>
+      <w:numFmt w:val="bullet"/>
+      <w:lvlText w:val="o"/>
+      <w:lvlJc w:val="left"/>
+      <w:pPr>
+        <w:ind w:left="5760" w:hanging="360"/>
+      </w:pPr>
+      <w:rPr>
+        <w:rFonts w:ascii="Courier New" w:hAnsi="Courier New" w:cs="Courier New" w:hint="default"/>
+      </w:rPr>
+    </w:lvl>
+    <w:lvl w:ilvl="8" w:tplc="08090005" w:tentative="1">
+      <w:start w:val="1"/>
+      <w:numFmt w:val="bullet"/>
+      <w:lvlText w:val=""/>
+      <w:lvlJc w:val="left"/>
+      <w:pPr>
+        <w:ind w:left="6480" w:hanging="360"/>
+      </w:pPr>
+      <w:rPr>
+        <w:rFonts w:ascii="Wingdings" w:hAnsi="Wingdings" w:hint="default"/>
+      </w:rPr>
+    </w:lvl>
+  </w:abstractNum>
+  <w:abstractNum w:abstractNumId="24">
     <w:nsid w:val="72161278"/>
     <w:multiLevelType w:val="hybridMultilevel"/>
     <w:tmpl w:val="8E18B67A"/>
@@ -14129,7 +15271,7 @@
       </w:pPr>
     </w:lvl>
   </w:abstractNum>
-  <w:abstractNum w:abstractNumId="22">
+  <w:abstractNum w:abstractNumId="25">
     <w:nsid w:val="72C52DE3"/>
     <w:multiLevelType w:val="hybridMultilevel"/>
     <w:tmpl w:val="29109174"/>
@@ -14242,7 +15384,7 @@
       </w:rPr>
     </w:lvl>
   </w:abstractNum>
-  <w:abstractNum w:abstractNumId="23">
+  <w:abstractNum w:abstractNumId="26">
     <w:nsid w:val="76277BBE"/>
     <w:multiLevelType w:val="hybridMultilevel"/>
     <w:tmpl w:val="F2EC0C36"/>
@@ -14355,7 +15497,7 @@
       </w:rPr>
     </w:lvl>
   </w:abstractNum>
-  <w:abstractNum w:abstractNumId="24">
+  <w:abstractNum w:abstractNumId="27">
     <w:nsid w:val="77B47D33"/>
     <w:multiLevelType w:val="hybridMultilevel"/>
     <w:tmpl w:val="AA146E8C"/>
@@ -14468,7 +15610,7 @@
       </w:rPr>
     </w:lvl>
   </w:abstractNum>
-  <w:abstractNum w:abstractNumId="25">
+  <w:abstractNum w:abstractNumId="28">
     <w:nsid w:val="7DAB54F1"/>
     <w:multiLevelType w:val="hybridMultilevel"/>
     <w:tmpl w:val="B7A2471E"/>
@@ -14581,7 +15723,7 @@
       </w:rPr>
     </w:lvl>
   </w:abstractNum>
-  <w:abstractNum w:abstractNumId="26">
+  <w:abstractNum w:abstractNumId="29">
     <w:nsid w:val="7F6475FB"/>
     <w:multiLevelType w:val="hybridMultilevel"/>
     <w:tmpl w:val="CD608B4E"/>
@@ -14695,85 +15837,94 @@
     </w:lvl>
   </w:abstractNum>
   <w:num w:numId="1">
+    <w:abstractNumId w:val="14"/>
+  </w:num>
+  <w:num w:numId="2">
+    <w:abstractNumId w:val="5"/>
+  </w:num>
+  <w:num w:numId="3">
+    <w:abstractNumId w:val="7"/>
+  </w:num>
+  <w:num w:numId="4">
+    <w:abstractNumId w:val="21"/>
+  </w:num>
+  <w:num w:numId="5">
+    <w:abstractNumId w:val="25"/>
+  </w:num>
+  <w:num w:numId="6">
+    <w:abstractNumId w:val="16"/>
+  </w:num>
+  <w:num w:numId="7">
+    <w:abstractNumId w:val="6"/>
+  </w:num>
+  <w:num w:numId="8">
+    <w:abstractNumId w:val="8"/>
+  </w:num>
+  <w:num w:numId="9">
+    <w:abstractNumId w:val="29"/>
+  </w:num>
+  <w:num w:numId="10">
+    <w:abstractNumId w:val="27"/>
+  </w:num>
+  <w:num w:numId="11">
+    <w:abstractNumId w:val="28"/>
+  </w:num>
+  <w:num w:numId="12">
+    <w:abstractNumId w:val="22"/>
+  </w:num>
+  <w:num w:numId="13">
+    <w:abstractNumId w:val="11"/>
+  </w:num>
+  <w:num w:numId="14">
     <w:abstractNumId w:val="12"/>
   </w:num>
-  <w:num w:numId="2">
-    <w:abstractNumId w:val="3"/>
+  <w:num w:numId="15">
+    <w:abstractNumId w:val="20"/>
   </w:num>
-  <w:num w:numId="3">
-    <w:abstractNumId w:val="5"/>
+  <w:num w:numId="16">
+    <w:abstractNumId w:val="10"/>
   </w:num>
-  <w:num w:numId="4">
+  <w:num w:numId="17">
+    <w:abstractNumId w:val="18"/>
+  </w:num>
+  <w:num w:numId="18">
+    <w:abstractNumId w:val="2"/>
+  </w:num>
+  <w:num w:numId="19">
+    <w:abstractNumId w:val="17"/>
+  </w:num>
+  <w:num w:numId="20">
+    <w:abstractNumId w:val="1"/>
+  </w:num>
+  <w:num w:numId="21">
+    <w:abstractNumId w:val="15"/>
+  </w:num>
+  <w:num w:numId="22">
+    <w:abstractNumId w:val="13"/>
+  </w:num>
+  <w:num w:numId="23">
+    <w:abstractNumId w:val="9"/>
+  </w:num>
+  <w:num w:numId="24">
+    <w:abstractNumId w:val="4"/>
+  </w:num>
+  <w:num w:numId="25">
     <w:abstractNumId w:val="19"/>
   </w:num>
-  <w:num w:numId="5">
-    <w:abstractNumId w:val="22"/>
+  <w:num w:numId="26">
+    <w:abstractNumId w:val="24"/>
   </w:num>
-  <w:num w:numId="6">
-    <w:abstractNumId w:val="14"/>
-  </w:num>
-  <w:num w:numId="7">
-    <w:abstractNumId w:val="4"/>
-  </w:num>
-  <w:num w:numId="8">
-    <w:abstractNumId w:val="6"/>
-  </w:num>
-  <w:num w:numId="9">
+  <w:num w:numId="27">
     <w:abstractNumId w:val="26"/>
   </w:num>
-  <w:num w:numId="10">
-    <w:abstractNumId w:val="24"/>
-  </w:num>
-  <w:num w:numId="11">
-    <w:abstractNumId w:val="25"/>
-  </w:num>
-  <w:num w:numId="12">
-    <w:abstractNumId w:val="20"/>
-  </w:num>
-  <w:num w:numId="13">
-    <w:abstractNumId w:val="9"/>
-  </w:num>
-  <w:num w:numId="14">
-    <w:abstractNumId w:val="10"/>
-  </w:num>
-  <w:num w:numId="15">
-    <w:abstractNumId w:val="18"/>
-  </w:num>
-  <w:num w:numId="16">
-    <w:abstractNumId w:val="8"/>
-  </w:num>
-  <w:num w:numId="17">
-    <w:abstractNumId w:val="16"/>
-  </w:num>
-  <w:num w:numId="18">
-    <w:abstractNumId w:val="1"/>
-  </w:num>
-  <w:num w:numId="19">
-    <w:abstractNumId w:val="15"/>
-  </w:num>
-  <w:num w:numId="20">
+  <w:num w:numId="28">
     <w:abstractNumId w:val="0"/>
   </w:num>
-  <w:num w:numId="21">
-    <w:abstractNumId w:val="13"/>
+  <w:num w:numId="29">
+    <w:abstractNumId w:val="23"/>
   </w:num>
-  <w:num w:numId="22">
-    <w:abstractNumId w:val="11"/>
-  </w:num>
-  <w:num w:numId="23">
-    <w:abstractNumId w:val="7"/>
-  </w:num>
-  <w:num w:numId="24">
-    <w:abstractNumId w:val="2"/>
-  </w:num>
-  <w:num w:numId="25">
-    <w:abstractNumId w:val="17"/>
-  </w:num>
-  <w:num w:numId="26">
-    <w:abstractNumId w:val="21"/>
-  </w:num>
-  <w:num w:numId="27">
-    <w:abstractNumId w:val="23"/>
+  <w:num w:numId="30">
+    <w:abstractNumId w:val="3"/>
   </w:num>
   <w:numIdMacAtCleanup w:val="18"/>
 </w:numbering>
@@ -15911,7 +17062,7 @@
 </file>
 
 <file path=customXml/itemProps2.xml><?xml version="1.0" encoding="utf-8"?>
-<ds:datastoreItem xmlns:ds="http://schemas.openxmlformats.org/officeDocument/2006/customXml" ds:itemID="{7E11700C-1754-4627-9430-D2F7B5B2B9EA}">
+<ds:datastoreItem xmlns:ds="http://schemas.openxmlformats.org/officeDocument/2006/customXml" ds:itemID="{D5A66D07-EDB6-4B3E-85E8-55CA5654802A}">
   <ds:schemaRefs>
     <ds:schemaRef ds:uri="http://schemas.openxmlformats.org/officeDocument/2006/bibliography"/>
   </ds:schemaRefs>

</xml_diff>

<commit_message>
Remove READ and WRITE
</commit_message>
<xml_diff>
--- a/CPU Design/CpuDesign.docx
+++ b/CPU Design/CpuDesign.docx
@@ -63,7 +63,7 @@
                     <v:path arrowok="t"/>
                   </v:shape>
                 </v:group>
-                <v:rect id="_x0000_s1039" style="position:absolute;left:1800;top:1440;width:8638;height:736;mso-width-percent:1000;mso-position-horizontal:center;mso-position-horizontal-relative:margin;mso-position-vertical:top;mso-position-vertical-relative:margin;mso-width-percent:1000;mso-width-relative:margin;mso-height-relative:margin" filled="f" stroked="f">
+                <v:rect id="_x0000_s1039" style="position:absolute;left:1800;top:1440;width:8638;height:551;mso-width-percent:1000;mso-position-horizontal:center;mso-position-horizontal-relative:margin;mso-position-vertical:top;mso-position-vertical-relative:margin;mso-width-percent:1000;mso-width-relative:margin;mso-height-relative:margin" filled="f" stroked="f">
                   <v:textbox style="mso-next-textbox:#_x0000_s1039;mso-fit-shape-to-text:t">
                     <w:txbxContent>
                       <w:p>
@@ -1733,6 +1733,44 @@
               </w:p>
             </w:tc>
           </w:tr>
+          <w:tr>
+            <w:tc>
+              <w:tcPr>
+                <w:tcW w:w="1384" w:type="dxa"/>
+              </w:tcPr>
+              <w:p>
+                <w:pPr>
+                  <w:rPr>
+                    <w:rFonts w:cstheme="minorHAnsi"/>
+                  </w:rPr>
+                </w:pPr>
+                <w:r>
+                  <w:rPr>
+                    <w:rFonts w:cstheme="minorHAnsi"/>
+                  </w:rPr>
+                  <w:t>30 Jun 2026</w:t>
+                </w:r>
+              </w:p>
+            </w:tc>
+            <w:tc>
+              <w:tcPr>
+                <w:tcW w:w="7858" w:type="dxa"/>
+              </w:tcPr>
+              <w:p>
+                <w:pPr>
+                  <w:rPr>
+                    <w:rFonts w:cstheme="minorHAnsi"/>
+                  </w:rPr>
+                </w:pPr>
+                <w:r>
+                  <w:rPr>
+                    <w:rFonts w:cstheme="minorHAnsi"/>
+                  </w:rPr>
+                  <w:t>Remove READ and WRITE</w:t>
+                </w:r>
+              </w:p>
+            </w:tc>
+          </w:tr>
         </w:tbl>
         <w:p>
           <w:pPr>
@@ -1803,7 +1841,7 @@
           <w:r>
             <w:fldChar w:fldCharType="separate"/>
           </w:r>
-          <w:hyperlink w:anchor="_Toc233631539" w:history="1">
+          <w:hyperlink w:anchor="_Toc233722261" w:history="1">
             <w:r>
               <w:rPr>
                 <w:rStyle w:val="Hyperlink"/>
@@ -1849,7 +1887,7 @@
                 <w:noProof/>
                 <w:webHidden/>
               </w:rPr>
-              <w:instrText xml:space="preserve"> PAGEREF _Toc233631539 \h </w:instrText>
+              <w:instrText xml:space="preserve"> PAGEREF _Toc233722261 \h </w:instrText>
             </w:r>
             <w:r>
               <w:rPr>
@@ -1893,7 +1931,7 @@
               <w:lang w:eastAsia="en-GB"/>
             </w:rPr>
           </w:pPr>
-          <w:hyperlink w:anchor="_Toc233631540" w:history="1">
+          <w:hyperlink w:anchor="_Toc233722262" w:history="1">
             <w:r>
               <w:rPr>
                 <w:rStyle w:val="Hyperlink"/>
@@ -1937,7 +1975,7 @@
                 <w:noProof/>
                 <w:webHidden/>
               </w:rPr>
-              <w:instrText xml:space="preserve"> PAGEREF _Toc233631540 \h </w:instrText>
+              <w:instrText xml:space="preserve"> PAGEREF _Toc233722262 \h </w:instrText>
             </w:r>
             <w:r>
               <w:rPr>
@@ -1981,7 +2019,7 @@
               <w:lang w:eastAsia="en-GB"/>
             </w:rPr>
           </w:pPr>
-          <w:hyperlink w:anchor="_Toc233631541" w:history="1">
+          <w:hyperlink w:anchor="_Toc233722263" w:history="1">
             <w:r>
               <w:rPr>
                 <w:rStyle w:val="Hyperlink"/>
@@ -2023,7 +2061,7 @@
                 <w:noProof/>
                 <w:webHidden/>
               </w:rPr>
-              <w:instrText xml:space="preserve"> PAGEREF _Toc233631541 \h </w:instrText>
+              <w:instrText xml:space="preserve"> PAGEREF _Toc233722263 \h </w:instrText>
             </w:r>
             <w:r>
               <w:rPr>
@@ -2067,7 +2105,7 @@
               <w:lang w:eastAsia="en-GB"/>
             </w:rPr>
           </w:pPr>
-          <w:hyperlink w:anchor="_Toc233631542" w:history="1">
+          <w:hyperlink w:anchor="_Toc233722264" w:history="1">
             <w:r>
               <w:rPr>
                 <w:rStyle w:val="Hyperlink"/>
@@ -2109,7 +2147,7 @@
                 <w:noProof/>
                 <w:webHidden/>
               </w:rPr>
-              <w:instrText xml:space="preserve"> PAGEREF _Toc233631542 \h </w:instrText>
+              <w:instrText xml:space="preserve"> PAGEREF _Toc233722264 \h </w:instrText>
             </w:r>
             <w:r>
               <w:rPr>
@@ -2153,7 +2191,7 @@
               <w:lang w:eastAsia="en-GB"/>
             </w:rPr>
           </w:pPr>
-          <w:hyperlink w:anchor="_Toc233631543" w:history="1">
+          <w:hyperlink w:anchor="_Toc233722265" w:history="1">
             <w:r>
               <w:rPr>
                 <w:rStyle w:val="Hyperlink"/>
@@ -2195,7 +2233,7 @@
                 <w:noProof/>
                 <w:webHidden/>
               </w:rPr>
-              <w:instrText xml:space="preserve"> PAGEREF _Toc233631543 \h </w:instrText>
+              <w:instrText xml:space="preserve"> PAGEREF _Toc233722265 \h </w:instrText>
             </w:r>
             <w:r>
               <w:rPr>
@@ -2215,7 +2253,7 @@
                 <w:noProof/>
                 <w:webHidden/>
               </w:rPr>
-              <w:t>4</w:t>
+              <w:t>3</w:t>
             </w:r>
             <w:r>
               <w:rPr>
@@ -2239,7 +2277,7 @@
               <w:lang w:eastAsia="en-GB"/>
             </w:rPr>
           </w:pPr>
-          <w:hyperlink w:anchor="_Toc233631544" w:history="1">
+          <w:hyperlink w:anchor="_Toc233722266" w:history="1">
             <w:r>
               <w:rPr>
                 <w:rStyle w:val="Hyperlink"/>
@@ -2281,7 +2319,7 @@
                 <w:noProof/>
                 <w:webHidden/>
               </w:rPr>
-              <w:instrText xml:space="preserve"> PAGEREF _Toc233631544 \h </w:instrText>
+              <w:instrText xml:space="preserve"> PAGEREF _Toc233722266 \h </w:instrText>
             </w:r>
             <w:r>
               <w:rPr>
@@ -2301,7 +2339,7 @@
                 <w:noProof/>
                 <w:webHidden/>
               </w:rPr>
-              <w:t>5</w:t>
+              <w:t>4</w:t>
             </w:r>
             <w:r>
               <w:rPr>
@@ -2325,7 +2363,7 @@
               <w:lang w:eastAsia="en-GB"/>
             </w:rPr>
           </w:pPr>
-          <w:hyperlink w:anchor="_Toc233631545" w:history="1">
+          <w:hyperlink w:anchor="_Toc233722267" w:history="1">
             <w:r>
               <w:rPr>
                 <w:rStyle w:val="Hyperlink"/>
@@ -2367,7 +2405,7 @@
                 <w:noProof/>
                 <w:webHidden/>
               </w:rPr>
-              <w:instrText xml:space="preserve"> PAGEREF _Toc233631545 \h </w:instrText>
+              <w:instrText xml:space="preserve"> PAGEREF _Toc233722267 \h </w:instrText>
             </w:r>
             <w:r>
               <w:rPr>
@@ -2387,7 +2425,7 @@
                 <w:noProof/>
                 <w:webHidden/>
               </w:rPr>
-              <w:t>5</w:t>
+              <w:t>4</w:t>
             </w:r>
             <w:r>
               <w:rPr>
@@ -2411,7 +2449,7 @@
               <w:lang w:eastAsia="en-GB"/>
             </w:rPr>
           </w:pPr>
-          <w:hyperlink w:anchor="_Toc233631546" w:history="1">
+          <w:hyperlink w:anchor="_Toc233722268" w:history="1">
             <w:r>
               <w:rPr>
                 <w:rStyle w:val="Hyperlink"/>
@@ -2455,7 +2493,7 @@
                 <w:noProof/>
                 <w:webHidden/>
               </w:rPr>
-              <w:instrText xml:space="preserve"> PAGEREF _Toc233631546 \h </w:instrText>
+              <w:instrText xml:space="preserve"> PAGEREF _Toc233722268 \h </w:instrText>
             </w:r>
             <w:r>
               <w:rPr>
@@ -2475,7 +2513,7 @@
                 <w:noProof/>
                 <w:webHidden/>
               </w:rPr>
-              <w:t>5</w:t>
+              <w:t>4</w:t>
             </w:r>
             <w:r>
               <w:rPr>
@@ -2499,7 +2537,7 @@
               <w:lang w:eastAsia="en-GB"/>
             </w:rPr>
           </w:pPr>
-          <w:hyperlink w:anchor="_Toc233631547" w:history="1">
+          <w:hyperlink w:anchor="_Toc233722269" w:history="1">
             <w:r>
               <w:rPr>
                 <w:rStyle w:val="Hyperlink"/>
@@ -2543,7 +2581,7 @@
                 <w:noProof/>
                 <w:webHidden/>
               </w:rPr>
-              <w:instrText xml:space="preserve"> PAGEREF _Toc233631547 \h </w:instrText>
+              <w:instrText xml:space="preserve"> PAGEREF _Toc233722269 \h </w:instrText>
             </w:r>
             <w:r>
               <w:rPr>
@@ -2563,7 +2601,7 @@
                 <w:noProof/>
                 <w:webHidden/>
               </w:rPr>
-              <w:t>5</w:t>
+              <w:t>4</w:t>
             </w:r>
             <w:r>
               <w:rPr>
@@ -2587,7 +2625,7 @@
               <w:lang w:eastAsia="en-GB"/>
             </w:rPr>
           </w:pPr>
-          <w:hyperlink w:anchor="_Toc233631548" w:history="1">
+          <w:hyperlink w:anchor="_Toc233722270" w:history="1">
             <w:r>
               <w:rPr>
                 <w:rStyle w:val="Hyperlink"/>
@@ -2631,7 +2669,7 @@
                 <w:noProof/>
                 <w:webHidden/>
               </w:rPr>
-              <w:instrText xml:space="preserve"> PAGEREF _Toc233631548 \h </w:instrText>
+              <w:instrText xml:space="preserve"> PAGEREF _Toc233722270 \h </w:instrText>
             </w:r>
             <w:r>
               <w:rPr>
@@ -2651,7 +2689,7 @@
                 <w:noProof/>
                 <w:webHidden/>
               </w:rPr>
-              <w:t>5</w:t>
+              <w:t>4</w:t>
             </w:r>
             <w:r>
               <w:rPr>
@@ -2675,7 +2713,7 @@
               <w:lang w:eastAsia="en-GB"/>
             </w:rPr>
           </w:pPr>
-          <w:hyperlink w:anchor="_Toc233631549" w:history="1">
+          <w:hyperlink w:anchor="_Toc233722271" w:history="1">
             <w:r>
               <w:rPr>
                 <w:rStyle w:val="Hyperlink"/>
@@ -2719,7 +2757,7 @@
                 <w:noProof/>
                 <w:webHidden/>
               </w:rPr>
-              <w:instrText xml:space="preserve"> PAGEREF _Toc233631549 \h </w:instrText>
+              <w:instrText xml:space="preserve"> PAGEREF _Toc233722271 \h </w:instrText>
             </w:r>
             <w:r>
               <w:rPr>
@@ -2739,7 +2777,7 @@
                 <w:noProof/>
                 <w:webHidden/>
               </w:rPr>
-              <w:t>6</w:t>
+              <w:t>4</w:t>
             </w:r>
             <w:r>
               <w:rPr>
@@ -2763,7 +2801,7 @@
               <w:lang w:eastAsia="en-GB"/>
             </w:rPr>
           </w:pPr>
-          <w:hyperlink w:anchor="_Toc233631550" w:history="1">
+          <w:hyperlink w:anchor="_Toc233722272" w:history="1">
             <w:r>
               <w:rPr>
                 <w:rStyle w:val="Hyperlink"/>
@@ -2807,7 +2845,7 @@
                 <w:noProof/>
                 <w:webHidden/>
               </w:rPr>
-              <w:instrText xml:space="preserve"> PAGEREF _Toc233631550 \h </w:instrText>
+              <w:instrText xml:space="preserve"> PAGEREF _Toc233722272 \h </w:instrText>
             </w:r>
             <w:r>
               <w:rPr>
@@ -2827,7 +2865,7 @@
                 <w:noProof/>
                 <w:webHidden/>
               </w:rPr>
-              <w:t>6</w:t>
+              <w:t>5</w:t>
             </w:r>
             <w:r>
               <w:rPr>
@@ -2851,7 +2889,7 @@
               <w:lang w:eastAsia="en-GB"/>
             </w:rPr>
           </w:pPr>
-          <w:hyperlink w:anchor="_Toc233631551" w:history="1">
+          <w:hyperlink w:anchor="_Toc233722273" w:history="1">
             <w:r>
               <w:rPr>
                 <w:rStyle w:val="Hyperlink"/>
@@ -2895,7 +2933,7 @@
                 <w:noProof/>
                 <w:webHidden/>
               </w:rPr>
-              <w:instrText xml:space="preserve"> PAGEREF _Toc233631551 \h </w:instrText>
+              <w:instrText xml:space="preserve"> PAGEREF _Toc233722273 \h </w:instrText>
             </w:r>
             <w:r>
               <w:rPr>
@@ -2915,7 +2953,7 @@
                 <w:noProof/>
                 <w:webHidden/>
               </w:rPr>
-              <w:t>7</w:t>
+              <w:t>6</w:t>
             </w:r>
             <w:r>
               <w:rPr>
@@ -2939,7 +2977,7 @@
               <w:lang w:eastAsia="en-GB"/>
             </w:rPr>
           </w:pPr>
-          <w:hyperlink w:anchor="_Toc233631552" w:history="1">
+          <w:hyperlink w:anchor="_Toc233722274" w:history="1">
             <w:r>
               <w:rPr>
                 <w:rStyle w:val="Hyperlink"/>
@@ -2983,7 +3021,7 @@
                 <w:noProof/>
                 <w:webHidden/>
               </w:rPr>
-              <w:instrText xml:space="preserve"> PAGEREF _Toc233631552 \h </w:instrText>
+              <w:instrText xml:space="preserve"> PAGEREF _Toc233722274 \h </w:instrText>
             </w:r>
             <w:r>
               <w:rPr>
@@ -3003,7 +3041,7 @@
                 <w:noProof/>
                 <w:webHidden/>
               </w:rPr>
-              <w:t>8</w:t>
+              <w:t>6</w:t>
             </w:r>
             <w:r>
               <w:rPr>
@@ -3027,7 +3065,7 @@
               <w:lang w:eastAsia="en-GB"/>
             </w:rPr>
           </w:pPr>
-          <w:hyperlink w:anchor="_Toc233631553" w:history="1">
+          <w:hyperlink w:anchor="_Toc233722275" w:history="1">
             <w:r>
               <w:rPr>
                 <w:rStyle w:val="Hyperlink"/>
@@ -3071,7 +3109,7 @@
                 <w:noProof/>
                 <w:webHidden/>
               </w:rPr>
-              <w:instrText xml:space="preserve"> PAGEREF _Toc233631553 \h </w:instrText>
+              <w:instrText xml:space="preserve"> PAGEREF _Toc233722275 \h </w:instrText>
             </w:r>
             <w:r>
               <w:rPr>
@@ -3091,7 +3129,7 @@
                 <w:noProof/>
                 <w:webHidden/>
               </w:rPr>
-              <w:t>8</w:t>
+              <w:t>6</w:t>
             </w:r>
             <w:r>
               <w:rPr>
@@ -3115,7 +3153,7 @@
               <w:lang w:eastAsia="en-GB"/>
             </w:rPr>
           </w:pPr>
-          <w:hyperlink w:anchor="_Toc233631554" w:history="1">
+          <w:hyperlink w:anchor="_Toc233722276" w:history="1">
             <w:r>
               <w:rPr>
                 <w:rStyle w:val="Hyperlink"/>
@@ -3159,7 +3197,7 @@
                 <w:noProof/>
                 <w:webHidden/>
               </w:rPr>
-              <w:instrText xml:space="preserve"> PAGEREF _Toc233631554 \h </w:instrText>
+              <w:instrText xml:space="preserve"> PAGEREF _Toc233722276 \h </w:instrText>
             </w:r>
             <w:r>
               <w:rPr>
@@ -3179,7 +3217,7 @@
                 <w:noProof/>
                 <w:webHidden/>
               </w:rPr>
-              <w:t>9</w:t>
+              <w:t>7</w:t>
             </w:r>
             <w:r>
               <w:rPr>
@@ -3203,7 +3241,7 @@
               <w:lang w:eastAsia="en-GB"/>
             </w:rPr>
           </w:pPr>
-          <w:hyperlink w:anchor="_Toc233631555" w:history="1">
+          <w:hyperlink w:anchor="_Toc233722277" w:history="1">
             <w:r>
               <w:rPr>
                 <w:rStyle w:val="Hyperlink"/>
@@ -3247,7 +3285,7 @@
                 <w:noProof/>
                 <w:webHidden/>
               </w:rPr>
-              <w:instrText xml:space="preserve"> PAGEREF _Toc233631555 \h </w:instrText>
+              <w:instrText xml:space="preserve"> PAGEREF _Toc233722277 \h </w:instrText>
             </w:r>
             <w:r>
               <w:rPr>
@@ -3267,7 +3305,7 @@
                 <w:noProof/>
                 <w:webHidden/>
               </w:rPr>
-              <w:t>10</w:t>
+              <w:t>8</w:t>
             </w:r>
             <w:r>
               <w:rPr>
@@ -3291,7 +3329,7 @@
               <w:lang w:eastAsia="en-GB"/>
             </w:rPr>
           </w:pPr>
-          <w:hyperlink w:anchor="_Toc233631556" w:history="1">
+          <w:hyperlink w:anchor="_Toc233722278" w:history="1">
             <w:r>
               <w:rPr>
                 <w:rStyle w:val="Hyperlink"/>
@@ -3335,7 +3373,7 @@
                 <w:noProof/>
                 <w:webHidden/>
               </w:rPr>
-              <w:instrText xml:space="preserve"> PAGEREF _Toc233631556 \h </w:instrText>
+              <w:instrText xml:space="preserve"> PAGEREF _Toc233722278 \h </w:instrText>
             </w:r>
             <w:r>
               <w:rPr>
@@ -3355,7 +3393,7 @@
                 <w:noProof/>
                 <w:webHidden/>
               </w:rPr>
-              <w:t>10</w:t>
+              <w:t>8</w:t>
             </w:r>
             <w:r>
               <w:rPr>
@@ -3379,7 +3417,7 @@
               <w:lang w:eastAsia="en-GB"/>
             </w:rPr>
           </w:pPr>
-          <w:hyperlink w:anchor="_Toc233631557" w:history="1">
+          <w:hyperlink w:anchor="_Toc233722279" w:history="1">
             <w:r>
               <w:rPr>
                 <w:rStyle w:val="Hyperlink"/>
@@ -3423,7 +3461,7 @@
                 <w:noProof/>
                 <w:webHidden/>
               </w:rPr>
-              <w:instrText xml:space="preserve"> PAGEREF _Toc233631557 \h </w:instrText>
+              <w:instrText xml:space="preserve"> PAGEREF _Toc233722279 \h </w:instrText>
             </w:r>
             <w:r>
               <w:rPr>
@@ -3443,7 +3481,7 @@
                 <w:noProof/>
                 <w:webHidden/>
               </w:rPr>
-              <w:t>10</w:t>
+              <w:t>8</w:t>
             </w:r>
             <w:r>
               <w:rPr>
@@ -3467,7 +3505,7 @@
               <w:lang w:eastAsia="en-GB"/>
             </w:rPr>
           </w:pPr>
-          <w:hyperlink w:anchor="_Toc233631558" w:history="1">
+          <w:hyperlink w:anchor="_Toc233722280" w:history="1">
             <w:r>
               <w:rPr>
                 <w:rStyle w:val="Hyperlink"/>
@@ -3511,7 +3549,7 @@
                 <w:noProof/>
                 <w:webHidden/>
               </w:rPr>
-              <w:instrText xml:space="preserve"> PAGEREF _Toc233631558 \h </w:instrText>
+              <w:instrText xml:space="preserve"> PAGEREF _Toc233722280 \h </w:instrText>
             </w:r>
             <w:r>
               <w:rPr>
@@ -3531,7 +3569,7 @@
                 <w:noProof/>
                 <w:webHidden/>
               </w:rPr>
-              <w:t>12</w:t>
+              <w:t>10</w:t>
             </w:r>
             <w:r>
               <w:rPr>
@@ -3620,7 +3658,7 @@
         </w:rPr>
         <w:fldChar w:fldCharType="separate"/>
       </w:r>
-      <w:hyperlink w:anchor="_Toc233631559" w:history="1">
+      <w:hyperlink w:anchor="_Toc233722281" w:history="1">
         <w:r>
           <w:rPr>
             <w:rStyle w:val="Hyperlink"/>
@@ -3647,7 +3685,7 @@
             <w:noProof/>
             <w:webHidden/>
           </w:rPr>
-          <w:instrText xml:space="preserve"> PAGEREF _Toc233631559 \h </w:instrText>
+          <w:instrText xml:space="preserve"> PAGEREF _Toc233722281 \h </w:instrText>
         </w:r>
         <w:r>
           <w:rPr>
@@ -3690,7 +3728,7 @@
           <w:lang w:eastAsia="en-GB"/>
         </w:rPr>
       </w:pPr>
-      <w:hyperlink w:anchor="_Toc233631560" w:history="1">
+      <w:hyperlink w:anchor="_Toc233722282" w:history="1">
         <w:r>
           <w:rPr>
             <w:rStyle w:val="Hyperlink"/>
@@ -3717,7 +3755,7 @@
             <w:noProof/>
             <w:webHidden/>
           </w:rPr>
-          <w:instrText xml:space="preserve"> PAGEREF _Toc233631560 \h </w:instrText>
+          <w:instrText xml:space="preserve"> PAGEREF _Toc233722282 \h </w:instrText>
         </w:r>
         <w:r>
           <w:rPr>
@@ -3797,7 +3835,7 @@
           <w:lang w:eastAsia="en-GB"/>
         </w:rPr>
       </w:pPr>
-      <w:bookmarkStart w:id="2" w:name="_Toc233631539"/>
+      <w:bookmarkStart w:id="2" w:name="_Toc233722261"/>
       <w:bookmarkEnd w:id="1"/>
       <w:r>
         <w:rPr>
@@ -3848,7 +3886,7 @@
           <w:lang w:eastAsia="en-GB"/>
         </w:rPr>
       </w:pPr>
-      <w:bookmarkStart w:id="3" w:name="_Toc233631540"/>
+      <w:bookmarkStart w:id="3" w:name="_Toc233722262"/>
       <w:r>
         <w:rPr>
           <w:lang w:eastAsia="en-GB"/>
@@ -3989,7 +4027,7 @@
         <w:jc w:val="center"/>
       </w:pPr>
       <w:bookmarkStart w:id="4" w:name="_Ref232073454"/>
-      <w:bookmarkStart w:id="5" w:name="_Toc233631559"/>
+      <w:bookmarkStart w:id="5" w:name="_Toc233722281"/>
       <w:r>
         <w:t xml:space="preserve">Figure </w:t>
       </w:r>
@@ -4409,7 +4447,7 @@
         <w:pStyle w:val="Heading2"/>
       </w:pPr>
       <w:bookmarkStart w:id="6" w:name="_Ref233631401"/>
-      <w:bookmarkStart w:id="7" w:name="_Toc233631541"/>
+      <w:bookmarkStart w:id="7" w:name="_Toc233722263"/>
       <w:r>
         <w:lastRenderedPageBreak/>
         <w:t xml:space="preserve">Overview of </w:t>
@@ -4496,9 +4534,9 @@
         </w:rPr>
         <w:drawing>
           <wp:inline distT="0" distB="0" distL="0" distR="0">
-            <wp:extent cx="4362450" cy="2716530"/>
+            <wp:extent cx="4343400" cy="1744980"/>
             <wp:effectExtent l="19050" t="0" r="0" b="0"/>
-            <wp:docPr id="4" name="Picture 4"/>
+            <wp:docPr id="7" name="Picture 7"/>
             <wp:cNvGraphicFramePr>
               <a:graphicFrameLocks xmlns:a="http://schemas.openxmlformats.org/drawingml/2006/main" noChangeAspect="1"/>
             </wp:cNvGraphicFramePr>
@@ -4506,7 +4544,7 @@
               <a:graphicData uri="http://schemas.openxmlformats.org/drawingml/2006/picture">
                 <pic:pic xmlns:pic="http://schemas.openxmlformats.org/drawingml/2006/picture">
                   <pic:nvPicPr>
-                    <pic:cNvPr id="0" name="Picture 4"/>
+                    <pic:cNvPr id="0" name="Picture 7"/>
                     <pic:cNvPicPr>
                       <a:picLocks noChangeAspect="1" noChangeArrowheads="1"/>
                     </pic:cNvPicPr>
@@ -4521,7 +4559,7 @@
                   <pic:spPr bwMode="auto">
                     <a:xfrm>
                       <a:off x="0" y="0"/>
-                      <a:ext cx="4362450" cy="2716530"/>
+                      <a:ext cx="4343400" cy="1744980"/>
                     </a:xfrm>
                     <a:prstGeom prst="rect">
                       <a:avLst/>
@@ -4547,7 +4585,7 @@
         <w:jc w:val="center"/>
       </w:pPr>
       <w:bookmarkStart w:id="8" w:name="_Ref233626426"/>
-      <w:bookmarkStart w:id="9" w:name="_Toc233631560"/>
+      <w:bookmarkStart w:id="9" w:name="_Toc233722282"/>
       <w:r>
         <w:t xml:space="preserve">Figure </w:t>
       </w:r>
@@ -4655,10 +4693,10 @@
         </w:numPr>
       </w:pPr>
       <w:r>
-        <w:t xml:space="preserve">WRITE, READ and </w:t>
-      </w:r>
-      <w:r>
-        <w:t>all</w:t>
+        <w:t>A</w:t>
+      </w:r>
+      <w:r>
+        <w:t>ll</w:t>
       </w:r>
       <w:r>
         <w:t xml:space="preserve"> SELECTs are all low. The data bus is floating.</w:t>
@@ -4684,7 +4722,13 @@
         </w:numPr>
       </w:pPr>
       <w:r>
-        <w:t>WRITE and SELECT &lt;SOURCE&gt; go high a short time after the rising edge of T1 CLOCK.</w:t>
+        <w:t>SELECT &lt;SOURCE&gt; go</w:t>
+      </w:r>
+      <w:r>
+        <w:t>es</w:t>
+      </w:r>
+      <w:r>
+        <w:t xml:space="preserve"> high a short time after the rising edge of T1 CLOCK.</w:t>
       </w:r>
     </w:p>
     <w:p>
@@ -4696,7 +4740,13 @@
         </w:numPr>
       </w:pPr>
       <w:r>
-        <w:t xml:space="preserve">DBUS becomes valid a short time after WRITE and SELECT &lt;SOURCE&gt; go high. </w:t>
+        <w:t>DBUS becomes valid a short time after SELECT &lt;SOURCE&gt; go</w:t>
+      </w:r>
+      <w:r>
+        <w:t>es</w:t>
+      </w:r>
+      <w:r>
+        <w:t xml:space="preserve"> high. </w:t>
       </w:r>
     </w:p>
     <w:p>
@@ -4731,10 +4781,16 @@
         </w:numPr>
       </w:pPr>
       <w:r>
-        <w:t xml:space="preserve">READ and SELECT &lt;DESTINATION&gt; </w:t>
-      </w:r>
-      <w:r>
-        <w:t>go high a short time after the rising edge of T2 CLOCK.</w:t>
+        <w:t xml:space="preserve">SELECT &lt;DESTINATION&gt; </w:t>
+      </w:r>
+      <w:r>
+        <w:t>go</w:t>
+      </w:r>
+      <w:r>
+        <w:t>es</w:t>
+      </w:r>
+      <w:r>
+        <w:t xml:space="preserve"> high a short time after the rising edge of T2 CLOCK.</w:t>
       </w:r>
     </w:p>
     <w:p>
@@ -4746,7 +4802,10 @@
         </w:numPr>
       </w:pPr>
       <w:r>
-        <w:t>The selected destination should read the value from DBUS on the rising edge of (READ AND SELECT &lt;DESTINATION&gt;)</w:t>
+        <w:t xml:space="preserve">The selected destination should read the value from DBUS on the rising edge of </w:t>
+      </w:r>
+      <w:r>
+        <w:t>SELECT &lt;DESTINATION&gt;</w:t>
       </w:r>
     </w:p>
     <w:p>
@@ -4769,7 +4828,10 @@
         </w:numPr>
       </w:pPr>
       <w:r>
-        <w:t>WRITE, READ and all SELECTs go low a short time after the rising edge of T3 CLOCK</w:t>
+        <w:t>A</w:t>
+      </w:r>
+      <w:r>
+        <w:t>ll SELECTs go low a short time after the rising edge of T3 CLOCK</w:t>
       </w:r>
     </w:p>
     <w:p>
@@ -4781,104 +4843,40 @@
         </w:numPr>
       </w:pPr>
       <w:r>
-        <w:t>The data bus returns to floating a short time after WRITE and SELECT &lt;SOURCE&gt; go low.</w:t>
-      </w:r>
-    </w:p>
-    <w:p>
+        <w:t>The data bus returns to floating a short time after SELECT &lt;SOURCE&gt; go</w:t>
+      </w:r>
+      <w:r>
+        <w:t>es</w:t>
+      </w:r>
+      <w:r>
+        <w:t xml:space="preserve"> low.</w:t>
+      </w:r>
+    </w:p>
+    <w:p>
+      <w:r>
+        <w:t>The short times referred to in the above text are due to propagation delays</w:t>
+      </w:r>
+      <w:r>
+        <w:t>. All chips take a finite time to change their outputs after a change on their inputs. These times are small and are usually &lt;&lt; 1</w:t>
+      </w:r>
+      <w:r>
+        <w:rPr>
+          <w:rFonts w:cstheme="minorHAnsi"/>
+        </w:rPr>
+        <w:t>µ</w:t>
+      </w:r>
+      <w:r>
+        <w:t>s per chip.</w:t>
+      </w:r>
+    </w:p>
+    <w:p>
+      <w:pPr>
+        <w:pStyle w:val="Heading3"/>
+      </w:pPr>
+      <w:bookmarkStart w:id="10" w:name="_Ref232850548"/>
+      <w:bookmarkStart w:id="11" w:name="_Toc233722264"/>
       <w:r>
         <w:lastRenderedPageBreak/>
-        <w:t>The short times referred to in the above text are due to propagation delays</w:t>
-      </w:r>
-      <w:r>
-        <w:t>. All chips take a finite time to change their outputs after a change on their inputs. These times are small and are usually &lt;&lt; 1</w:t>
-      </w:r>
-      <w:r>
-        <w:rPr>
-          <w:rFonts w:cstheme="minorHAnsi"/>
-        </w:rPr>
-        <w:t>µ</w:t>
-      </w:r>
-      <w:r>
-        <w:t>s per chip.</w:t>
-      </w:r>
-    </w:p>
-    <w:p>
-      <w:pPr>
-        <w:rPr>
-          <w:b/>
-        </w:rPr>
-      </w:pPr>
-      <w:r>
-        <w:rPr>
-          <w:b/>
-        </w:rPr>
-        <w:t xml:space="preserve">Although </w:t>
-      </w:r>
-      <w:r>
-        <w:rPr>
-          <w:b/>
-        </w:rPr>
-        <w:fldChar w:fldCharType="begin"/>
-      </w:r>
-      <w:r>
-        <w:rPr>
-          <w:b/>
-        </w:rPr>
-        <w:instrText xml:space="preserve"> REF _Ref233626426 \h </w:instrText>
-      </w:r>
-      <w:r>
-        <w:rPr>
-          <w:b/>
-        </w:rPr>
-      </w:r>
-      <w:r>
-        <w:rPr>
-          <w:b/>
-        </w:rPr>
-        <w:fldChar w:fldCharType="separate"/>
-      </w:r>
-      <w:r>
-        <w:t xml:space="preserve">Figure </w:t>
-      </w:r>
-      <w:r>
-        <w:rPr>
-          <w:noProof/>
-        </w:rPr>
-        <w:t>2</w:t>
-      </w:r>
-      <w:r>
-        <w:rPr>
-          <w:b/>
-        </w:rPr>
-        <w:fldChar w:fldCharType="end"/>
-      </w:r>
-      <w:r>
-        <w:rPr>
-          <w:b/>
-        </w:rPr>
-        <w:t xml:space="preserve"> shows consistent and matching delays (e.g. for READ and SELECT &lt;DESTINATION&gt;) it must not be assumed that this will be the case in real life. The safest assumption to make for a reliable design is that signals which change after the clock may change immediately after the CLOCK rising edge, or may not change until 1</w:t>
-      </w:r>
-      <w:r>
-        <w:rPr>
-          <w:rFonts w:cstheme="minorHAnsi"/>
-          <w:b/>
-        </w:rPr>
-        <w:t>µ</w:t>
-      </w:r>
-      <w:r>
-        <w:rPr>
-          <w:b/>
-        </w:rPr>
-        <w:t xml:space="preserve">s later.  </w:t>
-      </w:r>
-    </w:p>
-    <w:p>
-      <w:pPr>
-        <w:pStyle w:val="Heading3"/>
-      </w:pPr>
-      <w:bookmarkStart w:id="10" w:name="_Ref232850548"/>
-      <w:bookmarkStart w:id="11" w:name="_Toc233631542"/>
-      <w:r>
         <w:t>Reading f</w:t>
       </w:r>
       <w:r>
@@ -5105,89 +5103,7 @@
         <w:rPr>
           <w:lang w:eastAsia="en-GB"/>
         </w:rPr>
-        <w:t xml:space="preserve">Reading from the data bus is controlled by </w:t>
-      </w:r>
-      <w:r>
-        <w:rPr>
-          <w:lang w:eastAsia="en-GB"/>
-        </w:rPr>
-        <w:fldChar w:fldCharType="begin"/>
-      </w:r>
-      <w:r>
-        <w:rPr>
-          <w:lang w:eastAsia="en-GB"/>
-        </w:rPr>
-        <w:instrText xml:space="preserve"> REF READ \h </w:instrText>
-      </w:r>
-      <w:r>
-        <w:rPr>
-          <w:lang w:eastAsia="en-GB"/>
-        </w:rPr>
-      </w:r>
-      <w:r>
-        <w:rPr>
-          <w:lang w:eastAsia="en-GB"/>
-        </w:rPr>
-        <w:fldChar w:fldCharType="separate"/>
-      </w:r>
-      <w:r>
-        <w:rPr>
-          <w:lang w:eastAsia="en-GB"/>
-        </w:rPr>
-        <w:t>READ</w:t>
-      </w:r>
-      <w:r>
-        <w:rPr>
-          <w:lang w:eastAsia="en-GB"/>
-        </w:rPr>
-        <w:fldChar w:fldCharType="end"/>
-      </w:r>
-      <w:r>
-        <w:rPr>
-          <w:lang w:eastAsia="en-GB"/>
-        </w:rPr>
-        <w:t xml:space="preserve"> (see </w:t>
-      </w:r>
-      <w:r>
-        <w:rPr>
-          <w:lang w:eastAsia="en-GB"/>
-        </w:rPr>
-        <w:fldChar w:fldCharType="begin"/>
-      </w:r>
-      <w:r>
-        <w:rPr>
-          <w:lang w:eastAsia="en-GB"/>
-        </w:rPr>
-        <w:instrText xml:space="preserve"> REF _Ref232084668 \r \h </w:instrText>
-      </w:r>
-      <w:r>
-        <w:rPr>
-          <w:lang w:eastAsia="en-GB"/>
-        </w:rPr>
-      </w:r>
-      <w:r>
-        <w:rPr>
-          <w:lang w:eastAsia="en-GB"/>
-        </w:rPr>
-        <w:fldChar w:fldCharType="separate"/>
-      </w:r>
-      <w:r>
-        <w:rPr>
-          <w:lang w:eastAsia="en-GB"/>
-        </w:rPr>
-        <w:t>3.1</w:t>
-      </w:r>
-      <w:r>
-        <w:rPr>
-          <w:lang w:eastAsia="en-GB"/>
-        </w:rPr>
-        <w:fldChar w:fldCharType="end"/>
-      </w:r>
-      <w:r>
-        <w:rPr>
-          <w:lang w:eastAsia="en-GB"/>
-        </w:rPr>
-        <w:t xml:space="preserve">) and the relevant </w:t>
+        <w:t xml:space="preserve">Reading from the data bus is controlled by the relevant </w:t>
       </w:r>
       <w:proofErr w:type="spellStart"/>
       <w:r>
@@ -5252,48 +5168,13 @@
         <w:rPr>
           <w:lang w:eastAsia="en-GB"/>
         </w:rPr>
-        <w:t xml:space="preserve">then </w:t>
-      </w:r>
-      <w:r>
-        <w:rPr>
-          <w:lang w:eastAsia="en-GB"/>
-        </w:rPr>
-        <w:fldChar w:fldCharType="begin"/>
-      </w:r>
-      <w:r>
-        <w:rPr>
-          <w:lang w:eastAsia="en-GB"/>
-        </w:rPr>
-        <w:instrText xml:space="preserve"> REF READ \h </w:instrText>
-      </w:r>
-      <w:r>
-        <w:rPr>
-          <w:lang w:eastAsia="en-GB"/>
-        </w:rPr>
-      </w:r>
-      <w:r>
-        <w:rPr>
-          <w:lang w:eastAsia="en-GB"/>
-        </w:rPr>
-        <w:fldChar w:fldCharType="separate"/>
-      </w:r>
-      <w:r>
-        <w:rPr>
-          <w:lang w:eastAsia="en-GB"/>
-        </w:rPr>
-        <w:t>READ</w:t>
-      </w:r>
-      <w:r>
-        <w:rPr>
-          <w:lang w:eastAsia="en-GB"/>
-        </w:rPr>
-        <w:fldChar w:fldCharType="end"/>
-      </w:r>
-      <w:r>
-        <w:rPr>
-          <w:lang w:eastAsia="en-GB"/>
-        </w:rPr>
-        <w:t xml:space="preserve"> is ignored</w:t>
+        <w:t>then</w:t>
+      </w:r>
+      <w:r>
+        <w:rPr>
+          <w:lang w:eastAsia="en-GB"/>
+        </w:rPr>
+        <w:t xml:space="preserve"> the device controlled by this signal ignores the data bus value</w:t>
       </w:r>
     </w:p>
     <w:p>
@@ -5329,7 +5210,7 @@
         <w:rPr>
           <w:lang w:eastAsia="en-GB"/>
         </w:rPr>
-        <w:t>Read on rising edge of  (</w:t>
+        <w:t xml:space="preserve">Read on rising edge of  </w:t>
       </w:r>
       <w:proofErr w:type="spellStart"/>
       <w:r>
@@ -5339,31 +5220,6 @@
         <w:t>SELECT_x_DESTx</w:t>
       </w:r>
       <w:proofErr w:type="spellEnd"/>
-      <w:r>
-        <w:rPr>
-          <w:lang w:eastAsia="en-GB"/>
-        </w:rPr>
-        <w:t xml:space="preserve"> </w:t>
-      </w:r>
-      <w:r>
-        <w:rPr>
-          <w:lang w:eastAsia="en-GB"/>
-        </w:rPr>
-        <w:t xml:space="preserve"> AND READ AND </w:t>
-      </w:r>
-      <w:r>
-        <w:rPr>
-          <w:b/>
-          <w:lang w:eastAsia="en-GB"/>
-        </w:rPr>
-        <w:t>!</w:t>
-      </w:r>
-      <w:r>
-        <w:rPr>
-          <w:lang w:eastAsia="en-GB"/>
-        </w:rPr>
-        <w:t>CLOCK)</w:t>
-      </w:r>
     </w:p>
     <w:p>
       <w:pPr>
@@ -5412,30 +5268,26 @@
         <w:rPr>
           <w:lang w:eastAsia="en-GB"/>
         </w:rPr>
-        <w:t xml:space="preserve">  AND READ) is high</w:t>
-      </w:r>
-    </w:p>
-    <w:p>
-      <w:pPr>
-        <w:rPr>
-          <w:rFonts w:asciiTheme="majorHAnsi" w:eastAsiaTheme="majorEastAsia" w:hAnsiTheme="majorHAnsi" w:cstheme="majorBidi"/>
-          <w:b/>
-          <w:bCs/>
-          <w:color w:val="4F81BD" w:themeColor="accent1"/>
-        </w:rPr>
-      </w:pPr>
+        <w:t xml:space="preserve">  AND CLOCK)</w:t>
+      </w:r>
+      <w:r>
+        <w:rPr>
+          <w:lang w:eastAsia="en-GB"/>
+        </w:rPr>
+        <w:t xml:space="preserve"> is high</w:t>
+      </w:r>
       <w:bookmarkStart w:id="12" w:name="_Ref232850585"/>
-      <w:r>
-        <w:br w:type="page"/>
-      </w:r>
     </w:p>
     <w:p>
       <w:pPr>
         <w:pStyle w:val="Heading3"/>
       </w:pPr>
-      <w:bookmarkStart w:id="13" w:name="_Toc233631543"/>
-      <w:r>
-        <w:lastRenderedPageBreak/>
+      <w:bookmarkStart w:id="13" w:name="_Ref233721017"/>
+      <w:bookmarkStart w:id="14" w:name="_Ref233721180"/>
+      <w:bookmarkStart w:id="15" w:name="_Ref233721252"/>
+      <w:bookmarkStart w:id="16" w:name="_Ref233721322"/>
+      <w:bookmarkStart w:id="17" w:name="_Toc233722265"/>
+      <w:r>
         <w:t>Writing t</w:t>
       </w:r>
       <w:r>
@@ -5449,6 +5301,10 @@
       </w:r>
       <w:bookmarkEnd w:id="12"/>
       <w:bookmarkEnd w:id="13"/>
+      <w:bookmarkEnd w:id="14"/>
+      <w:bookmarkEnd w:id="15"/>
+      <w:bookmarkEnd w:id="16"/>
+      <w:bookmarkEnd w:id="17"/>
     </w:p>
     <w:p>
       <w:r>
@@ -5615,89 +5471,7 @@
         <w:rPr>
           <w:lang w:eastAsia="en-GB"/>
         </w:rPr>
-        <w:t xml:space="preserve">Writing to the data bus is controlled by </w:t>
-      </w:r>
-      <w:r>
-        <w:rPr>
-          <w:lang w:eastAsia="en-GB"/>
-        </w:rPr>
-        <w:fldChar w:fldCharType="begin"/>
-      </w:r>
-      <w:r>
-        <w:rPr>
-          <w:lang w:eastAsia="en-GB"/>
-        </w:rPr>
-        <w:instrText xml:space="preserve"> REF WRITE \h </w:instrText>
-      </w:r>
-      <w:r>
-        <w:rPr>
-          <w:lang w:eastAsia="en-GB"/>
-        </w:rPr>
-      </w:r>
-      <w:r>
-        <w:rPr>
-          <w:lang w:eastAsia="en-GB"/>
-        </w:rPr>
-        <w:fldChar w:fldCharType="separate"/>
-      </w:r>
-      <w:r>
-        <w:rPr>
-          <w:lang w:eastAsia="en-GB"/>
-        </w:rPr>
-        <w:t>WRITE</w:t>
-      </w:r>
-      <w:r>
-        <w:rPr>
-          <w:lang w:eastAsia="en-GB"/>
-        </w:rPr>
-        <w:fldChar w:fldCharType="end"/>
-      </w:r>
-      <w:r>
-        <w:rPr>
-          <w:lang w:eastAsia="en-GB"/>
-        </w:rPr>
-        <w:t xml:space="preserve"> (see </w:t>
-      </w:r>
-      <w:r>
-        <w:rPr>
-          <w:lang w:eastAsia="en-GB"/>
-        </w:rPr>
-        <w:fldChar w:fldCharType="begin"/>
-      </w:r>
-      <w:r>
-        <w:rPr>
-          <w:lang w:eastAsia="en-GB"/>
-        </w:rPr>
-        <w:instrText xml:space="preserve"> REF _Ref232084668 \r \h </w:instrText>
-      </w:r>
-      <w:r>
-        <w:rPr>
-          <w:lang w:eastAsia="en-GB"/>
-        </w:rPr>
-      </w:r>
-      <w:r>
-        <w:rPr>
-          <w:lang w:eastAsia="en-GB"/>
-        </w:rPr>
-        <w:fldChar w:fldCharType="separate"/>
-      </w:r>
-      <w:r>
-        <w:rPr>
-          <w:lang w:eastAsia="en-GB"/>
-        </w:rPr>
-        <w:t>3.1</w:t>
-      </w:r>
-      <w:r>
-        <w:rPr>
-          <w:lang w:eastAsia="en-GB"/>
-        </w:rPr>
-        <w:fldChar w:fldCharType="end"/>
-      </w:r>
-      <w:r>
-        <w:rPr>
-          <w:lang w:eastAsia="en-GB"/>
-        </w:rPr>
-        <w:t xml:space="preserve">) and the relevant </w:t>
+        <w:t xml:space="preserve">Writing to the data bus is controlled by the relevant </w:t>
       </w:r>
       <w:proofErr w:type="spellStart"/>
       <w:r>
@@ -5762,60 +5536,13 @@
         <w:rPr>
           <w:lang w:eastAsia="en-GB"/>
         </w:rPr>
-        <w:fldChar w:fldCharType="begin"/>
-      </w:r>
-      <w:r>
-        <w:rPr>
-          <w:lang w:eastAsia="en-GB"/>
-        </w:rPr>
-        <w:instrText xml:space="preserve"> REF WRITE \h </w:instrText>
-      </w:r>
-      <w:r>
-        <w:rPr>
-          <w:lang w:eastAsia="en-GB"/>
-        </w:rPr>
-      </w:r>
-      <w:r>
-        <w:rPr>
-          <w:lang w:eastAsia="en-GB"/>
-        </w:rPr>
-        <w:fldChar w:fldCharType="separate"/>
-      </w:r>
-      <w:r>
-        <w:rPr>
-          <w:lang w:eastAsia="en-GB"/>
-        </w:rPr>
-        <w:t>WRITE</w:t>
-      </w:r>
-      <w:r>
-        <w:rPr>
-          <w:lang w:eastAsia="en-GB"/>
-        </w:rPr>
-        <w:fldChar w:fldCharType="end"/>
-      </w:r>
-      <w:r>
-        <w:rPr>
-          <w:lang w:eastAsia="en-GB"/>
-        </w:rPr>
-        <w:t xml:space="preserve"> is ignored</w:t>
-      </w:r>
-    </w:p>
-    <w:p>
-      <w:pPr>
-        <w:pStyle w:val="ListParagraph"/>
-        <w:numPr>
-          <w:ilvl w:val="1"/>
-          <w:numId w:val="24"/>
-        </w:numPr>
-        <w:rPr>
-          <w:lang w:eastAsia="en-GB"/>
-        </w:rPr>
-      </w:pPr>
-      <w:r>
-        <w:rPr>
-          <w:lang w:eastAsia="en-GB"/>
-        </w:rPr>
-        <w:t xml:space="preserve">The device outputs </w:t>
+        <w:t>t</w:t>
+      </w:r>
+      <w:r>
+        <w:rPr>
+          <w:lang w:eastAsia="en-GB"/>
+        </w:rPr>
+        <w:t xml:space="preserve">he device outputs </w:t>
       </w:r>
       <w:r>
         <w:rPr>
@@ -5865,48 +5592,7 @@
         <w:rPr>
           <w:lang w:eastAsia="en-GB"/>
         </w:rPr>
-        <w:t xml:space="preserve"> and </w:t>
-      </w:r>
-      <w:r>
-        <w:rPr>
-          <w:lang w:eastAsia="en-GB"/>
-        </w:rPr>
-        <w:fldChar w:fldCharType="begin"/>
-      </w:r>
-      <w:r>
-        <w:rPr>
-          <w:lang w:eastAsia="en-GB"/>
-        </w:rPr>
-        <w:instrText xml:space="preserve"> REF WRITE \h </w:instrText>
-      </w:r>
-      <w:r>
-        <w:rPr>
-          <w:lang w:eastAsia="en-GB"/>
-        </w:rPr>
-      </w:r>
-      <w:r>
-        <w:rPr>
-          <w:lang w:eastAsia="en-GB"/>
-        </w:rPr>
-        <w:fldChar w:fldCharType="separate"/>
-      </w:r>
-      <w:r>
-        <w:rPr>
-          <w:lang w:eastAsia="en-GB"/>
-        </w:rPr>
-        <w:t>WRITE</w:t>
-      </w:r>
-      <w:r>
-        <w:rPr>
-          <w:lang w:eastAsia="en-GB"/>
-        </w:rPr>
-        <w:fldChar w:fldCharType="end"/>
-      </w:r>
-      <w:r>
-        <w:rPr>
-          <w:lang w:eastAsia="en-GB"/>
-        </w:rPr>
-        <w:t xml:space="preserve"> is high, </w:t>
+        <w:t xml:space="preserve">, </w:t>
       </w:r>
       <w:r>
         <w:rPr>
@@ -5937,13 +5623,13 @@
       <w:pPr>
         <w:pStyle w:val="Heading2"/>
       </w:pPr>
-      <w:bookmarkStart w:id="14" w:name="_Ref232849573"/>
-      <w:bookmarkStart w:id="15" w:name="_Toc233631544"/>
+      <w:bookmarkStart w:id="18" w:name="_Ref232849573"/>
+      <w:bookmarkStart w:id="19" w:name="_Toc233722266"/>
       <w:r>
         <w:t>Overview of GP and SP registers</w:t>
       </w:r>
-      <w:bookmarkEnd w:id="14"/>
-      <w:bookmarkEnd w:id="15"/>
+      <w:bookmarkEnd w:id="18"/>
+      <w:bookmarkEnd w:id="19"/>
     </w:p>
     <w:p>
       <w:r>
@@ -5965,15 +5651,15 @@
       <w:pPr>
         <w:pStyle w:val="Heading3"/>
       </w:pPr>
-      <w:bookmarkStart w:id="16" w:name="_Ref232926928"/>
-      <w:bookmarkStart w:id="17" w:name="_Ref232926933"/>
-      <w:bookmarkStart w:id="18" w:name="_Toc233631545"/>
+      <w:bookmarkStart w:id="20" w:name="_Ref232926928"/>
+      <w:bookmarkStart w:id="21" w:name="_Ref232926933"/>
+      <w:bookmarkStart w:id="22" w:name="_Toc233722267"/>
       <w:r>
         <w:t>SP Behaviour</w:t>
       </w:r>
-      <w:bookmarkEnd w:id="16"/>
-      <w:bookmarkEnd w:id="17"/>
-      <w:bookmarkEnd w:id="18"/>
+      <w:bookmarkEnd w:id="20"/>
+      <w:bookmarkEnd w:id="21"/>
+      <w:bookmarkEnd w:id="22"/>
     </w:p>
     <w:p>
       <w:r>
@@ -6089,15 +5775,15 @@
           <w:lang w:eastAsia="en-GB"/>
         </w:rPr>
       </w:pPr>
-      <w:bookmarkStart w:id="19" w:name="_Ref172648415"/>
-      <w:bookmarkStart w:id="20" w:name="_Toc233631546"/>
+      <w:bookmarkStart w:id="23" w:name="_Ref172648415"/>
+      <w:bookmarkStart w:id="24" w:name="_Toc233722268"/>
       <w:r>
         <w:rPr>
           <w:lang w:eastAsia="en-GB"/>
         </w:rPr>
         <w:t>Other Busses</w:t>
       </w:r>
-      <w:bookmarkEnd w:id="20"/>
+      <w:bookmarkEnd w:id="24"/>
     </w:p>
     <w:p>
       <w:pPr>
@@ -6795,22 +6481,22 @@
           <w:lang w:eastAsia="en-GB"/>
         </w:rPr>
       </w:pPr>
-      <w:bookmarkStart w:id="21" w:name="_Ref232084668"/>
-      <w:bookmarkStart w:id="22" w:name="_Ref232084946"/>
-      <w:bookmarkStart w:id="23" w:name="_Ref232086890"/>
-      <w:bookmarkStart w:id="24" w:name="_Ref232086990"/>
-      <w:bookmarkStart w:id="25" w:name="_Toc233631547"/>
+      <w:bookmarkStart w:id="25" w:name="_Ref232084668"/>
+      <w:bookmarkStart w:id="26" w:name="_Ref232084946"/>
+      <w:bookmarkStart w:id="27" w:name="_Ref232086890"/>
+      <w:bookmarkStart w:id="28" w:name="_Ref232086990"/>
+      <w:bookmarkStart w:id="29" w:name="_Toc233722269"/>
       <w:r>
         <w:rPr>
           <w:lang w:eastAsia="en-GB"/>
         </w:rPr>
         <w:t>Common bus signals</w:t>
       </w:r>
-      <w:bookmarkEnd w:id="21"/>
-      <w:bookmarkEnd w:id="22"/>
-      <w:bookmarkEnd w:id="23"/>
-      <w:bookmarkEnd w:id="24"/>
       <w:bookmarkEnd w:id="25"/>
+      <w:bookmarkEnd w:id="26"/>
+      <w:bookmarkEnd w:id="27"/>
+      <w:bookmarkEnd w:id="28"/>
+      <w:bookmarkEnd w:id="29"/>
     </w:p>
     <w:p>
       <w:pPr>
@@ -6889,102 +6575,18 @@
     </w:p>
     <w:p>
       <w:pPr>
-        <w:pStyle w:val="ListParagraph"/>
-        <w:numPr>
-          <w:ilvl w:val="0"/>
-          <w:numId w:val="5"/>
-        </w:numPr>
-        <w:rPr>
-          <w:lang w:eastAsia="en-GB"/>
-        </w:rPr>
-      </w:pPr>
-      <w:bookmarkStart w:id="26" w:name="READ"/>
-      <w:r>
-        <w:rPr>
-          <w:lang w:eastAsia="en-GB"/>
-        </w:rPr>
-        <w:t>READ</w:t>
-      </w:r>
-      <w:bookmarkEnd w:id="26"/>
-      <w:r>
-        <w:rPr>
-          <w:lang w:eastAsia="en-GB"/>
-        </w:rPr>
-        <w:t xml:space="preserve"> (tells which ever device has been selected as the destination for a data bus transfer to read from the data bus)</w:t>
-      </w:r>
-    </w:p>
-    <w:p>
-      <w:pPr>
-        <w:pStyle w:val="ListParagraph"/>
-        <w:numPr>
-          <w:ilvl w:val="0"/>
-          <w:numId w:val="5"/>
-        </w:numPr>
-        <w:rPr>
-          <w:lang w:eastAsia="en-GB"/>
-        </w:rPr>
-      </w:pPr>
-      <w:bookmarkStart w:id="27" w:name="WRITE"/>
-      <w:r>
-        <w:rPr>
-          <w:lang w:eastAsia="en-GB"/>
-        </w:rPr>
-        <w:t>WRITE</w:t>
-      </w:r>
-      <w:bookmarkEnd w:id="27"/>
-      <w:r>
-        <w:rPr>
-          <w:lang w:eastAsia="en-GB"/>
-        </w:rPr>
-        <w:t xml:space="preserve"> (tells which ever device has been selected as the source for a data bus transfer to write to the data bus) </w:t>
-      </w:r>
-    </w:p>
-    <w:p>
-      <w:pPr>
         <w:pStyle w:val="Heading2"/>
         <w:rPr>
           <w:lang w:eastAsia="en-GB"/>
         </w:rPr>
       </w:pPr>
-      <w:bookmarkStart w:id="28" w:name="_Ref232081276"/>
-      <w:bookmarkStart w:id="29" w:name="_Toc233631548"/>
+      <w:bookmarkStart w:id="30" w:name="_Ref232081276"/>
+      <w:bookmarkStart w:id="31" w:name="_Toc233722270"/>
       <w:r>
         <w:rPr>
           <w:lang w:eastAsia="en-GB"/>
         </w:rPr>
         <w:t>ADDRESS bus</w:t>
-      </w:r>
-      <w:bookmarkEnd w:id="28"/>
-      <w:bookmarkEnd w:id="29"/>
-    </w:p>
-    <w:p>
-      <w:pPr>
-        <w:rPr>
-          <w:lang w:eastAsia="en-GB"/>
-        </w:rPr>
-      </w:pPr>
-      <w:r>
-        <w:rPr>
-          <w:lang w:eastAsia="en-GB"/>
-        </w:rPr>
-        <w:t>This is simply the 16 bit output of the PC register. It’s always enabled and there are no other control signals associated with it.</w:t>
-      </w:r>
-    </w:p>
-    <w:p>
-      <w:pPr>
-        <w:pStyle w:val="Heading2"/>
-        <w:rPr>
-          <w:lang w:eastAsia="en-GB"/>
-        </w:rPr>
-      </w:pPr>
-      <w:bookmarkStart w:id="30" w:name="_Ref232081291"/>
-      <w:bookmarkStart w:id="31" w:name="_Toc233631549"/>
-      <w:r>
-        <w:rPr>
-          <w:lang w:eastAsia="en-GB"/>
-        </w:rPr>
-        <w:lastRenderedPageBreak/>
-        <w:t>OP CODE bus</w:t>
       </w:r>
       <w:bookmarkEnd w:id="30"/>
       <w:bookmarkEnd w:id="31"/>
@@ -6999,9 +6601,8 @@
         <w:rPr>
           <w:lang w:eastAsia="en-GB"/>
         </w:rPr>
-        <w:t>This is simply the 16 bit output of the ROM. It’s always enabled and there are no other control signals associated with it.</w:t>
-      </w:r>
-      <w:bookmarkStart w:id="32" w:name="_Ref232081293"/>
+        <w:t>This is simply the 16 bit output of the PC register. It’s always enabled and there are no other control signals associated with it.</w:t>
+      </w:r>
     </w:p>
     <w:p>
       <w:pPr>
@@ -7010,17 +6611,50 @@
           <w:lang w:eastAsia="en-GB"/>
         </w:rPr>
       </w:pPr>
-      <w:bookmarkStart w:id="33" w:name="_Ref233021496"/>
-      <w:bookmarkStart w:id="34" w:name="_Toc233631550"/>
-      <w:r>
-        <w:rPr>
-          <w:lang w:eastAsia="en-GB"/>
-        </w:rPr>
-        <w:t>PC CTRL bus</w:t>
+      <w:bookmarkStart w:id="32" w:name="_Ref232081291"/>
+      <w:bookmarkStart w:id="33" w:name="_Toc233722271"/>
+      <w:r>
+        <w:rPr>
+          <w:lang w:eastAsia="en-GB"/>
+        </w:rPr>
+        <w:t>OP CODE bus</w:t>
       </w:r>
       <w:bookmarkEnd w:id="32"/>
       <w:bookmarkEnd w:id="33"/>
+    </w:p>
+    <w:p>
+      <w:pPr>
+        <w:rPr>
+          <w:lang w:eastAsia="en-GB"/>
+        </w:rPr>
+      </w:pPr>
+      <w:r>
+        <w:rPr>
+          <w:lang w:eastAsia="en-GB"/>
+        </w:rPr>
+        <w:t>This is simply the 16 bit output of the ROM. It’s always enabled and there are no other control signals associated with it.</w:t>
+      </w:r>
+      <w:bookmarkStart w:id="34" w:name="_Ref232081293"/>
+    </w:p>
+    <w:p>
+      <w:pPr>
+        <w:pStyle w:val="Heading2"/>
+        <w:rPr>
+          <w:lang w:eastAsia="en-GB"/>
+        </w:rPr>
+      </w:pPr>
+      <w:bookmarkStart w:id="35" w:name="_Ref233021496"/>
+      <w:bookmarkStart w:id="36" w:name="_Toc233722272"/>
+      <w:r>
+        <w:rPr>
+          <w:lang w:eastAsia="en-GB"/>
+        </w:rPr>
+        <w:lastRenderedPageBreak/>
+        <w:t>PC CTRL bus</w:t>
+      </w:r>
       <w:bookmarkEnd w:id="34"/>
+      <w:bookmarkEnd w:id="35"/>
+      <w:bookmarkEnd w:id="36"/>
     </w:p>
     <w:p>
       <w:pPr>
@@ -7252,19 +6886,54 @@
         <w:rPr>
           <w:lang w:eastAsia="en-GB"/>
         </w:rPr>
-        <w:t xml:space="preserve">This doesn’t cause it to </w:t>
-      </w:r>
-      <w:r>
-        <w:rPr>
-          <w:lang w:eastAsia="en-GB"/>
-        </w:rPr>
-        <w:t>input from the data bus, it’s a precursor to reading from the data bus</w:t>
-      </w:r>
-      <w:r>
-        <w:rPr>
-          <w:lang w:eastAsia="en-GB"/>
-        </w:rPr>
-        <w:t xml:space="preserve"> – see READ below.</w:t>
+        <w:t xml:space="preserve">See </w:t>
+      </w:r>
+      <w:r>
+        <w:rPr>
+          <w:lang w:eastAsia="en-GB"/>
+        </w:rPr>
+        <w:fldChar w:fldCharType="begin"/>
+      </w:r>
+      <w:r>
+        <w:rPr>
+          <w:lang w:eastAsia="en-GB"/>
+        </w:rPr>
+        <w:instrText xml:space="preserve"> REF _Ref232850548 \r \h </w:instrText>
+      </w:r>
+      <w:r>
+        <w:rPr>
+          <w:lang w:eastAsia="en-GB"/>
+        </w:rPr>
+      </w:r>
+      <w:r>
+        <w:rPr>
+          <w:lang w:eastAsia="en-GB"/>
+        </w:rPr>
+        <w:fldChar w:fldCharType="separate"/>
+      </w:r>
+      <w:r>
+        <w:rPr>
+          <w:lang w:eastAsia="en-GB"/>
+        </w:rPr>
+        <w:t>2.1.1</w:t>
+      </w:r>
+      <w:r>
+        <w:rPr>
+          <w:lang w:eastAsia="en-GB"/>
+        </w:rPr>
+        <w:fldChar w:fldCharType="end"/>
+      </w:r>
+      <w:r>
+        <w:rPr>
+          <w:lang w:eastAsia="en-GB"/>
+        </w:rPr>
+        <w:t xml:space="preserve"> for details of how to read from the data bus</w:t>
+      </w:r>
+      <w:r>
+        <w:rPr>
+          <w:lang w:eastAsia="en-GB"/>
+        </w:rPr>
+        <w:t>.</w:t>
       </w:r>
     </w:p>
     <w:p>
@@ -7282,65 +6951,6 @@
         <w:rPr>
           <w:lang w:eastAsia="en-GB"/>
         </w:rPr>
-        <w:t xml:space="preserve">READ (common defined in </w:t>
-      </w:r>
-      <w:r>
-        <w:rPr>
-          <w:lang w:eastAsia="en-GB"/>
-        </w:rPr>
-        <w:fldChar w:fldCharType="begin"/>
-      </w:r>
-      <w:r>
-        <w:rPr>
-          <w:lang w:eastAsia="en-GB"/>
-        </w:rPr>
-        <w:instrText xml:space="preserve"> REF _Ref232084668 \r \h </w:instrText>
-      </w:r>
-      <w:r>
-        <w:rPr>
-          <w:lang w:eastAsia="en-GB"/>
-        </w:rPr>
-      </w:r>
-      <w:r>
-        <w:rPr>
-          <w:lang w:eastAsia="en-GB"/>
-        </w:rPr>
-        <w:fldChar w:fldCharType="separate"/>
-      </w:r>
-      <w:r>
-        <w:rPr>
-          <w:lang w:eastAsia="en-GB"/>
-        </w:rPr>
-        <w:t>3.1</w:t>
-      </w:r>
-      <w:r>
-        <w:rPr>
-          <w:lang w:eastAsia="en-GB"/>
-        </w:rPr>
-        <w:fldChar w:fldCharType="end"/>
-      </w:r>
-      <w:r>
-        <w:rPr>
-          <w:lang w:eastAsia="en-GB"/>
-        </w:rPr>
-        <w:t>)</w:t>
-      </w:r>
-    </w:p>
-    <w:p>
-      <w:pPr>
-        <w:pStyle w:val="ListParagraph"/>
-        <w:numPr>
-          <w:ilvl w:val="0"/>
-          <w:numId w:val="6"/>
-        </w:numPr>
-        <w:rPr>
-          <w:lang w:eastAsia="en-GB"/>
-        </w:rPr>
-      </w:pPr>
-      <w:r>
-        <w:rPr>
-          <w:lang w:eastAsia="en-GB"/>
-        </w:rPr>
         <w:t>SELECT_PC_SRC</w:t>
       </w:r>
       <w:r>
@@ -7407,31 +7017,7 @@
         <w:rPr>
           <w:lang w:eastAsia="en-GB"/>
         </w:rPr>
-        <w:t>This doesn’t cause it to output on the data bus, it’s a precursor to writing on the data bus</w:t>
-      </w:r>
-      <w:r>
-        <w:rPr>
-          <w:lang w:eastAsia="en-GB"/>
-        </w:rPr>
-        <w:t xml:space="preserve"> – see WRITE below</w:t>
-      </w:r>
-    </w:p>
-    <w:p>
-      <w:pPr>
-        <w:pStyle w:val="ListParagraph"/>
-        <w:numPr>
-          <w:ilvl w:val="0"/>
-          <w:numId w:val="6"/>
-        </w:numPr>
-        <w:rPr>
-          <w:lang w:eastAsia="en-GB"/>
-        </w:rPr>
-      </w:pPr>
-      <w:r>
-        <w:rPr>
-          <w:lang w:eastAsia="en-GB"/>
-        </w:rPr>
-        <w:t xml:space="preserve">WRITE (common defined in </w:t>
+        <w:t xml:space="preserve">See </w:t>
       </w:r>
       <w:r>
         <w:rPr>
@@ -7443,7 +7029,7 @@
         <w:rPr>
           <w:lang w:eastAsia="en-GB"/>
         </w:rPr>
-        <w:instrText xml:space="preserve"> REF _Ref232084946 \r \h </w:instrText>
+        <w:instrText xml:space="preserve"> REF _Ref233721017 \r \h </w:instrText>
       </w:r>
       <w:r>
         <w:rPr>
@@ -7460,7 +7046,7 @@
         <w:rPr>
           <w:lang w:eastAsia="en-GB"/>
         </w:rPr>
-        <w:t>3.1</w:t>
+        <w:t>2.1.2</w:t>
       </w:r>
       <w:r>
         <w:rPr>
@@ -7472,7 +7058,7 @@
         <w:rPr>
           <w:lang w:eastAsia="en-GB"/>
         </w:rPr>
-        <w:t>)</w:t>
+        <w:t xml:space="preserve"> for details of how to write to the data bus</w:t>
       </w:r>
     </w:p>
     <w:p>
@@ -7523,7 +7109,7 @@
           <w:lang w:eastAsia="en-GB"/>
         </w:rPr>
       </w:pPr>
-      <w:bookmarkStart w:id="35" w:name="_Ref232081296"/>
+      <w:bookmarkStart w:id="37" w:name="_Ref232081296"/>
       <w:r>
         <w:rPr>
           <w:lang w:eastAsia="en-GB"/>
@@ -7538,8 +7124,8 @@
           <w:lang w:eastAsia="en-GB"/>
         </w:rPr>
       </w:pPr>
-      <w:bookmarkStart w:id="36" w:name="_Ref232090743"/>
-      <w:bookmarkStart w:id="37" w:name="_Toc233631551"/>
+      <w:bookmarkStart w:id="38" w:name="_Ref232090743"/>
+      <w:bookmarkStart w:id="39" w:name="_Toc233722273"/>
       <w:r>
         <w:rPr>
           <w:lang w:eastAsia="en-GB"/>
@@ -7547,9 +7133,9 @@
         <w:lastRenderedPageBreak/>
         <w:t>IO CTRL bus</w:t>
       </w:r>
-      <w:bookmarkEnd w:id="35"/>
-      <w:bookmarkEnd w:id="36"/>
       <w:bookmarkEnd w:id="37"/>
+      <w:bookmarkEnd w:id="38"/>
+      <w:bookmarkEnd w:id="39"/>
     </w:p>
     <w:p>
       <w:pPr>
@@ -7775,19 +7361,54 @@
         <w:rPr>
           <w:lang w:eastAsia="en-GB"/>
         </w:rPr>
-        <w:t xml:space="preserve">This doesn’t cause it to </w:t>
-      </w:r>
-      <w:r>
-        <w:rPr>
-          <w:lang w:eastAsia="en-GB"/>
-        </w:rPr>
-        <w:t>input from the data bus, it’s a precursor to reading from the data bus</w:t>
-      </w:r>
-      <w:r>
-        <w:rPr>
-          <w:lang w:eastAsia="en-GB"/>
-        </w:rPr>
-        <w:t xml:space="preserve"> – see READ below.</w:t>
+        <w:t xml:space="preserve">See </w:t>
+      </w:r>
+      <w:r>
+        <w:rPr>
+          <w:lang w:eastAsia="en-GB"/>
+        </w:rPr>
+        <w:fldChar w:fldCharType="begin"/>
+      </w:r>
+      <w:r>
+        <w:rPr>
+          <w:lang w:eastAsia="en-GB"/>
+        </w:rPr>
+        <w:instrText xml:space="preserve"> REF _Ref232850548 \r \h </w:instrText>
+      </w:r>
+      <w:r>
+        <w:rPr>
+          <w:lang w:eastAsia="en-GB"/>
+        </w:rPr>
+      </w:r>
+      <w:r>
+        <w:rPr>
+          <w:lang w:eastAsia="en-GB"/>
+        </w:rPr>
+        <w:fldChar w:fldCharType="separate"/>
+      </w:r>
+      <w:r>
+        <w:rPr>
+          <w:lang w:eastAsia="en-GB"/>
+        </w:rPr>
+        <w:t>2.1.1</w:t>
+      </w:r>
+      <w:r>
+        <w:rPr>
+          <w:lang w:eastAsia="en-GB"/>
+        </w:rPr>
+        <w:fldChar w:fldCharType="end"/>
+      </w:r>
+      <w:r>
+        <w:rPr>
+          <w:lang w:eastAsia="en-GB"/>
+        </w:rPr>
+        <w:t xml:space="preserve"> for details of how to read from the data bus</w:t>
+      </w:r>
+      <w:r>
+        <w:rPr>
+          <w:lang w:eastAsia="en-GB"/>
+        </w:rPr>
+        <w:t>.</w:t>
       </w:r>
     </w:p>
     <w:p>
@@ -7841,19 +7462,54 @@
         <w:rPr>
           <w:lang w:eastAsia="en-GB"/>
         </w:rPr>
-        <w:t xml:space="preserve">This doesn’t cause it to </w:t>
-      </w:r>
-      <w:r>
-        <w:rPr>
-          <w:lang w:eastAsia="en-GB"/>
-        </w:rPr>
-        <w:t>input from the data bus, it’s a precursor to reading from the data bus</w:t>
-      </w:r>
-      <w:r>
-        <w:rPr>
-          <w:lang w:eastAsia="en-GB"/>
-        </w:rPr>
-        <w:t xml:space="preserve"> – see READ below.</w:t>
+        <w:t xml:space="preserve">See </w:t>
+      </w:r>
+      <w:r>
+        <w:rPr>
+          <w:lang w:eastAsia="en-GB"/>
+        </w:rPr>
+        <w:fldChar w:fldCharType="begin"/>
+      </w:r>
+      <w:r>
+        <w:rPr>
+          <w:lang w:eastAsia="en-GB"/>
+        </w:rPr>
+        <w:instrText xml:space="preserve"> REF _Ref232850548 \r \h </w:instrText>
+      </w:r>
+      <w:r>
+        <w:rPr>
+          <w:lang w:eastAsia="en-GB"/>
+        </w:rPr>
+      </w:r>
+      <w:r>
+        <w:rPr>
+          <w:lang w:eastAsia="en-GB"/>
+        </w:rPr>
+        <w:fldChar w:fldCharType="separate"/>
+      </w:r>
+      <w:r>
+        <w:rPr>
+          <w:lang w:eastAsia="en-GB"/>
+        </w:rPr>
+        <w:t>2.1.1</w:t>
+      </w:r>
+      <w:r>
+        <w:rPr>
+          <w:lang w:eastAsia="en-GB"/>
+        </w:rPr>
+        <w:fldChar w:fldCharType="end"/>
+      </w:r>
+      <w:r>
+        <w:rPr>
+          <w:lang w:eastAsia="en-GB"/>
+        </w:rPr>
+        <w:t xml:space="preserve"> for details of how to read from the data bus</w:t>
+      </w:r>
+      <w:r>
+        <w:rPr>
+          <w:lang w:eastAsia="en-GB"/>
+        </w:rPr>
+        <w:t>.</w:t>
       </w:r>
     </w:p>
     <w:p>
@@ -7871,7 +7527,43 @@
         <w:rPr>
           <w:lang w:eastAsia="en-GB"/>
         </w:rPr>
-        <w:t xml:space="preserve">READ (common defined in </w:t>
+        <w:t>SELECT_PNV_SRC</w:t>
+      </w:r>
+    </w:p>
+    <w:p>
+      <w:pPr>
+        <w:pStyle w:val="ListParagraph"/>
+        <w:numPr>
+          <w:ilvl w:val="1"/>
+          <w:numId w:val="7"/>
+        </w:numPr>
+        <w:rPr>
+          <w:lang w:eastAsia="en-GB"/>
+        </w:rPr>
+      </w:pPr>
+      <w:r>
+        <w:rPr>
+          <w:lang w:eastAsia="en-GB"/>
+        </w:rPr>
+        <w:t>Selects the Port Value Latch, for the port whose number is contained in the Port Number Latch, to be the source that is going to write to the data bus.</w:t>
+      </w:r>
+    </w:p>
+    <w:p>
+      <w:pPr>
+        <w:pStyle w:val="ListParagraph"/>
+        <w:numPr>
+          <w:ilvl w:val="1"/>
+          <w:numId w:val="7"/>
+        </w:numPr>
+        <w:rPr>
+          <w:lang w:eastAsia="en-GB"/>
+        </w:rPr>
+      </w:pPr>
+      <w:r>
+        <w:rPr>
+          <w:lang w:eastAsia="en-GB"/>
+        </w:rPr>
+        <w:t xml:space="preserve">See </w:t>
       </w:r>
       <w:r>
         <w:rPr>
@@ -7883,7 +7575,7 @@
         <w:rPr>
           <w:lang w:eastAsia="en-GB"/>
         </w:rPr>
-        <w:instrText xml:space="preserve"> REF _Ref232084668 \r \h </w:instrText>
+        <w:instrText xml:space="preserve"> REF _Ref233721180 \r \h </w:instrText>
       </w:r>
       <w:r>
         <w:rPr>
@@ -7900,7 +7592,7 @@
         <w:rPr>
           <w:lang w:eastAsia="en-GB"/>
         </w:rPr>
-        <w:t>3.1</w:t>
+        <w:t>2.1.2</w:t>
       </w:r>
       <w:r>
         <w:rPr>
@@ -7912,7 +7604,106 @@
         <w:rPr>
           <w:lang w:eastAsia="en-GB"/>
         </w:rPr>
+        <w:t xml:space="preserve"> for details of how to write to the data bus</w:t>
+      </w:r>
+      <w:bookmarkStart w:id="40" w:name="_Ref232081299"/>
+    </w:p>
+    <w:p>
+      <w:pPr>
+        <w:pStyle w:val="Heading2"/>
+        <w:rPr>
+          <w:lang w:eastAsia="en-GB"/>
+        </w:rPr>
+      </w:pPr>
+      <w:bookmarkStart w:id="41" w:name="_Ref232090753"/>
+      <w:bookmarkStart w:id="42" w:name="_Toc233722274"/>
+      <w:r>
+        <w:rPr>
+          <w:lang w:eastAsia="en-GB"/>
+        </w:rPr>
+        <w:t>RAM CTRL bus</w:t>
+      </w:r>
+      <w:bookmarkEnd w:id="40"/>
+      <w:bookmarkEnd w:id="41"/>
+      <w:bookmarkEnd w:id="42"/>
+    </w:p>
+    <w:p>
+      <w:pPr>
+        <w:rPr>
+          <w:lang w:eastAsia="en-GB"/>
+        </w:rPr>
+      </w:pPr>
+      <w:r>
+        <w:rPr>
+          <w:lang w:eastAsia="en-GB"/>
+        </w:rPr>
+        <w:t>To read from, or write to RAM, the RAM address must</w:t>
+      </w:r>
+      <w:r>
+        <w:rPr>
+          <w:lang w:eastAsia="en-GB"/>
+        </w:rPr>
+        <w:t xml:space="preserve"> first be put on the RAM ADDR bus (see </w:t>
+      </w:r>
+      <w:r>
+        <w:rPr>
+          <w:lang w:eastAsia="en-GB"/>
+        </w:rPr>
+        <w:fldChar w:fldCharType="begin"/>
+      </w:r>
+      <w:r>
+        <w:rPr>
+          <w:lang w:eastAsia="en-GB"/>
+        </w:rPr>
+        <w:instrText xml:space="preserve"> REF _Ref233191365 \r \h </w:instrText>
+      </w:r>
+      <w:r>
+        <w:rPr>
+          <w:lang w:eastAsia="en-GB"/>
+        </w:rPr>
+      </w:r>
+      <w:r>
+        <w:rPr>
+          <w:lang w:eastAsia="en-GB"/>
+        </w:rPr>
+        <w:fldChar w:fldCharType="separate"/>
+      </w:r>
+      <w:r>
+        <w:rPr>
+          <w:lang w:eastAsia="en-GB"/>
+        </w:rPr>
+        <w:t>3.7</w:t>
+      </w:r>
+      <w:r>
+        <w:rPr>
+          <w:lang w:eastAsia="en-GB"/>
+        </w:rPr>
+        <w:fldChar w:fldCharType="end"/>
+      </w:r>
+      <w:r>
+        <w:rPr>
+          <w:lang w:eastAsia="en-GB"/>
+        </w:rPr>
         <w:t>)</w:t>
+      </w:r>
+      <w:r>
+        <w:rPr>
+          <w:lang w:eastAsia="en-GB"/>
+        </w:rPr>
+        <w:t>.</w:t>
+      </w:r>
+    </w:p>
+    <w:p>
+      <w:pPr>
+        <w:rPr>
+          <w:lang w:eastAsia="en-GB"/>
+        </w:rPr>
+      </w:pPr>
+      <w:r>
+        <w:rPr>
+          <w:lang w:eastAsia="en-GB"/>
+        </w:rPr>
+        <w:t>The signals on this bus are:</w:t>
       </w:r>
     </w:p>
     <w:p>
@@ -7930,7 +7721,66 @@
         <w:rPr>
           <w:lang w:eastAsia="en-GB"/>
         </w:rPr>
-        <w:t>SELECT_PNV_SRC</w:t>
+        <w:t xml:space="preserve">CLOCK (common defined in </w:t>
+      </w:r>
+      <w:r>
+        <w:rPr>
+          <w:lang w:eastAsia="en-GB"/>
+        </w:rPr>
+        <w:fldChar w:fldCharType="begin"/>
+      </w:r>
+      <w:r>
+        <w:rPr>
+          <w:lang w:eastAsia="en-GB"/>
+        </w:rPr>
+        <w:instrText xml:space="preserve"> REF _Ref232084668 \r \h </w:instrText>
+      </w:r>
+      <w:r>
+        <w:rPr>
+          <w:lang w:eastAsia="en-GB"/>
+        </w:rPr>
+      </w:r>
+      <w:r>
+        <w:rPr>
+          <w:lang w:eastAsia="en-GB"/>
+        </w:rPr>
+        <w:fldChar w:fldCharType="separate"/>
+      </w:r>
+      <w:r>
+        <w:rPr>
+          <w:lang w:eastAsia="en-GB"/>
+        </w:rPr>
+        <w:t>3.1</w:t>
+      </w:r>
+      <w:r>
+        <w:rPr>
+          <w:lang w:eastAsia="en-GB"/>
+        </w:rPr>
+        <w:fldChar w:fldCharType="end"/>
+      </w:r>
+      <w:r>
+        <w:rPr>
+          <w:lang w:eastAsia="en-GB"/>
+        </w:rPr>
+        <w:t>)</w:t>
+      </w:r>
+    </w:p>
+    <w:p>
+      <w:pPr>
+        <w:pStyle w:val="ListParagraph"/>
+        <w:numPr>
+          <w:ilvl w:val="0"/>
+          <w:numId w:val="7"/>
+        </w:numPr>
+        <w:rPr>
+          <w:lang w:eastAsia="en-GB"/>
+        </w:rPr>
+      </w:pPr>
+      <w:r>
+        <w:rPr>
+          <w:lang w:eastAsia="en-GB"/>
+        </w:rPr>
+        <w:t>SELECT_RAM_DEST</w:t>
       </w:r>
     </w:p>
     <w:p>
@@ -7948,7 +7798,7 @@
         <w:rPr>
           <w:lang w:eastAsia="en-GB"/>
         </w:rPr>
-        <w:t>Selects the Port Value Latch, for the port whose number is contained in the Port Number Latch, to be the source that is going to write to the data bus.</w:t>
+        <w:t>Selects the RAM to be the destination for something else writing to the data bus.</w:t>
       </w:r>
     </w:p>
     <w:p>
@@ -7966,13 +7816,54 @@
         <w:rPr>
           <w:lang w:eastAsia="en-GB"/>
         </w:rPr>
-        <w:t>This doesn’t cause it to output on the data bus, it’s a precursor to writing on the data bus</w:t>
-      </w:r>
-      <w:r>
-        <w:rPr>
-          <w:lang w:eastAsia="en-GB"/>
-        </w:rPr>
-        <w:t xml:space="preserve"> – see WRITE below</w:t>
+        <w:t xml:space="preserve">See </w:t>
+      </w:r>
+      <w:r>
+        <w:rPr>
+          <w:lang w:eastAsia="en-GB"/>
+        </w:rPr>
+        <w:fldChar w:fldCharType="begin"/>
+      </w:r>
+      <w:r>
+        <w:rPr>
+          <w:lang w:eastAsia="en-GB"/>
+        </w:rPr>
+        <w:instrText xml:space="preserve"> REF _Ref232850548 \r \h </w:instrText>
+      </w:r>
+      <w:r>
+        <w:rPr>
+          <w:lang w:eastAsia="en-GB"/>
+        </w:rPr>
+      </w:r>
+      <w:r>
+        <w:rPr>
+          <w:lang w:eastAsia="en-GB"/>
+        </w:rPr>
+        <w:fldChar w:fldCharType="separate"/>
+      </w:r>
+      <w:r>
+        <w:rPr>
+          <w:lang w:eastAsia="en-GB"/>
+        </w:rPr>
+        <w:t>2.1.1</w:t>
+      </w:r>
+      <w:r>
+        <w:rPr>
+          <w:lang w:eastAsia="en-GB"/>
+        </w:rPr>
+        <w:fldChar w:fldCharType="end"/>
+      </w:r>
+      <w:r>
+        <w:rPr>
+          <w:lang w:eastAsia="en-GB"/>
+        </w:rPr>
+        <w:t xml:space="preserve"> for details of how to read from the data bus</w:t>
+      </w:r>
+      <w:r>
+        <w:rPr>
+          <w:lang w:eastAsia="en-GB"/>
+        </w:rPr>
+        <w:t>.</w:t>
       </w:r>
     </w:p>
     <w:p>
@@ -7990,7 +7881,67 @@
         <w:rPr>
           <w:lang w:eastAsia="en-GB"/>
         </w:rPr>
-        <w:t xml:space="preserve">WRITE (common defined in </w:t>
+        <w:t>SELECT_</w:t>
+      </w:r>
+      <w:r>
+        <w:rPr>
+          <w:lang w:eastAsia="en-GB"/>
+        </w:rPr>
+        <w:t>RAM</w:t>
+      </w:r>
+      <w:r>
+        <w:rPr>
+          <w:lang w:eastAsia="en-GB"/>
+        </w:rPr>
+        <w:t>_SRC</w:t>
+      </w:r>
+    </w:p>
+    <w:p>
+      <w:pPr>
+        <w:pStyle w:val="ListParagraph"/>
+        <w:numPr>
+          <w:ilvl w:val="1"/>
+          <w:numId w:val="7"/>
+        </w:numPr>
+        <w:rPr>
+          <w:lang w:eastAsia="en-GB"/>
+        </w:rPr>
+      </w:pPr>
+      <w:r>
+        <w:rPr>
+          <w:lang w:eastAsia="en-GB"/>
+        </w:rPr>
+        <w:t xml:space="preserve">Selects the </w:t>
+      </w:r>
+      <w:r>
+        <w:rPr>
+          <w:lang w:eastAsia="en-GB"/>
+        </w:rPr>
+        <w:t>RAM to be the source</w:t>
+      </w:r>
+      <w:r>
+        <w:rPr>
+          <w:lang w:eastAsia="en-GB"/>
+        </w:rPr>
+        <w:t xml:space="preserve"> that is going to write to the data bus.</w:t>
+      </w:r>
+    </w:p>
+    <w:p>
+      <w:pPr>
+        <w:pStyle w:val="ListParagraph"/>
+        <w:numPr>
+          <w:ilvl w:val="1"/>
+          <w:numId w:val="7"/>
+        </w:numPr>
+        <w:rPr>
+          <w:lang w:eastAsia="en-GB"/>
+        </w:rPr>
+      </w:pPr>
+      <w:r>
+        <w:rPr>
+          <w:lang w:eastAsia="en-GB"/>
+        </w:rPr>
+        <w:t xml:space="preserve">See </w:t>
       </w:r>
       <w:r>
         <w:rPr>
@@ -8002,7 +7953,7 @@
         <w:rPr>
           <w:lang w:eastAsia="en-GB"/>
         </w:rPr>
-        <w:instrText xml:space="preserve"> REF _Ref232084946 \r \h </w:instrText>
+        <w:instrText xml:space="preserve"> REF _Ref233721252 \r \h </w:instrText>
       </w:r>
       <w:r>
         <w:rPr>
@@ -8019,7 +7970,7 @@
         <w:rPr>
           <w:lang w:eastAsia="en-GB"/>
         </w:rPr>
-        <w:t>3.1</w:t>
+        <w:t>2.1.2</w:t>
       </w:r>
       <w:r>
         <w:rPr>
@@ -8031,8 +7982,98 @@
         <w:rPr>
           <w:lang w:eastAsia="en-GB"/>
         </w:rPr>
-        <w:t>)</w:t>
-      </w:r>
+        <w:t xml:space="preserve"> for details of how to write to the data bus</w:t>
+      </w:r>
+    </w:p>
+    <w:p>
+      <w:pPr>
+        <w:pStyle w:val="Heading2"/>
+        <w:rPr>
+          <w:lang w:eastAsia="en-GB"/>
+        </w:rPr>
+      </w:pPr>
+      <w:bookmarkStart w:id="43" w:name="_Ref233191365"/>
+      <w:bookmarkStart w:id="44" w:name="_Toc233722275"/>
+      <w:r>
+        <w:rPr>
+          <w:lang w:eastAsia="en-GB"/>
+        </w:rPr>
+        <w:t>RAM ADDR Bus</w:t>
+      </w:r>
+      <w:bookmarkEnd w:id="43"/>
+      <w:bookmarkEnd w:id="44"/>
+    </w:p>
+    <w:p>
+      <w:pPr>
+        <w:rPr>
+          <w:lang w:eastAsia="en-GB"/>
+        </w:rPr>
+      </w:pPr>
+      <w:r>
+        <w:rPr>
+          <w:lang w:eastAsia="en-GB"/>
+        </w:rPr>
+        <w:t xml:space="preserve">This will contain up to 16 bits (for a 64K x 16 </w:t>
+      </w:r>
+      <w:proofErr w:type="gramStart"/>
+      <w:r>
+        <w:rPr>
+          <w:lang w:eastAsia="en-GB"/>
+        </w:rPr>
+        <w:t>bit</w:t>
+      </w:r>
+      <w:proofErr w:type="gramEnd"/>
+      <w:r>
+        <w:rPr>
+          <w:lang w:eastAsia="en-GB"/>
+        </w:rPr>
+        <w:t xml:space="preserve"> RAM). If the size is &lt; 64K </w:t>
+      </w:r>
+      <w:proofErr w:type="gramStart"/>
+      <w:r>
+        <w:rPr>
+          <w:lang w:eastAsia="en-GB"/>
+        </w:rPr>
+        <w:t>less</w:t>
+      </w:r>
+      <w:proofErr w:type="gramEnd"/>
+      <w:r>
+        <w:rPr>
+          <w:lang w:eastAsia="en-GB"/>
+        </w:rPr>
+        <w:t xml:space="preserve"> bits will be required on the address bus. &lt;</w:t>
+      </w:r>
+      <w:proofErr w:type="spellStart"/>
+      <w:proofErr w:type="gramStart"/>
+      <w:r>
+        <w:rPr>
+          <w:lang w:eastAsia="en-GB"/>
+        </w:rPr>
+        <w:t>tbd</w:t>
+      </w:r>
+      <w:proofErr w:type="spellEnd"/>
+      <w:proofErr w:type="gramEnd"/>
+      <w:r>
+        <w:rPr>
+          <w:lang w:eastAsia="en-GB"/>
+        </w:rPr>
+        <w:t xml:space="preserve"> Earth to decide RAM size, but this isn’t urgent or blocking any work ATM&gt;</w:t>
+      </w:r>
+    </w:p>
+    <w:p>
+      <w:pPr>
+        <w:rPr>
+          <w:lang w:eastAsia="en-GB"/>
+        </w:rPr>
+      </w:pPr>
+      <w:proofErr w:type="gramStart"/>
+      <w:r>
+        <w:rPr>
+          <w:lang w:eastAsia="en-GB"/>
+        </w:rPr>
+        <w:t>The IS will write the correct value to this bus before doing any data transfers to / from RAM.</w:t>
+      </w:r>
+      <w:proofErr w:type="gramEnd"/>
     </w:p>
     <w:p>
       <w:pPr>
@@ -8046,7 +8087,7 @@
           <w:lang w:eastAsia="en-GB"/>
         </w:rPr>
       </w:pPr>
-      <w:bookmarkStart w:id="38" w:name="_Ref232081299"/>
+      <w:bookmarkStart w:id="45" w:name="_Ref232081305"/>
       <w:r>
         <w:rPr>
           <w:lang w:eastAsia="en-GB"/>
@@ -8061,86 +8102,18 @@
           <w:lang w:eastAsia="en-GB"/>
         </w:rPr>
       </w:pPr>
-      <w:bookmarkStart w:id="39" w:name="_Ref232090753"/>
-      <w:bookmarkStart w:id="40" w:name="_Toc233631552"/>
+      <w:bookmarkStart w:id="46" w:name="_Ref232851000"/>
+      <w:bookmarkStart w:id="47" w:name="_Toc233722276"/>
       <w:r>
         <w:rPr>
           <w:lang w:eastAsia="en-GB"/>
         </w:rPr>
         <w:lastRenderedPageBreak/>
-        <w:t>RAM CTRL bus</w:t>
-      </w:r>
-      <w:bookmarkEnd w:id="38"/>
-      <w:bookmarkEnd w:id="39"/>
-      <w:bookmarkEnd w:id="40"/>
-    </w:p>
-    <w:p>
-      <w:pPr>
-        <w:rPr>
-          <w:lang w:eastAsia="en-GB"/>
-        </w:rPr>
-      </w:pPr>
-      <w:bookmarkStart w:id="41" w:name="CurrentEditPos"/>
-      <w:bookmarkEnd w:id="41"/>
-      <w:r>
-        <w:rPr>
-          <w:lang w:eastAsia="en-GB"/>
-        </w:rPr>
-        <w:t>To read from, or write to RAM, the RAM address must</w:t>
-      </w:r>
-      <w:r>
-        <w:rPr>
-          <w:lang w:eastAsia="en-GB"/>
-        </w:rPr>
-        <w:t xml:space="preserve"> first be put on the RAM ADDR bus (see </w:t>
-      </w:r>
-      <w:r>
-        <w:rPr>
-          <w:lang w:eastAsia="en-GB"/>
-        </w:rPr>
-        <w:fldChar w:fldCharType="begin"/>
-      </w:r>
-      <w:r>
-        <w:rPr>
-          <w:lang w:eastAsia="en-GB"/>
-        </w:rPr>
-        <w:instrText xml:space="preserve"> REF _Ref233191365 \r \h </w:instrText>
-      </w:r>
-      <w:r>
-        <w:rPr>
-          <w:lang w:eastAsia="en-GB"/>
-        </w:rPr>
-      </w:r>
-      <w:r>
-        <w:rPr>
-          <w:lang w:eastAsia="en-GB"/>
-        </w:rPr>
-        <w:fldChar w:fldCharType="separate"/>
-      </w:r>
-      <w:r>
-        <w:rPr>
-          <w:lang w:eastAsia="en-GB"/>
-        </w:rPr>
-        <w:t>3.7</w:t>
-      </w:r>
-      <w:r>
-        <w:rPr>
-          <w:lang w:eastAsia="en-GB"/>
-        </w:rPr>
-        <w:fldChar w:fldCharType="end"/>
-      </w:r>
-      <w:r>
-        <w:rPr>
-          <w:lang w:eastAsia="en-GB"/>
-        </w:rPr>
-        <w:t>)</w:t>
-      </w:r>
-      <w:r>
-        <w:rPr>
-          <w:lang w:eastAsia="en-GB"/>
-        </w:rPr>
-        <w:t>.</w:t>
-      </w:r>
+        <w:t>ALU CTRL bus</w:t>
+      </w:r>
+      <w:bookmarkEnd w:id="45"/>
+      <w:bookmarkEnd w:id="46"/>
+      <w:bookmarkEnd w:id="47"/>
     </w:p>
     <w:p>
       <w:pPr>
@@ -8225,12 +8198,14 @@
           <w:lang w:eastAsia="en-GB"/>
         </w:rPr>
       </w:pPr>
-      <w:r>
-        <w:rPr>
-          <w:lang w:eastAsia="en-GB"/>
-        </w:rPr>
-        <w:t>SELECT_RAM_DEST</w:t>
-      </w:r>
+      <w:bookmarkStart w:id="48" w:name="ALU_MODE"/>
+      <w:r>
+        <w:rPr>
+          <w:lang w:eastAsia="en-GB"/>
+        </w:rPr>
+        <w:t>ALU_MODE</w:t>
+      </w:r>
+      <w:bookmarkEnd w:id="48"/>
     </w:p>
     <w:p>
       <w:pPr>
@@ -8247,7 +8222,31 @@
         <w:rPr>
           <w:lang w:eastAsia="en-GB"/>
         </w:rPr>
-        <w:t>Selects the RAM to be the destination for something else writing to the data bus.</w:t>
+        <w:t>Define</w:t>
+      </w:r>
+      <w:r>
+        <w:rPr>
+          <w:lang w:eastAsia="en-GB"/>
+        </w:rPr>
+        <w:t>s</w:t>
+      </w:r>
+      <w:r>
+        <w:rPr>
+          <w:lang w:eastAsia="en-GB"/>
+        </w:rPr>
+        <w:t xml:space="preserve"> what operation the ALU is going to perfo</w:t>
+      </w:r>
+      <w:r>
+        <w:rPr>
+          <w:lang w:eastAsia="en-GB"/>
+        </w:rPr>
+        <w:t>r</w:t>
+      </w:r>
+      <w:r>
+        <w:rPr>
+          <w:lang w:eastAsia="en-GB"/>
+        </w:rPr>
+        <w:t>m.</w:t>
       </w:r>
     </w:p>
     <w:p>
@@ -8265,502 +8264,6 @@
         <w:rPr>
           <w:lang w:eastAsia="en-GB"/>
         </w:rPr>
-        <w:t xml:space="preserve">This doesn’t cause it to </w:t>
-      </w:r>
-      <w:r>
-        <w:rPr>
-          <w:lang w:eastAsia="en-GB"/>
-        </w:rPr>
-        <w:t>input from the data bus, it’s a precursor to reading from the data bus</w:t>
-      </w:r>
-      <w:r>
-        <w:rPr>
-          <w:lang w:eastAsia="en-GB"/>
-        </w:rPr>
-        <w:t xml:space="preserve"> – see READ below.</w:t>
-      </w:r>
-    </w:p>
-    <w:p>
-      <w:pPr>
-        <w:pStyle w:val="ListParagraph"/>
-        <w:numPr>
-          <w:ilvl w:val="0"/>
-          <w:numId w:val="7"/>
-        </w:numPr>
-        <w:rPr>
-          <w:lang w:eastAsia="en-GB"/>
-        </w:rPr>
-      </w:pPr>
-      <w:r>
-        <w:rPr>
-          <w:lang w:eastAsia="en-GB"/>
-        </w:rPr>
-        <w:t xml:space="preserve">READ (common defined in </w:t>
-      </w:r>
-      <w:r>
-        <w:rPr>
-          <w:lang w:eastAsia="en-GB"/>
-        </w:rPr>
-        <w:fldChar w:fldCharType="begin"/>
-      </w:r>
-      <w:r>
-        <w:rPr>
-          <w:lang w:eastAsia="en-GB"/>
-        </w:rPr>
-        <w:instrText xml:space="preserve"> REF _Ref232084668 \r \h </w:instrText>
-      </w:r>
-      <w:r>
-        <w:rPr>
-          <w:lang w:eastAsia="en-GB"/>
-        </w:rPr>
-      </w:r>
-      <w:r>
-        <w:rPr>
-          <w:lang w:eastAsia="en-GB"/>
-        </w:rPr>
-        <w:fldChar w:fldCharType="separate"/>
-      </w:r>
-      <w:r>
-        <w:rPr>
-          <w:lang w:eastAsia="en-GB"/>
-        </w:rPr>
-        <w:t>3.1</w:t>
-      </w:r>
-      <w:r>
-        <w:rPr>
-          <w:lang w:eastAsia="en-GB"/>
-        </w:rPr>
-        <w:fldChar w:fldCharType="end"/>
-      </w:r>
-      <w:r>
-        <w:rPr>
-          <w:lang w:eastAsia="en-GB"/>
-        </w:rPr>
-        <w:t>)</w:t>
-      </w:r>
-    </w:p>
-    <w:p>
-      <w:pPr>
-        <w:pStyle w:val="ListParagraph"/>
-        <w:numPr>
-          <w:ilvl w:val="0"/>
-          <w:numId w:val="7"/>
-        </w:numPr>
-        <w:rPr>
-          <w:lang w:eastAsia="en-GB"/>
-        </w:rPr>
-      </w:pPr>
-      <w:r>
-        <w:rPr>
-          <w:lang w:eastAsia="en-GB"/>
-        </w:rPr>
-        <w:t>SELECT_</w:t>
-      </w:r>
-      <w:r>
-        <w:rPr>
-          <w:lang w:eastAsia="en-GB"/>
-        </w:rPr>
-        <w:t>RAM</w:t>
-      </w:r>
-      <w:r>
-        <w:rPr>
-          <w:lang w:eastAsia="en-GB"/>
-        </w:rPr>
-        <w:t>_SRC</w:t>
-      </w:r>
-    </w:p>
-    <w:p>
-      <w:pPr>
-        <w:pStyle w:val="ListParagraph"/>
-        <w:numPr>
-          <w:ilvl w:val="1"/>
-          <w:numId w:val="7"/>
-        </w:numPr>
-        <w:rPr>
-          <w:lang w:eastAsia="en-GB"/>
-        </w:rPr>
-      </w:pPr>
-      <w:r>
-        <w:rPr>
-          <w:lang w:eastAsia="en-GB"/>
-        </w:rPr>
-        <w:t xml:space="preserve">Selects the </w:t>
-      </w:r>
-      <w:r>
-        <w:rPr>
-          <w:lang w:eastAsia="en-GB"/>
-        </w:rPr>
-        <w:t>RAM to be the source</w:t>
-      </w:r>
-      <w:r>
-        <w:rPr>
-          <w:lang w:eastAsia="en-GB"/>
-        </w:rPr>
-        <w:t xml:space="preserve"> that is going to write to the data bus.</w:t>
-      </w:r>
-    </w:p>
-    <w:p>
-      <w:pPr>
-        <w:pStyle w:val="ListParagraph"/>
-        <w:numPr>
-          <w:ilvl w:val="1"/>
-          <w:numId w:val="7"/>
-        </w:numPr>
-        <w:rPr>
-          <w:lang w:eastAsia="en-GB"/>
-        </w:rPr>
-      </w:pPr>
-      <w:r>
-        <w:rPr>
-          <w:lang w:eastAsia="en-GB"/>
-        </w:rPr>
-        <w:t>This doesn’t cause it to output on the data bus, it’s a precursor to writing on the data bus</w:t>
-      </w:r>
-      <w:r>
-        <w:rPr>
-          <w:lang w:eastAsia="en-GB"/>
-        </w:rPr>
-        <w:t xml:space="preserve"> – see WRITE below</w:t>
-      </w:r>
-    </w:p>
-    <w:p>
-      <w:pPr>
-        <w:pStyle w:val="ListParagraph"/>
-        <w:numPr>
-          <w:ilvl w:val="0"/>
-          <w:numId w:val="7"/>
-        </w:numPr>
-        <w:rPr>
-          <w:lang w:eastAsia="en-GB"/>
-        </w:rPr>
-      </w:pPr>
-      <w:r>
-        <w:rPr>
-          <w:lang w:eastAsia="en-GB"/>
-        </w:rPr>
-        <w:t xml:space="preserve">WRITE (common defined in </w:t>
-      </w:r>
-      <w:r>
-        <w:rPr>
-          <w:lang w:eastAsia="en-GB"/>
-        </w:rPr>
-        <w:fldChar w:fldCharType="begin"/>
-      </w:r>
-      <w:r>
-        <w:rPr>
-          <w:lang w:eastAsia="en-GB"/>
-        </w:rPr>
-        <w:instrText xml:space="preserve"> REF _Ref232084946 \r \h </w:instrText>
-      </w:r>
-      <w:r>
-        <w:rPr>
-          <w:lang w:eastAsia="en-GB"/>
-        </w:rPr>
-      </w:r>
-      <w:r>
-        <w:rPr>
-          <w:lang w:eastAsia="en-GB"/>
-        </w:rPr>
-        <w:fldChar w:fldCharType="separate"/>
-      </w:r>
-      <w:r>
-        <w:rPr>
-          <w:lang w:eastAsia="en-GB"/>
-        </w:rPr>
-        <w:t>3.1</w:t>
-      </w:r>
-      <w:r>
-        <w:rPr>
-          <w:lang w:eastAsia="en-GB"/>
-        </w:rPr>
-        <w:fldChar w:fldCharType="end"/>
-      </w:r>
-      <w:r>
-        <w:rPr>
-          <w:lang w:eastAsia="en-GB"/>
-        </w:rPr>
-        <w:t>)</w:t>
-      </w:r>
-    </w:p>
-    <w:p>
-      <w:pPr>
-        <w:pStyle w:val="Heading2"/>
-        <w:rPr>
-          <w:lang w:eastAsia="en-GB"/>
-        </w:rPr>
-      </w:pPr>
-      <w:bookmarkStart w:id="42" w:name="_Ref233191365"/>
-      <w:bookmarkStart w:id="43" w:name="_Toc233631553"/>
-      <w:r>
-        <w:rPr>
-          <w:lang w:eastAsia="en-GB"/>
-        </w:rPr>
-        <w:t>RAM ADDR Bus</w:t>
-      </w:r>
-      <w:bookmarkEnd w:id="42"/>
-      <w:bookmarkEnd w:id="43"/>
-    </w:p>
-    <w:p>
-      <w:pPr>
-        <w:rPr>
-          <w:lang w:eastAsia="en-GB"/>
-        </w:rPr>
-      </w:pPr>
-      <w:r>
-        <w:rPr>
-          <w:lang w:eastAsia="en-GB"/>
-        </w:rPr>
-        <w:t xml:space="preserve">This will contain up to 16 bits (for a 64K x 16 </w:t>
-      </w:r>
-      <w:proofErr w:type="gramStart"/>
-      <w:r>
-        <w:rPr>
-          <w:lang w:eastAsia="en-GB"/>
-        </w:rPr>
-        <w:t>bit</w:t>
-      </w:r>
-      <w:proofErr w:type="gramEnd"/>
-      <w:r>
-        <w:rPr>
-          <w:lang w:eastAsia="en-GB"/>
-        </w:rPr>
-        <w:t xml:space="preserve"> RAM). If the size is &lt; 64K </w:t>
-      </w:r>
-      <w:proofErr w:type="gramStart"/>
-      <w:r>
-        <w:rPr>
-          <w:lang w:eastAsia="en-GB"/>
-        </w:rPr>
-        <w:t>less</w:t>
-      </w:r>
-      <w:proofErr w:type="gramEnd"/>
-      <w:r>
-        <w:rPr>
-          <w:lang w:eastAsia="en-GB"/>
-        </w:rPr>
-        <w:t xml:space="preserve"> bits will be required on the address bus. &lt;</w:t>
-      </w:r>
-      <w:proofErr w:type="spellStart"/>
-      <w:proofErr w:type="gramStart"/>
-      <w:r>
-        <w:rPr>
-          <w:lang w:eastAsia="en-GB"/>
-        </w:rPr>
-        <w:t>tbd</w:t>
-      </w:r>
-      <w:proofErr w:type="spellEnd"/>
-      <w:proofErr w:type="gramEnd"/>
-      <w:r>
-        <w:rPr>
-          <w:lang w:eastAsia="en-GB"/>
-        </w:rPr>
-        <w:t xml:space="preserve"> Earth to decide RAM size, but this isn’t urgent or blocking any work ATM&gt;</w:t>
-      </w:r>
-    </w:p>
-    <w:p>
-      <w:pPr>
-        <w:rPr>
-          <w:lang w:eastAsia="en-GB"/>
-        </w:rPr>
-      </w:pPr>
-      <w:proofErr w:type="gramStart"/>
-      <w:r>
-        <w:rPr>
-          <w:lang w:eastAsia="en-GB"/>
-        </w:rPr>
-        <w:t>The IS will write the correct value to this bus before doing any data transfers to / from RAM.</w:t>
-      </w:r>
-      <w:proofErr w:type="gramEnd"/>
-    </w:p>
-    <w:p>
-      <w:pPr>
-        <w:rPr>
-          <w:rFonts w:asciiTheme="majorHAnsi" w:eastAsiaTheme="majorEastAsia" w:hAnsiTheme="majorHAnsi" w:cstheme="majorBidi"/>
-          <w:b/>
-          <w:bCs/>
-          <w:color w:val="4F81BD" w:themeColor="accent1"/>
-          <w:sz w:val="26"/>
-          <w:szCs w:val="26"/>
-          <w:lang w:eastAsia="en-GB"/>
-        </w:rPr>
-      </w:pPr>
-      <w:bookmarkStart w:id="44" w:name="_Ref232081305"/>
-      <w:r>
-        <w:rPr>
-          <w:lang w:eastAsia="en-GB"/>
-        </w:rPr>
-        <w:br w:type="page"/>
-      </w:r>
-    </w:p>
-    <w:p>
-      <w:pPr>
-        <w:pStyle w:val="Heading2"/>
-        <w:rPr>
-          <w:lang w:eastAsia="en-GB"/>
-        </w:rPr>
-      </w:pPr>
-      <w:bookmarkStart w:id="45" w:name="_Ref232851000"/>
-      <w:bookmarkStart w:id="46" w:name="_Toc233631554"/>
-      <w:r>
-        <w:rPr>
-          <w:lang w:eastAsia="en-GB"/>
-        </w:rPr>
-        <w:lastRenderedPageBreak/>
-        <w:t>ALU CTRL bus</w:t>
-      </w:r>
-      <w:bookmarkEnd w:id="44"/>
-      <w:bookmarkEnd w:id="45"/>
-      <w:bookmarkEnd w:id="46"/>
-    </w:p>
-    <w:p>
-      <w:pPr>
-        <w:rPr>
-          <w:lang w:eastAsia="en-GB"/>
-        </w:rPr>
-      </w:pPr>
-      <w:r>
-        <w:rPr>
-          <w:lang w:eastAsia="en-GB"/>
-        </w:rPr>
-        <w:t>The signals on this bus are:</w:t>
-      </w:r>
-    </w:p>
-    <w:p>
-      <w:pPr>
-        <w:pStyle w:val="ListParagraph"/>
-        <w:numPr>
-          <w:ilvl w:val="0"/>
-          <w:numId w:val="7"/>
-        </w:numPr>
-        <w:rPr>
-          <w:lang w:eastAsia="en-GB"/>
-        </w:rPr>
-      </w:pPr>
-      <w:r>
-        <w:rPr>
-          <w:lang w:eastAsia="en-GB"/>
-        </w:rPr>
-        <w:t xml:space="preserve">CLOCK (common defined in </w:t>
-      </w:r>
-      <w:r>
-        <w:rPr>
-          <w:lang w:eastAsia="en-GB"/>
-        </w:rPr>
-        <w:fldChar w:fldCharType="begin"/>
-      </w:r>
-      <w:r>
-        <w:rPr>
-          <w:lang w:eastAsia="en-GB"/>
-        </w:rPr>
-        <w:instrText xml:space="preserve"> REF _Ref232084668 \r \h </w:instrText>
-      </w:r>
-      <w:r>
-        <w:rPr>
-          <w:lang w:eastAsia="en-GB"/>
-        </w:rPr>
-      </w:r>
-      <w:r>
-        <w:rPr>
-          <w:lang w:eastAsia="en-GB"/>
-        </w:rPr>
-        <w:fldChar w:fldCharType="separate"/>
-      </w:r>
-      <w:r>
-        <w:rPr>
-          <w:lang w:eastAsia="en-GB"/>
-        </w:rPr>
-        <w:t>3.1</w:t>
-      </w:r>
-      <w:r>
-        <w:rPr>
-          <w:lang w:eastAsia="en-GB"/>
-        </w:rPr>
-        <w:fldChar w:fldCharType="end"/>
-      </w:r>
-      <w:r>
-        <w:rPr>
-          <w:lang w:eastAsia="en-GB"/>
-        </w:rPr>
-        <w:t>)</w:t>
-      </w:r>
-    </w:p>
-    <w:p>
-      <w:pPr>
-        <w:pStyle w:val="ListParagraph"/>
-        <w:numPr>
-          <w:ilvl w:val="0"/>
-          <w:numId w:val="7"/>
-        </w:numPr>
-        <w:rPr>
-          <w:lang w:eastAsia="en-GB"/>
-        </w:rPr>
-      </w:pPr>
-      <w:bookmarkStart w:id="47" w:name="ALU_MODE"/>
-      <w:r>
-        <w:rPr>
-          <w:lang w:eastAsia="en-GB"/>
-        </w:rPr>
-        <w:t>ALU_MODE</w:t>
-      </w:r>
-      <w:bookmarkEnd w:id="47"/>
-    </w:p>
-    <w:p>
-      <w:pPr>
-        <w:pStyle w:val="ListParagraph"/>
-        <w:numPr>
-          <w:ilvl w:val="1"/>
-          <w:numId w:val="7"/>
-        </w:numPr>
-        <w:rPr>
-          <w:lang w:eastAsia="en-GB"/>
-        </w:rPr>
-      </w:pPr>
-      <w:r>
-        <w:rPr>
-          <w:lang w:eastAsia="en-GB"/>
-        </w:rPr>
-        <w:t>Define</w:t>
-      </w:r>
-      <w:r>
-        <w:rPr>
-          <w:lang w:eastAsia="en-GB"/>
-        </w:rPr>
-        <w:t>s</w:t>
-      </w:r>
-      <w:r>
-        <w:rPr>
-          <w:lang w:eastAsia="en-GB"/>
-        </w:rPr>
-        <w:t xml:space="preserve"> what operation the ALU is going to perfo</w:t>
-      </w:r>
-      <w:r>
-        <w:rPr>
-          <w:lang w:eastAsia="en-GB"/>
-        </w:rPr>
-        <w:t>r</w:t>
-      </w:r>
-      <w:r>
-        <w:rPr>
-          <w:lang w:eastAsia="en-GB"/>
-        </w:rPr>
-        <w:t>m.</w:t>
-      </w:r>
-    </w:p>
-    <w:p>
-      <w:pPr>
-        <w:pStyle w:val="ListParagraph"/>
-        <w:numPr>
-          <w:ilvl w:val="1"/>
-          <w:numId w:val="7"/>
-        </w:numPr>
-        <w:rPr>
-          <w:lang w:eastAsia="en-GB"/>
-        </w:rPr>
-      </w:pPr>
-      <w:r>
-        <w:rPr>
-          <w:lang w:eastAsia="en-GB"/>
-        </w:rPr>
         <w:t xml:space="preserve">This is a 3 bit value as shown in </w:t>
       </w:r>
       <w:r>
@@ -8814,7 +8317,7 @@
         <w:keepNext/>
         <w:jc w:val="center"/>
       </w:pPr>
-      <w:bookmarkStart w:id="48" w:name="_Ref232689048"/>
+      <w:bookmarkStart w:id="49" w:name="_Ref232689048"/>
       <w:r>
         <w:t xml:space="preserve">Table </w:t>
       </w:r>
@@ -8826,7 +8329,7 @@
           <w:t>2</w:t>
         </w:r>
       </w:fldSimple>
-      <w:bookmarkEnd w:id="48"/>
+      <w:bookmarkEnd w:id="49"/>
       <w:r>
         <w:t>:   ALU_MODE bits and their meaning</w:t>
       </w:r>
@@ -10004,14 +9507,14 @@
           <w:lang w:eastAsia="en-GB"/>
         </w:rPr>
       </w:pPr>
-      <w:bookmarkStart w:id="49" w:name="SELECT_ALU_DESTA"/>
+      <w:bookmarkStart w:id="50" w:name="SELECT_ALU_DESTA"/>
       <w:r>
         <w:rPr>
           <w:lang w:eastAsia="en-GB"/>
         </w:rPr>
         <w:t>SELECT_ALU_DESTA</w:t>
       </w:r>
-      <w:bookmarkEnd w:id="49"/>
+      <w:bookmarkEnd w:id="50"/>
     </w:p>
     <w:p>
       <w:pPr>
@@ -10046,7 +9549,54 @@
         <w:rPr>
           <w:lang w:eastAsia="en-GB"/>
         </w:rPr>
-        <w:t>This doesn’t cause it to input from the data bus, it’s a precursor to reading from the data bus – see READ below.</w:t>
+        <w:t xml:space="preserve">See </w:t>
+      </w:r>
+      <w:r>
+        <w:rPr>
+          <w:lang w:eastAsia="en-GB"/>
+        </w:rPr>
+        <w:fldChar w:fldCharType="begin"/>
+      </w:r>
+      <w:r>
+        <w:rPr>
+          <w:lang w:eastAsia="en-GB"/>
+        </w:rPr>
+        <w:instrText xml:space="preserve"> REF _Ref232850548 \r \h </w:instrText>
+      </w:r>
+      <w:r>
+        <w:rPr>
+          <w:lang w:eastAsia="en-GB"/>
+        </w:rPr>
+      </w:r>
+      <w:r>
+        <w:rPr>
+          <w:lang w:eastAsia="en-GB"/>
+        </w:rPr>
+        <w:fldChar w:fldCharType="separate"/>
+      </w:r>
+      <w:r>
+        <w:rPr>
+          <w:lang w:eastAsia="en-GB"/>
+        </w:rPr>
+        <w:t>2.1.1</w:t>
+      </w:r>
+      <w:r>
+        <w:rPr>
+          <w:lang w:eastAsia="en-GB"/>
+        </w:rPr>
+        <w:fldChar w:fldCharType="end"/>
+      </w:r>
+      <w:r>
+        <w:rPr>
+          <w:lang w:eastAsia="en-GB"/>
+        </w:rPr>
+        <w:t xml:space="preserve"> for details of how to read from the data bus</w:t>
+      </w:r>
+      <w:r>
+        <w:rPr>
+          <w:lang w:eastAsia="en-GB"/>
+        </w:rPr>
+        <w:t>.</w:t>
       </w:r>
     </w:p>
     <w:p>
@@ -10060,14 +9610,14 @@
           <w:lang w:eastAsia="en-GB"/>
         </w:rPr>
       </w:pPr>
-      <w:bookmarkStart w:id="50" w:name="SELECT_ALU_DESTB"/>
+      <w:bookmarkStart w:id="51" w:name="SELECT_ALU_DESTB"/>
       <w:r>
         <w:rPr>
           <w:lang w:eastAsia="en-GB"/>
         </w:rPr>
         <w:t>SELECT_ALU_DESTB</w:t>
       </w:r>
-      <w:bookmarkEnd w:id="50"/>
+      <w:bookmarkEnd w:id="51"/>
     </w:p>
     <w:p>
       <w:pPr>
@@ -10102,7 +9652,54 @@
         <w:rPr>
           <w:lang w:eastAsia="en-GB"/>
         </w:rPr>
-        <w:t>This doesn’t cause it to input from the data bus, it’s a precursor to reading from the data bus – see READ below.</w:t>
+        <w:t xml:space="preserve">See </w:t>
+      </w:r>
+      <w:r>
+        <w:rPr>
+          <w:lang w:eastAsia="en-GB"/>
+        </w:rPr>
+        <w:fldChar w:fldCharType="begin"/>
+      </w:r>
+      <w:r>
+        <w:rPr>
+          <w:lang w:eastAsia="en-GB"/>
+        </w:rPr>
+        <w:instrText xml:space="preserve"> REF _Ref232850548 \r \h </w:instrText>
+      </w:r>
+      <w:r>
+        <w:rPr>
+          <w:lang w:eastAsia="en-GB"/>
+        </w:rPr>
+      </w:r>
+      <w:r>
+        <w:rPr>
+          <w:lang w:eastAsia="en-GB"/>
+        </w:rPr>
+        <w:fldChar w:fldCharType="separate"/>
+      </w:r>
+      <w:r>
+        <w:rPr>
+          <w:lang w:eastAsia="en-GB"/>
+        </w:rPr>
+        <w:t>2.1.1</w:t>
+      </w:r>
+      <w:r>
+        <w:rPr>
+          <w:lang w:eastAsia="en-GB"/>
+        </w:rPr>
+        <w:fldChar w:fldCharType="end"/>
+      </w:r>
+      <w:r>
+        <w:rPr>
+          <w:lang w:eastAsia="en-GB"/>
+        </w:rPr>
+        <w:t xml:space="preserve"> for details of how to read from the data bus</w:t>
+      </w:r>
+      <w:r>
+        <w:rPr>
+          <w:lang w:eastAsia="en-GB"/>
+        </w:rPr>
+        <w:t>.</w:t>
       </w:r>
       <w:r>
         <w:rPr>
@@ -10122,73 +9719,14 @@
           <w:lang w:eastAsia="en-GB"/>
         </w:rPr>
       </w:pPr>
-      <w:r>
-        <w:rPr>
-          <w:lang w:eastAsia="en-GB"/>
-        </w:rPr>
-        <w:t xml:space="preserve">READ (common defined in </w:t>
-      </w:r>
-      <w:r>
-        <w:rPr>
-          <w:lang w:eastAsia="en-GB"/>
-        </w:rPr>
-        <w:fldChar w:fldCharType="begin"/>
-      </w:r>
-      <w:r>
-        <w:rPr>
-          <w:lang w:eastAsia="en-GB"/>
-        </w:rPr>
-        <w:instrText xml:space="preserve"> REF _Ref232084668 \r \h </w:instrText>
-      </w:r>
-      <w:r>
-        <w:rPr>
-          <w:lang w:eastAsia="en-GB"/>
-        </w:rPr>
-      </w:r>
-      <w:r>
-        <w:rPr>
-          <w:lang w:eastAsia="en-GB"/>
-        </w:rPr>
-        <w:fldChar w:fldCharType="separate"/>
-      </w:r>
-      <w:r>
-        <w:rPr>
-          <w:lang w:eastAsia="en-GB"/>
-        </w:rPr>
-        <w:t>3.1</w:t>
-      </w:r>
-      <w:r>
-        <w:rPr>
-          <w:lang w:eastAsia="en-GB"/>
-        </w:rPr>
-        <w:fldChar w:fldCharType="end"/>
-      </w:r>
-      <w:r>
-        <w:rPr>
-          <w:lang w:eastAsia="en-GB"/>
-        </w:rPr>
-        <w:t>)</w:t>
-      </w:r>
-    </w:p>
-    <w:p>
-      <w:pPr>
-        <w:pStyle w:val="ListParagraph"/>
-        <w:numPr>
-          <w:ilvl w:val="0"/>
-          <w:numId w:val="7"/>
-        </w:numPr>
-        <w:rPr>
-          <w:lang w:eastAsia="en-GB"/>
-        </w:rPr>
-      </w:pPr>
-      <w:bookmarkStart w:id="51" w:name="SELECT_ALUO_SRC"/>
+      <w:bookmarkStart w:id="52" w:name="SELECT_ALUO_SRC"/>
       <w:r>
         <w:rPr>
           <w:lang w:eastAsia="en-GB"/>
         </w:rPr>
         <w:t>SELECT_ALUO_SRC</w:t>
       </w:r>
-      <w:bookmarkEnd w:id="51"/>
+      <w:bookmarkEnd w:id="52"/>
     </w:p>
     <w:p>
       <w:pPr>
@@ -10241,25 +9779,7 @@
         <w:rPr>
           <w:lang w:eastAsia="en-GB"/>
         </w:rPr>
-        <w:t>This doesn’t cause it to output on the data bus, it’s a precursor to writing on the data bus – see WRITE below</w:t>
-      </w:r>
-    </w:p>
-    <w:p>
-      <w:pPr>
-        <w:pStyle w:val="ListParagraph"/>
-        <w:numPr>
-          <w:ilvl w:val="0"/>
-          <w:numId w:val="7"/>
-        </w:numPr>
-        <w:rPr>
-          <w:lang w:eastAsia="en-GB"/>
-        </w:rPr>
-      </w:pPr>
-      <w:r>
-        <w:rPr>
-          <w:lang w:eastAsia="en-GB"/>
-        </w:rPr>
-        <w:t xml:space="preserve">WRITE (common defined in </w:t>
+        <w:t xml:space="preserve">See </w:t>
       </w:r>
       <w:r>
         <w:rPr>
@@ -10271,7 +9791,7 @@
         <w:rPr>
           <w:lang w:eastAsia="en-GB"/>
         </w:rPr>
-        <w:instrText xml:space="preserve"> REF _Ref232084946 \r \h </w:instrText>
+        <w:instrText xml:space="preserve"> REF _Ref233721322 \r \h </w:instrText>
       </w:r>
       <w:r>
         <w:rPr>
@@ -10288,7 +9808,7 @@
         <w:rPr>
           <w:lang w:eastAsia="en-GB"/>
         </w:rPr>
-        <w:t>3.1</w:t>
+        <w:t>2.1.2</w:t>
       </w:r>
       <w:r>
         <w:rPr>
@@ -10300,7 +9820,7 @@
         <w:rPr>
           <w:lang w:eastAsia="en-GB"/>
         </w:rPr>
-        <w:t>)</w:t>
+        <w:t xml:space="preserve"> for details of how to write to the data bus</w:t>
       </w:r>
     </w:p>
     <w:p>
@@ -10315,7 +9835,9 @@
           <w:lang w:eastAsia="en-GB"/>
         </w:rPr>
       </w:pPr>
-      <w:bookmarkStart w:id="52" w:name="_Ref232081310"/>
+      <w:bookmarkStart w:id="53" w:name="CurrentEditPos"/>
+      <w:bookmarkStart w:id="54" w:name="_Ref232081310"/>
+      <w:bookmarkEnd w:id="53"/>
       <w:r>
         <w:rPr>
           <w:lang w:eastAsia="en-GB"/>
@@ -10330,8 +9852,8 @@
           <w:lang w:eastAsia="en-GB"/>
         </w:rPr>
       </w:pPr>
-      <w:bookmarkStart w:id="53" w:name="_Ref232090831"/>
-      <w:bookmarkStart w:id="54" w:name="_Toc233631555"/>
+      <w:bookmarkStart w:id="55" w:name="_Ref232090831"/>
+      <w:bookmarkStart w:id="56" w:name="_Toc233722277"/>
       <w:r>
         <w:rPr>
           <w:lang w:eastAsia="en-GB"/>
@@ -10339,9 +9861,9 @@
         <w:lastRenderedPageBreak/>
         <w:t>FLAGS bus</w:t>
       </w:r>
-      <w:bookmarkEnd w:id="52"/>
-      <w:bookmarkEnd w:id="53"/>
       <w:bookmarkEnd w:id="54"/>
+      <w:bookmarkEnd w:id="55"/>
+      <w:bookmarkEnd w:id="56"/>
     </w:p>
     <w:p>
       <w:pPr>
@@ -10689,7 +10211,7 @@
           <w:lang w:eastAsia="en-GB"/>
         </w:rPr>
       </w:pPr>
-      <w:bookmarkStart w:id="55" w:name="_Toc233631556"/>
+      <w:bookmarkStart w:id="57" w:name="_Toc233722278"/>
       <w:r>
         <w:rPr>
           <w:lang w:eastAsia="en-GB"/>
@@ -10725,7 +10247,7 @@
         </w:rPr>
         <w:t>ALU_MODE</w:t>
       </w:r>
-      <w:bookmarkEnd w:id="55"/>
+      <w:bookmarkEnd w:id="57"/>
       <w:r>
         <w:rPr>
           <w:lang w:eastAsia="en-GB"/>
@@ -10860,7 +10382,7 @@
           <w:lang w:eastAsia="en-GB"/>
         </w:rPr>
       </w:pPr>
-      <w:bookmarkStart w:id="56" w:name="_Toc233631557"/>
+      <w:bookmarkStart w:id="58" w:name="_Toc233722279"/>
       <w:r>
         <w:rPr>
           <w:lang w:eastAsia="en-GB"/>
@@ -10896,7 +10418,7 @@
         </w:rPr>
         <w:t>ALU_MODE</w:t>
       </w:r>
-      <w:bookmarkEnd w:id="56"/>
+      <w:bookmarkEnd w:id="58"/>
       <w:r>
         <w:rPr>
           <w:lang w:eastAsia="en-GB"/>
@@ -11051,7 +10573,7 @@
         <w:keepNext/>
         <w:jc w:val="center"/>
       </w:pPr>
-      <w:bookmarkStart w:id="57" w:name="_Ref232694733"/>
+      <w:bookmarkStart w:id="59" w:name="_Ref232694733"/>
       <w:r>
         <w:t xml:space="preserve">Table </w:t>
       </w:r>
@@ -11063,7 +10585,7 @@
           <w:t>3</w:t>
         </w:r>
       </w:fldSimple>
-      <w:bookmarkEnd w:id="57"/>
+      <w:bookmarkEnd w:id="59"/>
       <w:r>
         <w:t xml:space="preserve">:   Rules for FLAG_V and FLAG_C </w:t>
       </w:r>
@@ -11999,7 +11521,7 @@
           <w:lang w:eastAsia="en-GB"/>
         </w:rPr>
       </w:pPr>
-      <w:bookmarkStart w:id="58" w:name="_Ref232694870"/>
+      <w:bookmarkStart w:id="60" w:name="_Ref232694870"/>
       <w:r>
         <w:rPr>
           <w:lang w:eastAsia="en-GB"/>
@@ -12047,7 +11569,7 @@
         </w:rPr>
         <w:t xml:space="preserve"> = ADD</w:t>
       </w:r>
-      <w:bookmarkEnd w:id="58"/>
+      <w:bookmarkEnd w:id="60"/>
     </w:p>
     <w:p>
       <w:pPr>
@@ -12095,7 +11617,7 @@
           <w:lang w:eastAsia="en-GB"/>
         </w:rPr>
       </w:pPr>
-      <w:bookmarkStart w:id="59" w:name="_Ref232694986"/>
+      <w:bookmarkStart w:id="61" w:name="_Ref232694986"/>
       <w:r>
         <w:rPr>
           <w:lang w:eastAsia="en-GB"/>
@@ -12143,7 +11665,7 @@
         </w:rPr>
         <w:t xml:space="preserve"> = ADD</w:t>
       </w:r>
-      <w:bookmarkEnd w:id="59"/>
+      <w:bookmarkEnd w:id="61"/>
     </w:p>
     <w:p>
       <w:pPr>
@@ -12185,7 +11707,7 @@
           <w:lang w:eastAsia="en-GB"/>
         </w:rPr>
       </w:pPr>
-      <w:bookmarkStart w:id="60" w:name="_Ref232695562"/>
+      <w:bookmarkStart w:id="62" w:name="_Ref232695562"/>
       <w:r>
         <w:rPr>
           <w:lang w:eastAsia="en-GB"/>
@@ -12233,7 +11755,7 @@
         </w:rPr>
         <w:t xml:space="preserve"> = SUB</w:t>
       </w:r>
-      <w:bookmarkEnd w:id="60"/>
+      <w:bookmarkEnd w:id="62"/>
     </w:p>
     <w:p>
       <w:pPr>
@@ -12275,7 +11797,7 @@
           <w:lang w:eastAsia="en-GB"/>
         </w:rPr>
       </w:pPr>
-      <w:bookmarkStart w:id="61" w:name="_Ref232695568"/>
+      <w:bookmarkStart w:id="63" w:name="_Ref232695568"/>
       <w:r>
         <w:rPr>
           <w:lang w:eastAsia="en-GB"/>
@@ -12323,7 +11845,7 @@
         </w:rPr>
         <w:t xml:space="preserve"> = SUB</w:t>
       </w:r>
-      <w:bookmarkEnd w:id="61"/>
+      <w:bookmarkEnd w:id="63"/>
     </w:p>
     <w:p>
       <w:pPr>
@@ -12391,7 +11913,7 @@
           <w:lang w:eastAsia="en-GB"/>
         </w:rPr>
       </w:pPr>
-      <w:bookmarkStart w:id="62" w:name="_Toc233631558"/>
+      <w:bookmarkStart w:id="64" w:name="_Toc233722280"/>
       <w:r>
         <w:rPr>
           <w:lang w:eastAsia="en-GB"/>
@@ -12399,10 +11921,10 @@
         <w:lastRenderedPageBreak/>
         <w:t>References</w:t>
       </w:r>
-      <w:bookmarkEnd w:id="19"/>
-      <w:bookmarkEnd w:id="62"/>
-    </w:p>
-    <w:bookmarkStart w:id="63" w:name="AVR_Instruction_Doc"/>
+      <w:bookmarkEnd w:id="23"/>
+      <w:bookmarkEnd w:id="64"/>
+    </w:p>
+    <w:bookmarkStart w:id="65" w:name="AVR_Instruction_Doc"/>
     <w:p>
       <w:pPr>
         <w:pStyle w:val="ListParagraph"/>
@@ -12444,7 +11966,7 @@
         </w:rPr>
         <w:t>AVR Instruction Set Manual</w:t>
       </w:r>
-      <w:bookmarkEnd w:id="63"/>
+      <w:bookmarkEnd w:id="65"/>
       <w:r>
         <w:rPr>
           <w:lang w:eastAsia="en-GB"/>
@@ -12569,7 +12091,7 @@
               <w:b/>
               <w:noProof/>
             </w:rPr>
-            <w:t>2</w:t>
+            <w:t>8</w:t>
           </w:r>
         </w:fldSimple>
       </w:p>
@@ -17062,7 +16584,7 @@
 </file>
 
 <file path=customXml/itemProps2.xml><?xml version="1.0" encoding="utf-8"?>
-<ds:datastoreItem xmlns:ds="http://schemas.openxmlformats.org/officeDocument/2006/customXml" ds:itemID="{D5A66D07-EDB6-4B3E-85E8-55CA5654802A}">
+<ds:datastoreItem xmlns:ds="http://schemas.openxmlformats.org/officeDocument/2006/customXml" ds:itemID="{6EE60FA8-F6FA-4FE3-A471-DF351C45A0BF}">
   <ds:schemaRefs>
     <ds:schemaRef ds:uri="http://schemas.openxmlformats.org/officeDocument/2006/bibliography"/>
   </ds:schemaRefs>

</xml_diff>